<commit_message>
Update docs: changed option
</commit_message>
<xml_diff>
--- a/docs/ТПО ЛР №2 Силинцев ВВ.docx
+++ b/docs/ТПО ЛР №2 Силинцев ВВ.docx
@@ -16,7 +16,7 @@
         <mc:AlternateContent>
           <mc:Choice Requires="wps">
             <w:drawing>
-              <wp:anchor behindDoc="0" distT="0" distB="0" distL="0" distR="0" simplePos="0" locked="0" layoutInCell="1" allowOverlap="1" relativeHeight="2">
+              <wp:anchor distT="0" distB="0" distL="0" distR="0" simplePos="0" relativeHeight="2" behindDoc="0" locked="0" layoutInCell="1" allowOverlap="1">
                 <wp:simplePos x="0" y="0"/>
                 <wp:positionH relativeFrom="column">
                   <wp:posOffset>-213360</wp:posOffset>
@@ -81,7 +81,7 @@
           </mc:Choice>
           <mc:Fallback>
             <w:pict>
-              <v:rect id="shape_0" ID="user-content-стартовая-страница-должна-содержать-следующие-элементы" path="m0,0l-2147483645,0l-2147483645,-2147483646l0,-2147483646xe" stroked="f" o:allowincell="f" style="position:absolute;margin-left:-16.8pt;margin-top:0.05pt;width:16.75pt;height:16.75pt;mso-wrap-style:none;v-text-anchor:middle">
+              <v:rect id="shape_0" stroked="f" o:allowincell="f" style="position:absolute;margin-left:-16.8pt;margin-top:0.05pt;width:16.75pt;height:16.75pt;mso-wrap-style:none;v-text-anchor:middle">
                 <v:fill o:detectmouseclick="t" on="false"/>
                 <v:stroke color="#3465a4" joinstyle="round" endcap="flat"/>
                 <v:textbox>
@@ -111,7 +111,7 @@
         <mc:AlternateContent>
           <mc:Choice Requires="wps">
             <w:drawing>
-              <wp:anchor behindDoc="0" distT="0" distB="0" distL="0" distR="0" simplePos="0" locked="0" layoutInCell="1" allowOverlap="1" relativeHeight="4">
+              <wp:anchor distT="0" distB="0" distL="0" distR="0" simplePos="0" relativeHeight="4" behindDoc="0" locked="0" layoutInCell="1" allowOverlap="1">
                 <wp:simplePos x="0" y="0"/>
                 <wp:positionH relativeFrom="column">
                   <wp:posOffset>-213360</wp:posOffset>
@@ -176,7 +176,7 @@
           </mc:Choice>
           <mc:Fallback>
             <w:pict>
-              <v:rect id="shape_0" ID="user-content-основная-страница-приложения-должна-содержать-следующие-элементы" path="m0,0l-2147483645,0l-2147483645,-2147483646l0,-2147483646xe" stroked="f" o:allowincell="f" style="position:absolute;margin-left:-16.8pt;margin-top:0.05pt;width:16.75pt;height:16.75pt;mso-wrap-style:none;v-text-anchor:middle">
+              <v:rect id="shape_0" stroked="f" o:allowincell="f" style="position:absolute;margin-left:-16.8pt;margin-top:0.05pt;width:16.75pt;height:16.75pt;mso-wrap-style:none;v-text-anchor:middle">
                 <v:fill o:detectmouseclick="t" on="false"/>
                 <v:stroke color="#3465a4" joinstyle="round" endcap="flat"/>
                 <v:textbox>
@@ -206,7 +206,7 @@
         <mc:AlternateContent>
           <mc:Choice Requires="wps">
             <w:drawing>
-              <wp:anchor behindDoc="0" distT="0" distB="0" distL="0" distR="0" simplePos="0" locked="0" layoutInCell="1" allowOverlap="1" relativeHeight="6">
+              <wp:anchor distT="0" distB="0" distL="0" distR="0" simplePos="0" relativeHeight="6" behindDoc="0" locked="0" layoutInCell="1" allowOverlap="1">
                 <wp:simplePos x="0" y="0"/>
                 <wp:positionH relativeFrom="column">
                   <wp:posOffset>-213360</wp:posOffset>
@@ -271,7 +271,7 @@
           </mc:Choice>
           <mc:Fallback>
             <w:pict>
-              <v:rect id="shape_0" ID="user-content-дополнительные-требования-к-приложению" path="m0,0l-2147483645,0l-2147483645,-2147483646l0,-2147483646xe" stroked="f" o:allowincell="f" style="position:absolute;margin-left:-16.8pt;margin-top:0.05pt;width:16.75pt;height:16.75pt;mso-wrap-style:none;v-text-anchor:middle">
+              <v:rect id="shape_0" stroked="f" o:allowincell="f" style="position:absolute;margin-left:-16.8pt;margin-top:0.05pt;width:16.75pt;height:16.75pt;mso-wrap-style:none;v-text-anchor:middle">
                 <v:fill o:detectmouseclick="t" on="false"/>
                 <v:stroke color="#3465a4" joinstyle="round" endcap="flat"/>
                 <v:textbox>
@@ -448,7 +448,7 @@
           <w:sz w:val="28"/>
           <w:szCs w:val="28"/>
         </w:rPr>
-        <w:t>Вариант №</w:t>
+        <w:t>Вариант №4546734</w:t>
       </w:r>
     </w:p>
     <w:p>
@@ -665,14 +665,34 @@
             </w:tabs>
             <w:rPr/>
           </w:pPr>
-          <w:hyperlink w:anchor="__RefHeading___Toc524_1614521587" w:tooltip="Выводы">
+          <w:hyperlink w:anchor="__RefHeading___Toc524_1614521587" w:tooltip="UML-диаграмма">
+            <w:r>
+              <w:rPr>
+                <w:rStyle w:val="Style11"/>
+              </w:rPr>
+              <w:t>UML-диаграмма</w:t>
+              <w:tab/>
+              <w:t>7</w:t>
+            </w:r>
+          </w:hyperlink>
+        </w:p>
+        <w:p>
+          <w:pPr>
+            <w:pStyle w:val="TOC1"/>
+            <w:tabs>
+              <w:tab w:val="clear" w:pos="708"/>
+              <w:tab w:val="right" w:pos="9354" w:leader="dot"/>
+            </w:tabs>
+            <w:rPr/>
+          </w:pPr>
+          <w:hyperlink w:anchor="__RefHeading___Toc524_1614521587_%25D0%2" w:tooltip="Выводы">
             <w:r>
               <w:rPr>
                 <w:rStyle w:val="Style11"/>
               </w:rPr>
               <w:t>Выводы</w:t>
               <w:tab/>
-              <w:t>7</w:t>
+              <w:t>8</w:t>
             </w:r>
           </w:hyperlink>
           <w:r>
@@ -746,30 +766,7 @@
       </w:pPr>
       <w:r>
         <w:rPr/>
-      </w:r>
-      <m:oMath xmlns:m="http://schemas.openxmlformats.org/officeDocument/2006/math">
-        <m:r>
-          <w:rPr>
-            <w:rFonts w:ascii="Cambria Math" w:hAnsi="Cambria Math"/>
-          </w:rPr>
-          <m:t xml:space="preserve">x</m:t>
-        </m:r>
-        <m:r>
-          <w:rPr>
-            <w:rFonts w:ascii="Cambria Math" w:hAnsi="Cambria Math"/>
-          </w:rPr>
-          <m:t xml:space="preserve">≤</m:t>
-        </m:r>
-        <m:r>
-          <w:rPr>
-            <w:rFonts w:ascii="Cambria Math" w:hAnsi="Cambria Math"/>
-          </w:rPr>
-          <m:t xml:space="preserve">0</m:t>
-        </m:r>
-      </m:oMath>
-      <w:r>
-        <w:rPr/>
-        <w:t>:</w:t>
+        <w:t>x &lt;= 0 : ((((((((((((cot(x) ^ 2) - sin(x)) + (csc(x) ^ 3)) / (tan(x) - cot(x))) * csc(x)) + cot(x)) / (sec(x) ^ 3)) + (csc(x) / (sec(x) / (sin(x) / tan(x))))) / sec(x)) * (((cot(x) * tan(x)) + (tan(x) + cos(x))) + ((((sin(x) * sin(x)) + cos(x)) / (tan(x) / tan(x))) * (csc(x) ^ 2)))) - sec(x)) * ((tan(x) + (((cot(x) + (sec(x) + cot(x))) / (cot(x) ^ 3)) / (cos(x) * sin(x)))) - sec(x)))</w:t>
       </w:r>
     </w:p>
     <w:p>
@@ -782,30 +779,7 @@
       </w:pPr>
       <w:r>
         <w:rPr/>
-      </w:r>
-      <m:oMath xmlns:m="http://schemas.openxmlformats.org/officeDocument/2006/math">
-        <m:r>
-          <w:rPr>
-            <w:rFonts w:ascii="Cambria Math" w:hAnsi="Cambria Math"/>
-          </w:rPr>
-          <m:t xml:space="preserve">x</m:t>
-        </m:r>
-        <m:r>
-          <w:rPr>
-            <w:rFonts w:ascii="Cambria Math" w:hAnsi="Cambria Math"/>
-          </w:rPr>
-          <m:t xml:space="preserve">&gt;</m:t>
-        </m:r>
-        <m:r>
-          <w:rPr>
-            <w:rFonts w:ascii="Cambria Math" w:hAnsi="Cambria Math"/>
-          </w:rPr>
-          <m:t xml:space="preserve">0</m:t>
-        </m:r>
-      </m:oMath>
-      <w:r>
-        <w:rPr/>
-        <w:t>:</w:t>
+        <w:t>x &gt; 0 : (((((log_10(x) - log_3(x)) ^ 2) ^ 3) * log_10(x)) + (((log_3(x) + (ln(x) ^ 3)) / (log_10(x) ^ 3)) * log_3(x)))</w:t>
       </w:r>
     </w:p>
     <w:p>
@@ -856,7 +830,7 @@
       </w:pPr>
       <w:r>
         <w:drawing>
-          <wp:anchor behindDoc="0" distT="0" distB="0" distL="0" distR="0" simplePos="0" locked="0" layoutInCell="0" allowOverlap="1" relativeHeight="10">
+          <wp:anchor distT="0" distB="0" distL="0" distR="0" simplePos="0" relativeHeight="8" behindDoc="0" locked="0" layoutInCell="0" allowOverlap="1">
             <wp:simplePos x="0" y="0"/>
             <wp:positionH relativeFrom="column">
               <wp:align>center</wp:align>
@@ -1166,14 +1140,7 @@
             <w:rStyle w:val="Hyperlink"/>
             <w:lang w:val="ru-RU"/>
           </w:rPr>
-          <w:t>https://github.com/vvlaads/Software-Testing-</w:t>
-        </w:r>
-        <w:r>
-          <w:rPr>
-            <w:rStyle w:val="Hyperlink"/>
-            <w:lang w:val="ru-RU"/>
-          </w:rPr>
-          <w:t>2</w:t>
+          <w:t>https://github.com/vvlaads/Software-Testing-2</w:t>
         </w:r>
       </w:hyperlink>
       <w:r>
@@ -1193,11 +1160,10 @@
         <w:ind w:left="709"/>
         <w:jc w:val="center"/>
         <w:rPr>
-          <w:rFonts w:ascii="Times New Roman" w:hAnsi="Times New Roman"/>
+          <w:lang w:val="en-US"/>
         </w:rPr>
       </w:pPr>
       <w:bookmarkStart w:id="2" w:name="__RefHeading___Toc524_1614521587"/>
-      <w:bookmarkStart w:id="3" w:name="_Toc146616696"/>
       <w:bookmarkEnd w:id="2"/>
       <w:r>
         <w:rPr>
@@ -1205,18 +1171,19 @@
           <w:b/>
           <w:bCs/>
           <w:color w:val="auto"/>
-        </w:rPr>
-        <w:t>В</w:t>
-      </w:r>
-      <w:bookmarkEnd w:id="3"/>
+          <w:lang w:val="en-US"/>
+        </w:rPr>
+        <w:t>UML-</w:t>
+      </w:r>
       <w:r>
         <w:rPr>
           <w:rFonts w:eastAsia="Times New Roman" w:cs="Times New Roman"/>
           <w:b/>
           <w:bCs/>
           <w:color w:val="auto"/>
-        </w:rPr>
-        <w:t>ыводы</w:t>
+          <w:lang w:val="ru-RU"/>
+        </w:rPr>
+        <w:t>диаграмма</w:t>
       </w:r>
     </w:p>
     <w:p>
@@ -1237,6 +1204,58 @@
           <w:szCs w:val="28"/>
           <w:lang w:val="ru-RU"/>
         </w:rPr>
+        <w:t>В ходе работы.</w:t>
+      </w:r>
+      <w:r>
+        <w:br w:type="page"/>
+      </w:r>
+    </w:p>
+    <w:p>
+      <w:pPr>
+        <w:pStyle w:val="Heading1"/>
+        <w:spacing w:lineRule="auto" w:line="360" w:before="0" w:after="0"/>
+        <w:ind w:left="709"/>
+        <w:jc w:val="center"/>
+        <w:rPr>
+          <w:rFonts w:ascii="Times New Roman" w:hAnsi="Times New Roman"/>
+        </w:rPr>
+      </w:pPr>
+      <w:bookmarkStart w:id="3" w:name="__RefHeading___Toc524_1614521587_Копия_1"/>
+      <w:bookmarkStart w:id="4" w:name="_Toc146616696_Копия_1"/>
+      <w:bookmarkEnd w:id="3"/>
+      <w:r>
+        <w:rPr>
+          <w:rFonts w:eastAsia="Times New Roman" w:cs="Times New Roman"/>
+          <w:b/>
+          <w:bCs/>
+          <w:color w:val="auto"/>
+        </w:rPr>
+        <w:t>В</w:t>
+      </w:r>
+      <w:bookmarkEnd w:id="4"/>
+      <w:r>
+        <w:rPr>
+          <w:rFonts w:eastAsia="Times New Roman" w:cs="Times New Roman"/>
+          <w:b/>
+          <w:bCs/>
+          <w:color w:val="auto"/>
+        </w:rPr>
+        <w:t>ыводы</w:t>
+      </w:r>
+    </w:p>
+    <w:p>
+      <w:pPr>
+        <w:pStyle w:val="Normal"/>
+        <w:bidi w:val="0"/>
+        <w:spacing w:lineRule="auto" w:line="360" w:beforeAutospacing="0" w:before="0" w:afterAutospacing="0" w:after="160"/>
+        <w:ind w:firstLine="709" w:left="0" w:right="0"/>
+        <w:jc w:val="both"/>
+        <w:rPr>
+          <w:rFonts w:ascii="Times New Roman" w:hAnsi="Times New Roman"/>
+        </w:rPr>
+      </w:pPr>
+      <w:r>
+        <w:rPr/>
         <w:t>В ходе работы.</w:t>
       </w:r>
     </w:p>
@@ -1340,7 +1359,7 @@
           </w:r>
           <w:r>
             <w:rPr/>
-            <w:t>3</w:t>
+            <w:t>8</w:t>
           </w:r>
           <w:r>
             <w:rPr/>
@@ -1828,172 +1847,163 @@
         <w:ind w:left="720" w:hanging="360"/>
       </w:pPr>
       <w:rPr>
-        <w:vertAlign w:val="baseline"/>
+        <w:rFonts w:ascii="Times New Roman" w:hAnsi="Times New Roman"/>
         <w:position w:val="0"/>
         <w:sz w:val="28"/>
+        <w:szCs w:val="28"/>
+        <w:vertAlign w:val="baseline"/>
+      </w:rPr>
+    </w:lvl>
+    <w:lvl w:ilvl="1">
+      <w:start w:val="1"/>
+      <w:numFmt w:val="decimal"/>
+      <w:lvlText w:val="%2."/>
+      <w:lvlJc w:val="left"/>
+      <w:pPr>
+        <w:tabs>
+          <w:tab w:val="num" w:pos="1080"/>
+        </w:tabs>
+        <w:ind w:left="1080" w:hanging="360"/>
+      </w:pPr>
+      <w:rPr>
+        <w:rFonts w:ascii="Times New Roman" w:hAnsi="Times New Roman"/>
+        <w:position w:val="0"/>
         <w:sz w:val="28"/>
         <w:szCs w:val="28"/>
+        <w:vertAlign w:val="baseline"/>
+      </w:rPr>
+    </w:lvl>
+    <w:lvl w:ilvl="2">
+      <w:start w:val="1"/>
+      <w:numFmt w:val="decimal"/>
+      <w:lvlText w:val="%3."/>
+      <w:lvlJc w:val="left"/>
+      <w:pPr>
+        <w:tabs>
+          <w:tab w:val="num" w:pos="1440"/>
+        </w:tabs>
+        <w:ind w:left="1440" w:hanging="360"/>
+      </w:pPr>
+      <w:rPr>
         <w:rFonts w:ascii="Times New Roman" w:hAnsi="Times New Roman"/>
-      </w:rPr>
-    </w:lvl>
-    <w:lvl w:ilvl="1">
-      <w:start w:val="1"/>
-      <w:numFmt w:val="decimal"/>
-      <w:lvlText w:val="%2."/>
-      <w:lvlJc w:val="left"/>
-      <w:pPr>
-        <w:tabs>
-          <w:tab w:val="num" w:pos="1080"/>
-        </w:tabs>
-        <w:ind w:left="1080" w:hanging="360"/>
-      </w:pPr>
-      <w:rPr>
-        <w:vertAlign w:val="baseline"/>
         <w:position w:val="0"/>
         <w:sz w:val="28"/>
+        <w:szCs w:val="28"/>
+        <w:vertAlign w:val="baseline"/>
+      </w:rPr>
+    </w:lvl>
+    <w:lvl w:ilvl="3">
+      <w:start w:val="1"/>
+      <w:numFmt w:val="decimal"/>
+      <w:lvlText w:val="%4."/>
+      <w:lvlJc w:val="left"/>
+      <w:pPr>
+        <w:tabs>
+          <w:tab w:val="num" w:pos="1800"/>
+        </w:tabs>
+        <w:ind w:left="1800" w:hanging="360"/>
+      </w:pPr>
+      <w:rPr>
+        <w:rFonts w:ascii="Times New Roman" w:hAnsi="Times New Roman"/>
+        <w:position w:val="0"/>
         <w:sz w:val="28"/>
         <w:szCs w:val="28"/>
+        <w:vertAlign w:val="baseline"/>
+      </w:rPr>
+    </w:lvl>
+    <w:lvl w:ilvl="4">
+      <w:start w:val="1"/>
+      <w:numFmt w:val="decimal"/>
+      <w:lvlText w:val="%5."/>
+      <w:lvlJc w:val="left"/>
+      <w:pPr>
+        <w:tabs>
+          <w:tab w:val="num" w:pos="2160"/>
+        </w:tabs>
+        <w:ind w:left="2160" w:hanging="360"/>
+      </w:pPr>
+      <w:rPr>
         <w:rFonts w:ascii="Times New Roman" w:hAnsi="Times New Roman"/>
-      </w:rPr>
-    </w:lvl>
-    <w:lvl w:ilvl="2">
-      <w:start w:val="1"/>
-      <w:numFmt w:val="decimal"/>
-      <w:lvlText w:val="%3."/>
-      <w:lvlJc w:val="left"/>
-      <w:pPr>
-        <w:tabs>
-          <w:tab w:val="num" w:pos="1440"/>
-        </w:tabs>
-        <w:ind w:left="1440" w:hanging="360"/>
-      </w:pPr>
-      <w:rPr>
-        <w:vertAlign w:val="baseline"/>
         <w:position w:val="0"/>
         <w:sz w:val="28"/>
+        <w:szCs w:val="28"/>
+        <w:vertAlign w:val="baseline"/>
+      </w:rPr>
+    </w:lvl>
+    <w:lvl w:ilvl="5">
+      <w:start w:val="1"/>
+      <w:numFmt w:val="decimal"/>
+      <w:lvlText w:val="%6."/>
+      <w:lvlJc w:val="left"/>
+      <w:pPr>
+        <w:tabs>
+          <w:tab w:val="num" w:pos="2520"/>
+        </w:tabs>
+        <w:ind w:left="2520" w:hanging="360"/>
+      </w:pPr>
+      <w:rPr>
+        <w:rFonts w:ascii="Times New Roman" w:hAnsi="Times New Roman"/>
+        <w:position w:val="0"/>
         <w:sz w:val="28"/>
         <w:szCs w:val="28"/>
+        <w:vertAlign w:val="baseline"/>
+      </w:rPr>
+    </w:lvl>
+    <w:lvl w:ilvl="6">
+      <w:start w:val="1"/>
+      <w:numFmt w:val="decimal"/>
+      <w:lvlText w:val="%7."/>
+      <w:lvlJc w:val="left"/>
+      <w:pPr>
+        <w:tabs>
+          <w:tab w:val="num" w:pos="2880"/>
+        </w:tabs>
+        <w:ind w:left="2880" w:hanging="360"/>
+      </w:pPr>
+      <w:rPr>
         <w:rFonts w:ascii="Times New Roman" w:hAnsi="Times New Roman"/>
-      </w:rPr>
-    </w:lvl>
-    <w:lvl w:ilvl="3">
-      <w:start w:val="1"/>
-      <w:numFmt w:val="decimal"/>
-      <w:lvlText w:val="%4."/>
-      <w:lvlJc w:val="left"/>
-      <w:pPr>
-        <w:tabs>
-          <w:tab w:val="num" w:pos="1800"/>
-        </w:tabs>
-        <w:ind w:left="1800" w:hanging="360"/>
-      </w:pPr>
-      <w:rPr>
-        <w:vertAlign w:val="baseline"/>
         <w:position w:val="0"/>
         <w:sz w:val="28"/>
+        <w:szCs w:val="28"/>
+        <w:vertAlign w:val="baseline"/>
+      </w:rPr>
+    </w:lvl>
+    <w:lvl w:ilvl="7">
+      <w:start w:val="1"/>
+      <w:numFmt w:val="decimal"/>
+      <w:lvlText w:val="%8."/>
+      <w:lvlJc w:val="left"/>
+      <w:pPr>
+        <w:tabs>
+          <w:tab w:val="num" w:pos="3240"/>
+        </w:tabs>
+        <w:ind w:left="3240" w:hanging="360"/>
+      </w:pPr>
+      <w:rPr>
+        <w:rFonts w:ascii="Times New Roman" w:hAnsi="Times New Roman"/>
+        <w:position w:val="0"/>
         <w:sz w:val="28"/>
         <w:szCs w:val="28"/>
+        <w:vertAlign w:val="baseline"/>
+      </w:rPr>
+    </w:lvl>
+    <w:lvl w:ilvl="8">
+      <w:start w:val="1"/>
+      <w:numFmt w:val="decimal"/>
+      <w:lvlText w:val="%9."/>
+      <w:lvlJc w:val="left"/>
+      <w:pPr>
+        <w:tabs>
+          <w:tab w:val="num" w:pos="3600"/>
+        </w:tabs>
+        <w:ind w:left="3600" w:hanging="360"/>
+      </w:pPr>
+      <w:rPr>
         <w:rFonts w:ascii="Times New Roman" w:hAnsi="Times New Roman"/>
-      </w:rPr>
-    </w:lvl>
-    <w:lvl w:ilvl="4">
-      <w:start w:val="1"/>
-      <w:numFmt w:val="decimal"/>
-      <w:lvlText w:val="%5."/>
-      <w:lvlJc w:val="left"/>
-      <w:pPr>
-        <w:tabs>
-          <w:tab w:val="num" w:pos="2160"/>
-        </w:tabs>
-        <w:ind w:left="2160" w:hanging="360"/>
-      </w:pPr>
-      <w:rPr>
-        <w:vertAlign w:val="baseline"/>
         <w:position w:val="0"/>
         <w:sz w:val="28"/>
-        <w:sz w:val="28"/>
         <w:szCs w:val="28"/>
-        <w:rFonts w:ascii="Times New Roman" w:hAnsi="Times New Roman"/>
-      </w:rPr>
-    </w:lvl>
-    <w:lvl w:ilvl="5">
-      <w:start w:val="1"/>
-      <w:numFmt w:val="decimal"/>
-      <w:lvlText w:val="%6."/>
-      <w:lvlJc w:val="left"/>
-      <w:pPr>
-        <w:tabs>
-          <w:tab w:val="num" w:pos="2520"/>
-        </w:tabs>
-        <w:ind w:left="2520" w:hanging="360"/>
-      </w:pPr>
-      <w:rPr>
         <w:vertAlign w:val="baseline"/>
-        <w:position w:val="0"/>
-        <w:sz w:val="28"/>
-        <w:sz w:val="28"/>
-        <w:szCs w:val="28"/>
-        <w:rFonts w:ascii="Times New Roman" w:hAnsi="Times New Roman"/>
-      </w:rPr>
-    </w:lvl>
-    <w:lvl w:ilvl="6">
-      <w:start w:val="1"/>
-      <w:numFmt w:val="decimal"/>
-      <w:lvlText w:val="%7."/>
-      <w:lvlJc w:val="left"/>
-      <w:pPr>
-        <w:tabs>
-          <w:tab w:val="num" w:pos="2880"/>
-        </w:tabs>
-        <w:ind w:left="2880" w:hanging="360"/>
-      </w:pPr>
-      <w:rPr>
-        <w:vertAlign w:val="baseline"/>
-        <w:position w:val="0"/>
-        <w:sz w:val="28"/>
-        <w:sz w:val="28"/>
-        <w:szCs w:val="28"/>
-        <w:rFonts w:ascii="Times New Roman" w:hAnsi="Times New Roman"/>
-      </w:rPr>
-    </w:lvl>
-    <w:lvl w:ilvl="7">
-      <w:start w:val="1"/>
-      <w:numFmt w:val="decimal"/>
-      <w:lvlText w:val="%8."/>
-      <w:lvlJc w:val="left"/>
-      <w:pPr>
-        <w:tabs>
-          <w:tab w:val="num" w:pos="3240"/>
-        </w:tabs>
-        <w:ind w:left="3240" w:hanging="360"/>
-      </w:pPr>
-      <w:rPr>
-        <w:vertAlign w:val="baseline"/>
-        <w:position w:val="0"/>
-        <w:sz w:val="28"/>
-        <w:sz w:val="28"/>
-        <w:szCs w:val="28"/>
-        <w:rFonts w:ascii="Times New Roman" w:hAnsi="Times New Roman"/>
-      </w:rPr>
-    </w:lvl>
-    <w:lvl w:ilvl="8">
-      <w:start w:val="1"/>
-      <w:numFmt w:val="decimal"/>
-      <w:lvlText w:val="%9."/>
-      <w:lvlJc w:val="left"/>
-      <w:pPr>
-        <w:tabs>
-          <w:tab w:val="num" w:pos="3600"/>
-        </w:tabs>
-        <w:ind w:left="3600" w:hanging="360"/>
-      </w:pPr>
-      <w:rPr>
-        <w:vertAlign w:val="baseline"/>
-        <w:position w:val="0"/>
-        <w:sz w:val="28"/>
-        <w:sz w:val="28"/>
-        <w:szCs w:val="28"/>
-        <w:rFonts w:ascii="Times New Roman" w:hAnsi="Times New Roman"/>
       </w:rPr>
     </w:lvl>
   </w:abstractNum>
@@ -2010,172 +2020,163 @@
         <w:ind w:left="720" w:hanging="360"/>
       </w:pPr>
       <w:rPr>
-        <w:vertAlign w:val="baseline"/>
+        <w:rFonts w:ascii="Times New Roman" w:hAnsi="Times New Roman"/>
         <w:position w:val="0"/>
         <w:sz w:val="28"/>
+        <w:szCs w:val="28"/>
+        <w:vertAlign w:val="baseline"/>
+      </w:rPr>
+    </w:lvl>
+    <w:lvl w:ilvl="1">
+      <w:start w:val="1"/>
+      <w:numFmt w:val="decimal"/>
+      <w:lvlText w:val="%2."/>
+      <w:lvlJc w:val="left"/>
+      <w:pPr>
+        <w:tabs>
+          <w:tab w:val="num" w:pos="1080"/>
+        </w:tabs>
+        <w:ind w:left="1080" w:hanging="360"/>
+      </w:pPr>
+      <w:rPr>
+        <w:rFonts w:ascii="Times New Roman" w:hAnsi="Times New Roman"/>
+        <w:position w:val="0"/>
         <w:sz w:val="28"/>
         <w:szCs w:val="28"/>
+        <w:vertAlign w:val="baseline"/>
+      </w:rPr>
+    </w:lvl>
+    <w:lvl w:ilvl="2">
+      <w:start w:val="1"/>
+      <w:numFmt w:val="decimal"/>
+      <w:lvlText w:val="%3."/>
+      <w:lvlJc w:val="left"/>
+      <w:pPr>
+        <w:tabs>
+          <w:tab w:val="num" w:pos="1440"/>
+        </w:tabs>
+        <w:ind w:left="1440" w:hanging="360"/>
+      </w:pPr>
+      <w:rPr>
         <w:rFonts w:ascii="Times New Roman" w:hAnsi="Times New Roman"/>
-      </w:rPr>
-    </w:lvl>
-    <w:lvl w:ilvl="1">
-      <w:start w:val="1"/>
-      <w:numFmt w:val="decimal"/>
-      <w:lvlText w:val="%2."/>
-      <w:lvlJc w:val="left"/>
-      <w:pPr>
-        <w:tabs>
-          <w:tab w:val="num" w:pos="1080"/>
-        </w:tabs>
-        <w:ind w:left="1080" w:hanging="360"/>
-      </w:pPr>
-      <w:rPr>
-        <w:vertAlign w:val="baseline"/>
         <w:position w:val="0"/>
         <w:sz w:val="28"/>
+        <w:szCs w:val="28"/>
+        <w:vertAlign w:val="baseline"/>
+      </w:rPr>
+    </w:lvl>
+    <w:lvl w:ilvl="3">
+      <w:start w:val="1"/>
+      <w:numFmt w:val="decimal"/>
+      <w:lvlText w:val="%4."/>
+      <w:lvlJc w:val="left"/>
+      <w:pPr>
+        <w:tabs>
+          <w:tab w:val="num" w:pos="1800"/>
+        </w:tabs>
+        <w:ind w:left="1800" w:hanging="360"/>
+      </w:pPr>
+      <w:rPr>
+        <w:rFonts w:ascii="Times New Roman" w:hAnsi="Times New Roman"/>
+        <w:position w:val="0"/>
         <w:sz w:val="28"/>
         <w:szCs w:val="28"/>
+        <w:vertAlign w:val="baseline"/>
+      </w:rPr>
+    </w:lvl>
+    <w:lvl w:ilvl="4">
+      <w:start w:val="1"/>
+      <w:numFmt w:val="decimal"/>
+      <w:lvlText w:val="%5."/>
+      <w:lvlJc w:val="left"/>
+      <w:pPr>
+        <w:tabs>
+          <w:tab w:val="num" w:pos="2160"/>
+        </w:tabs>
+        <w:ind w:left="2160" w:hanging="360"/>
+      </w:pPr>
+      <w:rPr>
         <w:rFonts w:ascii="Times New Roman" w:hAnsi="Times New Roman"/>
-      </w:rPr>
-    </w:lvl>
-    <w:lvl w:ilvl="2">
-      <w:start w:val="1"/>
-      <w:numFmt w:val="decimal"/>
-      <w:lvlText w:val="%3."/>
-      <w:lvlJc w:val="left"/>
-      <w:pPr>
-        <w:tabs>
-          <w:tab w:val="num" w:pos="1440"/>
-        </w:tabs>
-        <w:ind w:left="1440" w:hanging="360"/>
-      </w:pPr>
-      <w:rPr>
-        <w:vertAlign w:val="baseline"/>
         <w:position w:val="0"/>
         <w:sz w:val="28"/>
+        <w:szCs w:val="28"/>
+        <w:vertAlign w:val="baseline"/>
+      </w:rPr>
+    </w:lvl>
+    <w:lvl w:ilvl="5">
+      <w:start w:val="1"/>
+      <w:numFmt w:val="decimal"/>
+      <w:lvlText w:val="%6."/>
+      <w:lvlJc w:val="left"/>
+      <w:pPr>
+        <w:tabs>
+          <w:tab w:val="num" w:pos="2520"/>
+        </w:tabs>
+        <w:ind w:left="2520" w:hanging="360"/>
+      </w:pPr>
+      <w:rPr>
+        <w:rFonts w:ascii="Times New Roman" w:hAnsi="Times New Roman"/>
+        <w:position w:val="0"/>
         <w:sz w:val="28"/>
         <w:szCs w:val="28"/>
+        <w:vertAlign w:val="baseline"/>
+      </w:rPr>
+    </w:lvl>
+    <w:lvl w:ilvl="6">
+      <w:start w:val="1"/>
+      <w:numFmt w:val="decimal"/>
+      <w:lvlText w:val="%7."/>
+      <w:lvlJc w:val="left"/>
+      <w:pPr>
+        <w:tabs>
+          <w:tab w:val="num" w:pos="2880"/>
+        </w:tabs>
+        <w:ind w:left="2880" w:hanging="360"/>
+      </w:pPr>
+      <w:rPr>
         <w:rFonts w:ascii="Times New Roman" w:hAnsi="Times New Roman"/>
-      </w:rPr>
-    </w:lvl>
-    <w:lvl w:ilvl="3">
-      <w:start w:val="1"/>
-      <w:numFmt w:val="decimal"/>
-      <w:lvlText w:val="%4."/>
-      <w:lvlJc w:val="left"/>
-      <w:pPr>
-        <w:tabs>
-          <w:tab w:val="num" w:pos="1800"/>
-        </w:tabs>
-        <w:ind w:left="1800" w:hanging="360"/>
-      </w:pPr>
-      <w:rPr>
-        <w:vertAlign w:val="baseline"/>
         <w:position w:val="0"/>
         <w:sz w:val="28"/>
+        <w:szCs w:val="28"/>
+        <w:vertAlign w:val="baseline"/>
+      </w:rPr>
+    </w:lvl>
+    <w:lvl w:ilvl="7">
+      <w:start w:val="1"/>
+      <w:numFmt w:val="decimal"/>
+      <w:lvlText w:val="%8."/>
+      <w:lvlJc w:val="left"/>
+      <w:pPr>
+        <w:tabs>
+          <w:tab w:val="num" w:pos="3240"/>
+        </w:tabs>
+        <w:ind w:left="3240" w:hanging="360"/>
+      </w:pPr>
+      <w:rPr>
+        <w:rFonts w:ascii="Times New Roman" w:hAnsi="Times New Roman"/>
+        <w:position w:val="0"/>
         <w:sz w:val="28"/>
         <w:szCs w:val="28"/>
+        <w:vertAlign w:val="baseline"/>
+      </w:rPr>
+    </w:lvl>
+    <w:lvl w:ilvl="8">
+      <w:start w:val="1"/>
+      <w:numFmt w:val="decimal"/>
+      <w:lvlText w:val="%9."/>
+      <w:lvlJc w:val="left"/>
+      <w:pPr>
+        <w:tabs>
+          <w:tab w:val="num" w:pos="3600"/>
+        </w:tabs>
+        <w:ind w:left="3600" w:hanging="360"/>
+      </w:pPr>
+      <w:rPr>
         <w:rFonts w:ascii="Times New Roman" w:hAnsi="Times New Roman"/>
-      </w:rPr>
-    </w:lvl>
-    <w:lvl w:ilvl="4">
-      <w:start w:val="1"/>
-      <w:numFmt w:val="decimal"/>
-      <w:lvlText w:val="%5."/>
-      <w:lvlJc w:val="left"/>
-      <w:pPr>
-        <w:tabs>
-          <w:tab w:val="num" w:pos="2160"/>
-        </w:tabs>
-        <w:ind w:left="2160" w:hanging="360"/>
-      </w:pPr>
-      <w:rPr>
-        <w:vertAlign w:val="baseline"/>
         <w:position w:val="0"/>
         <w:sz w:val="28"/>
-        <w:sz w:val="28"/>
         <w:szCs w:val="28"/>
-        <w:rFonts w:ascii="Times New Roman" w:hAnsi="Times New Roman"/>
-      </w:rPr>
-    </w:lvl>
-    <w:lvl w:ilvl="5">
-      <w:start w:val="1"/>
-      <w:numFmt w:val="decimal"/>
-      <w:lvlText w:val="%6."/>
-      <w:lvlJc w:val="left"/>
-      <w:pPr>
-        <w:tabs>
-          <w:tab w:val="num" w:pos="2520"/>
-        </w:tabs>
-        <w:ind w:left="2520" w:hanging="360"/>
-      </w:pPr>
-      <w:rPr>
         <w:vertAlign w:val="baseline"/>
-        <w:position w:val="0"/>
-        <w:sz w:val="28"/>
-        <w:sz w:val="28"/>
-        <w:szCs w:val="28"/>
-        <w:rFonts w:ascii="Times New Roman" w:hAnsi="Times New Roman"/>
-      </w:rPr>
-    </w:lvl>
-    <w:lvl w:ilvl="6">
-      <w:start w:val="1"/>
-      <w:numFmt w:val="decimal"/>
-      <w:lvlText w:val="%7."/>
-      <w:lvlJc w:val="left"/>
-      <w:pPr>
-        <w:tabs>
-          <w:tab w:val="num" w:pos="2880"/>
-        </w:tabs>
-        <w:ind w:left="2880" w:hanging="360"/>
-      </w:pPr>
-      <w:rPr>
-        <w:vertAlign w:val="baseline"/>
-        <w:position w:val="0"/>
-        <w:sz w:val="28"/>
-        <w:sz w:val="28"/>
-        <w:szCs w:val="28"/>
-        <w:rFonts w:ascii="Times New Roman" w:hAnsi="Times New Roman"/>
-      </w:rPr>
-    </w:lvl>
-    <w:lvl w:ilvl="7">
-      <w:start w:val="1"/>
-      <w:numFmt w:val="decimal"/>
-      <w:lvlText w:val="%8."/>
-      <w:lvlJc w:val="left"/>
-      <w:pPr>
-        <w:tabs>
-          <w:tab w:val="num" w:pos="3240"/>
-        </w:tabs>
-        <w:ind w:left="3240" w:hanging="360"/>
-      </w:pPr>
-      <w:rPr>
-        <w:vertAlign w:val="baseline"/>
-        <w:position w:val="0"/>
-        <w:sz w:val="28"/>
-        <w:sz w:val="28"/>
-        <w:szCs w:val="28"/>
-        <w:rFonts w:ascii="Times New Roman" w:hAnsi="Times New Roman"/>
-      </w:rPr>
-    </w:lvl>
-    <w:lvl w:ilvl="8">
-      <w:start w:val="1"/>
-      <w:numFmt w:val="decimal"/>
-      <w:lvlText w:val="%9."/>
-      <w:lvlJc w:val="left"/>
-      <w:pPr>
-        <w:tabs>
-          <w:tab w:val="num" w:pos="3600"/>
-        </w:tabs>
-        <w:ind w:left="3600" w:hanging="360"/>
-      </w:pPr>
-      <w:rPr>
-        <w:vertAlign w:val="baseline"/>
-        <w:position w:val="0"/>
-        <w:sz w:val="28"/>
-        <w:sz w:val="28"/>
-        <w:szCs w:val="28"/>
-        <w:rFonts w:ascii="Times New Roman" w:hAnsi="Times New Roman"/>
       </w:rPr>
     </w:lvl>
   </w:abstractNum>
@@ -2849,7 +2850,6 @@
       <w:rFonts w:ascii="Times New Roman" w:hAnsi="Times New Roman"/>
       <w:position w:val="0"/>
       <w:sz w:val="28"/>
-      <w:sz w:val="28"/>
       <w:szCs w:val="28"/>
       <w:vertAlign w:val="baseline"/>
     </w:rPr>
@@ -2979,6 +2979,13 @@
   </w:style>
   <w:style w:type="paragraph" w:styleId="Style15">
     <w:name w:val="Колонтитулы"/>
+    <w:basedOn w:val="Normal"/>
+    <w:qFormat/>
+    <w:pPr/>
+    <w:rPr/>
+  </w:style>
+  <w:style w:type="paragraph" w:styleId="user5">
+    <w:name w:val="Колонтитулы (user)"/>
     <w:basedOn w:val="Normal"/>
     <w:qFormat/>
     <w:pPr/>
@@ -3066,7 +3073,7 @@
       <w:szCs w:val="56"/>
     </w:rPr>
   </w:style>
-  <w:style w:type="paragraph" w:styleId="user5">
+  <w:style w:type="paragraph" w:styleId="user6">
     <w:name w:val="Рисунок (user)"/>
     <w:basedOn w:val="Caption"/>
     <w:qFormat/>
@@ -3078,14 +3085,14 @@
       <w:szCs w:val="28"/>
     </w:rPr>
   </w:style>
-  <w:style w:type="paragraph" w:styleId="user6">
+  <w:style w:type="paragraph" w:styleId="user7">
     <w:name w:val="Содержимое врезки (user)"/>
     <w:basedOn w:val="Normal"/>
     <w:qFormat/>
     <w:pPr/>
     <w:rPr/>
   </w:style>
-  <w:style w:type="paragraph" w:styleId="user7">
+  <w:style w:type="paragraph" w:styleId="user8">
     <w:name w:val="Содержимое таблицы (user)"/>
     <w:basedOn w:val="Normal"/>
     <w:qFormat/>
@@ -3095,9 +3102,9 @@
     </w:pPr>
     <w:rPr/>
   </w:style>
-  <w:style w:type="paragraph" w:styleId="user8">
+  <w:style w:type="paragraph" w:styleId="user9">
     <w:name w:val="Заголовок таблицы (user)"/>
-    <w:basedOn w:val="user7"/>
+    <w:basedOn w:val="user8"/>
     <w:qFormat/>
     <w:pPr>
       <w:suppressLineNumbers/>
@@ -3108,7 +3115,7 @@
       <w:bCs/>
     </w:rPr>
   </w:style>
-  <w:style w:type="paragraph" w:styleId="user9">
+  <w:style w:type="paragraph" w:styleId="user10">
     <w:name w:val="Фигура (user)"/>
     <w:basedOn w:val="Caption"/>
     <w:qFormat/>

</xml_diff>

<commit_message>
Updated docs: added graphs, updated .gitignore
</commit_message>
<xml_diff>
--- a/docs/ТПО ЛР №2 Силинцев ВВ.docx
+++ b/docs/ТПО ЛР №2 Силинцев ВВ.docx
@@ -1,6 +1,6 @@
 
 <file path=word/document.xml><?xml version="1.0" encoding="utf-8"?>
-<w:document xmlns:o="urn:schemas-microsoft-com:office:office" xmlns:r="http://schemas.openxmlformats.org/officeDocument/2006/relationships" xmlns:v="urn:schemas-microsoft-com:vml" xmlns:w="http://schemas.openxmlformats.org/wordprocessingml/2006/main" xmlns:w10="urn:schemas-microsoft-com:office:word" xmlns:wp="http://schemas.openxmlformats.org/drawingml/2006/wordprocessingDrawing" xmlns:pic="http://schemas.openxmlformats.org/drawingml/2006/picture" xmlns:wps="http://schemas.microsoft.com/office/word/2010/wordprocessingShape" xmlns:wpg="http://schemas.microsoft.com/office/word/2010/wordprocessingGroup" xmlns:mc="http://schemas.openxmlformats.org/markup-compatibility/2006" xmlns:wp14="http://schemas.microsoft.com/office/word/2010/wordprocessingDrawing" xmlns:w14="http://schemas.microsoft.com/office/word/2010/wordml" xmlns:w15="http://schemas.microsoft.com/office/word/2012/wordml" mc:Ignorable="w14 wp14 w15">
+<w:document xmlns:o="urn:schemas-microsoft-com:office:office" xmlns:r="http://schemas.openxmlformats.org/officeDocument/2006/relationships" xmlns:v="urn:schemas-microsoft-com:vml" xmlns:w="http://schemas.openxmlformats.org/wordprocessingml/2006/main" xmlns:w10="urn:schemas-microsoft-com:office:word" xmlns:wp="http://schemas.openxmlformats.org/drawingml/2006/wordprocessingDrawing" xmlns:wps="http://schemas.microsoft.com/office/word/2010/wordprocessingShape" xmlns:wpg="http://schemas.microsoft.com/office/word/2010/wordprocessingGroup" xmlns:mc="http://schemas.openxmlformats.org/markup-compatibility/2006" xmlns:wp14="http://schemas.microsoft.com/office/word/2010/wordprocessingDrawing" xmlns:w14="http://schemas.microsoft.com/office/word/2010/wordml" xmlns:w15="http://schemas.microsoft.com/office/word/2012/wordml" mc:Ignorable="w14 wp14 w15">
   <w:body>
     <w:p>
       <w:pPr>
@@ -16,7 +16,7 @@
         <mc:AlternateContent>
           <mc:Choice Requires="wps">
             <w:drawing>
-              <wp:anchor distT="0" distB="0" distL="0" distR="0" simplePos="0" relativeHeight="2" behindDoc="0" locked="0" layoutInCell="1" allowOverlap="1">
+              <wp:anchor behindDoc="0" distT="0" distB="0" distL="0" distR="0" simplePos="0" locked="0" layoutInCell="1" allowOverlap="1" relativeHeight="2">
                 <wp:simplePos x="0" y="0"/>
                 <wp:positionH relativeFrom="column">
                   <wp:posOffset>-213360</wp:posOffset>
@@ -81,7 +81,7 @@
           </mc:Choice>
           <mc:Fallback>
             <w:pict>
-              <v:rect id="shape_0" stroked="f" o:allowincell="f" style="position:absolute;margin-left:-16.8pt;margin-top:0.05pt;width:16.75pt;height:16.75pt;mso-wrap-style:none;v-text-anchor:middle">
+              <v:rect id="shape_0" ID="user-content-стартовая-страница-должна-содержать-следующие-элементы" path="m0,0l-2147483645,0l-2147483645,-2147483646l0,-2147483646xe" stroked="f" o:allowincell="f" style="position:absolute;margin-left:-16.8pt;margin-top:0.05pt;width:16.75pt;height:16.75pt;mso-wrap-style:none;v-text-anchor:middle">
                 <v:fill o:detectmouseclick="t" on="false"/>
                 <v:stroke color="#3465a4" joinstyle="round" endcap="flat"/>
                 <v:textbox>
@@ -111,7 +111,7 @@
         <mc:AlternateContent>
           <mc:Choice Requires="wps">
             <w:drawing>
-              <wp:anchor distT="0" distB="0" distL="0" distR="0" simplePos="0" relativeHeight="4" behindDoc="0" locked="0" layoutInCell="1" allowOverlap="1">
+              <wp:anchor behindDoc="0" distT="0" distB="0" distL="0" distR="0" simplePos="0" locked="0" layoutInCell="1" allowOverlap="1" relativeHeight="4">
                 <wp:simplePos x="0" y="0"/>
                 <wp:positionH relativeFrom="column">
                   <wp:posOffset>-213360</wp:posOffset>
@@ -176,7 +176,7 @@
           </mc:Choice>
           <mc:Fallback>
             <w:pict>
-              <v:rect id="shape_0" stroked="f" o:allowincell="f" style="position:absolute;margin-left:-16.8pt;margin-top:0.05pt;width:16.75pt;height:16.75pt;mso-wrap-style:none;v-text-anchor:middle">
+              <v:rect id="shape_0" ID="user-content-основная-страница-приложения-должна-содержать-следующие-элементы" path="m0,0l-2147483645,0l-2147483645,-2147483646l0,-2147483646xe" stroked="f" o:allowincell="f" style="position:absolute;margin-left:-16.8pt;margin-top:0.05pt;width:16.75pt;height:16.75pt;mso-wrap-style:none;v-text-anchor:middle">
                 <v:fill o:detectmouseclick="t" on="false"/>
                 <v:stroke color="#3465a4" joinstyle="round" endcap="flat"/>
                 <v:textbox>
@@ -206,7 +206,7 @@
         <mc:AlternateContent>
           <mc:Choice Requires="wps">
             <w:drawing>
-              <wp:anchor distT="0" distB="0" distL="0" distR="0" simplePos="0" relativeHeight="6" behindDoc="0" locked="0" layoutInCell="1" allowOverlap="1">
+              <wp:anchor behindDoc="0" distT="0" distB="0" distL="0" distR="0" simplePos="0" locked="0" layoutInCell="1" allowOverlap="1" relativeHeight="6">
                 <wp:simplePos x="0" y="0"/>
                 <wp:positionH relativeFrom="column">
                   <wp:posOffset>-213360</wp:posOffset>
@@ -271,7 +271,7 @@
           </mc:Choice>
           <mc:Fallback>
             <w:pict>
-              <v:rect id="shape_0" stroked="f" o:allowincell="f" style="position:absolute;margin-left:-16.8pt;margin-top:0.05pt;width:16.75pt;height:16.75pt;mso-wrap-style:none;v-text-anchor:middle">
+              <v:rect id="shape_0" ID="user-content-дополнительные-требования-к-приложению" path="m0,0l-2147483645,0l-2147483645,-2147483646l0,-2147483646xe" stroked="f" o:allowincell="f" style="position:absolute;margin-left:-16.8pt;margin-top:0.05pt;width:16.75pt;height:16.75pt;mso-wrap-style:none;v-text-anchor:middle">
                 <v:fill o:detectmouseclick="t" on="false"/>
                 <v:stroke color="#3465a4" joinstyle="round" endcap="flat"/>
                 <v:textbox>
@@ -606,7 +606,7 @@
             <w:pStyle w:val="TOC1"/>
             <w:tabs>
               <w:tab w:val="clear" w:pos="708"/>
-              <w:tab w:val="right" w:pos="9354" w:leader="dot"/>
+              <w:tab w:val="right" w:pos="9355" w:leader="dot"/>
             </w:tabs>
             <w:rPr/>
           </w:pPr>
@@ -615,77 +615,110 @@
           </w:r>
           <w:r>
             <w:rPr>
-              <w:rStyle w:val="user"/>
+              <w:rStyle w:val="Style11"/>
             </w:rPr>
             <w:instrText xml:space="preserve"> TOC \f \o "1-9" \h</w:instrText>
           </w:r>
           <w:r>
             <w:rPr>
-              <w:rStyle w:val="user"/>
+              <w:rStyle w:val="Style11"/>
             </w:rPr>
             <w:fldChar w:fldCharType="separate"/>
           </w:r>
-          <w:r>
-            <w:rPr>
-              <w:rStyle w:val="user"/>
-            </w:rPr>
-            <w:t>Задание</w:t>
-          </w:r>
-          <w:r>
-            <w:rPr/>
-            <w:tab/>
-            <w:t>3</w:t>
-          </w:r>
+          <w:hyperlink w:anchor="__RefHeading___Toc520_1614521587">
+            <w:r>
+              <w:rPr>
+                <w:rStyle w:val="Style11"/>
+              </w:rPr>
+              <w:t>Задание</w:t>
+              <w:tab/>
+              <w:t>3</w:t>
+            </w:r>
+          </w:hyperlink>
         </w:p>
         <w:p>
           <w:pPr>
             <w:pStyle w:val="TOC1"/>
             <w:tabs>
               <w:tab w:val="clear" w:pos="708"/>
-              <w:tab w:val="right" w:pos="9354" w:leader="dot"/>
+              <w:tab w:val="right" w:pos="9355" w:leader="dot"/>
             </w:tabs>
             <w:rPr/>
           </w:pPr>
-          <w:r>
-            <w:rPr/>
-            <w:t>Разработанное приложение</w:t>
-            <w:tab/>
-            <w:t>6</w:t>
-          </w:r>
+          <w:hyperlink w:anchor="__RefHeading___Toc522_1614521587_%25D0%2">
+            <w:r>
+              <w:rPr>
+                <w:rStyle w:val="Style11"/>
+              </w:rPr>
+              <w:t>Разработанное приложение</w:t>
+              <w:tab/>
+              <w:t>7</w:t>
+            </w:r>
+          </w:hyperlink>
         </w:p>
         <w:p>
           <w:pPr>
             <w:pStyle w:val="TOC1"/>
             <w:tabs>
               <w:tab w:val="clear" w:pos="708"/>
-              <w:tab w:val="right" w:pos="9354" w:leader="dot"/>
+              <w:tab w:val="right" w:pos="9355" w:leader="dot"/>
             </w:tabs>
             <w:rPr/>
           </w:pPr>
-          <w:r>
-            <w:rPr/>
-            <w:t>UML-диаграмма</w:t>
-            <w:tab/>
-            <w:t>7</w:t>
-          </w:r>
+          <w:hyperlink w:anchor="__RefHeading___Toc524_1614521587">
+            <w:r>
+              <w:rPr>
+                <w:rStyle w:val="Style11"/>
+              </w:rPr>
+              <w:t>Анализ</w:t>
+              <w:tab/>
+              <w:t>8</w:t>
+            </w:r>
+          </w:hyperlink>
         </w:p>
         <w:p>
           <w:pPr>
             <w:pStyle w:val="TOC1"/>
             <w:tabs>
               <w:tab w:val="clear" w:pos="708"/>
-              <w:tab w:val="right" w:pos="9354" w:leader="dot"/>
+              <w:tab w:val="right" w:pos="9355" w:leader="dot"/>
             </w:tabs>
             <w:rPr/>
           </w:pPr>
+          <w:hyperlink w:anchor="__RefHeading___Toc524_1614521587_%25D0%2">
+            <w:r>
+              <w:rPr>
+                <w:rStyle w:val="Style11"/>
+              </w:rPr>
+              <w:t>Графики</w:t>
+              <w:tab/>
+              <w:t>9</w:t>
+            </w:r>
+          </w:hyperlink>
+        </w:p>
+        <w:p>
+          <w:pPr>
+            <w:pStyle w:val="TOC1"/>
+            <w:tabs>
+              <w:tab w:val="clear" w:pos="708"/>
+              <w:tab w:val="right" w:pos="9355" w:leader="dot"/>
+            </w:tabs>
+            <w:rPr/>
+          </w:pPr>
+          <w:hyperlink w:anchor="__RefHeading___Toc524_1614521587_%25D0%1">
+            <w:r>
+              <w:rPr>
+                <w:rStyle w:val="Style11"/>
+              </w:rPr>
+              <w:t>Выводы</w:t>
+              <w:tab/>
+              <w:t>18</w:t>
+            </w:r>
+          </w:hyperlink>
           <w:r>
-            <w:rPr/>
-            <w:t>Выводы</w:t>
-            <w:tab/>
-            <w:t>8</w:t>
-          </w:r>
-          <w:r>
-            <w:rPr/>
+            <w:rPr>
+              <w:rStyle w:val="Style11"/>
+            </w:rPr>
             <w:fldChar w:fldCharType="end"/>
           </w:r>
         </w:p>
@@ -767,6 +800,24 @@
       <w:r>
         <w:rPr/>
         <w:t>x &gt; 0 : (((((log_10(x) - log_3(x)) ^ 2) ^ 3) * log_10(x)) + (((log_3(x) + (ln(x) ^ 3)) / (log_10(x) ^ 3)) * log_3(x)))</w:t>
+      </w:r>
+    </w:p>
+    <w:p>
+      <w:pPr>
+        <w:pStyle w:val="BodyText"/>
+        <w:spacing w:lineRule="auto" w:line="360" w:before="0" w:after="159"/>
+        <w:ind w:firstLine="709"/>
+        <w:jc w:val="both"/>
+        <w:rPr>
+          <w:b/>
+          <w:bCs/>
+        </w:rPr>
+      </w:pPr>
+      <w:r>
+        <w:rPr/>
+      </w:r>
+      <w:r>
+        <w:br w:type="page"/>
       </w:r>
     </w:p>
     <w:p>
@@ -817,7 +868,7 @@
       </w:pPr>
       <w:r>
         <w:drawing>
-          <wp:anchor distT="0" distB="0" distL="0" distR="0" simplePos="0" relativeHeight="8" behindDoc="0" locked="0" layoutInCell="0" allowOverlap="1">
+          <wp:anchor behindDoc="0" distT="0" distB="0" distL="0" distR="0" simplePos="0" locked="0" layoutInCell="0" allowOverlap="1" relativeHeight="8">
             <wp:simplePos x="0" y="0"/>
             <wp:positionH relativeFrom="column">
               <wp:align>center</wp:align>
@@ -828,7 +879,7 @@
             <wp:extent cx="4013835" cy="3388995"/>
             <wp:effectExtent l="0" t="0" r="0" b="0"/>
             <wp:wrapTopAndBottom/>
-            <wp:docPr id="4" name="Изображение1"/>
+            <wp:docPr id="4" name="Изображение1" descr=""/>
             <wp:cNvGraphicFramePr>
               <a:graphicFrameLocks xmlns:a="http://schemas.openxmlformats.org/drawingml/2006/main" noChangeAspect="1"/>
             </wp:cNvGraphicFramePr>
@@ -836,7 +887,7 @@
               <a:graphicData uri="http://schemas.openxmlformats.org/drawingml/2006/picture">
                 <pic:pic xmlns:pic="http://schemas.openxmlformats.org/drawingml/2006/picture">
                   <pic:nvPicPr>
-                    <pic:cNvPr id="4" name="Изображение1"/>
+                    <pic:cNvPr id="4" name="Изображение1" descr=""/>
                     <pic:cNvPicPr>
                       <a:picLocks noChangeAspect="1" noChangeArrowheads="1"/>
                     </pic:cNvPicPr>
@@ -855,7 +906,6 @@
                     <a:prstGeom prst="rect">
                       <a:avLst/>
                     </a:prstGeom>
-                    <a:noFill/>
                   </pic:spPr>
                 </pic:pic>
               </a:graphicData>
@@ -1147,21 +1197,672 @@
         <w:ind w:left="709"/>
         <w:jc w:val="center"/>
         <w:rPr>
-          <w:lang w:val="en-US"/>
+          <w:lang w:val="ru-RU"/>
         </w:rPr>
       </w:pPr>
       <w:bookmarkStart w:id="2" w:name="__RefHeading___Toc524_1614521587"/>
       <w:bookmarkEnd w:id="2"/>
       <w:r>
         <w:rPr>
-          <w:rFonts w:eastAsia="Times New Roman" w:cs="Times New Roman"/>
-          <w:b/>
-          <w:bCs/>
-          <w:color w:val="auto"/>
+          <w:lang w:val="ru-RU"/>
+        </w:rPr>
+        <w:t>Анализ</w:t>
+      </w:r>
+    </w:p>
+    <w:p>
+      <w:pPr>
+        <w:pStyle w:val="BodyText"/>
+        <w:bidi w:val="0"/>
+        <w:spacing w:lineRule="auto" w:line="360" w:beforeAutospacing="0" w:before="0" w:afterAutospacing="0" w:after="160"/>
+        <w:ind w:firstLine="709" w:left="0" w:right="0"/>
+        <w:jc w:val="both"/>
+        <w:rPr>
+          <w:rFonts w:ascii="Times New Roman" w:hAnsi="Times New Roman"/>
           <w:lang w:val="en-US"/>
         </w:rPr>
-        <w:t>UML-</w:t>
-      </w:r>
+      </w:pPr>
+      <w:r>
+        <w:rPr/>
+        <w:t xml:space="preserve">При </w:t>
+      </w:r>
+      <w:r>
+        <w:rPr/>
+      </w:r>
+      <m:oMath xmlns:m="http://schemas.openxmlformats.org/officeDocument/2006/math">
+        <m:r>
+          <w:rPr>
+            <w:rFonts w:ascii="Cambria Math" w:hAnsi="Cambria Math"/>
+          </w:rPr>
+          <m:t xml:space="preserve">x</m:t>
+        </m:r>
+        <m:r>
+          <w:rPr>
+            <w:rFonts w:ascii="Cambria Math" w:hAnsi="Cambria Math"/>
+          </w:rPr>
+          <m:t xml:space="preserve">≤</m:t>
+        </m:r>
+        <m:r>
+          <w:rPr>
+            <w:rFonts w:ascii="Cambria Math" w:hAnsi="Cambria Math"/>
+          </w:rPr>
+          <m:t xml:space="preserve">0</m:t>
+        </m:r>
+      </m:oMath>
+      <w:r>
+        <w:rPr/>
+        <w:t xml:space="preserve"> выражение содержит тригонометрические функции с аргументом </w:t>
+      </w:r>
+      <w:r>
+        <w:rPr/>
+      </w:r>
+      <m:oMath xmlns:m="http://schemas.openxmlformats.org/officeDocument/2006/math">
+        <m:r>
+          <w:rPr>
+            <w:rFonts w:ascii="Cambria Math" w:hAnsi="Cambria Math"/>
+          </w:rPr>
+          <m:t xml:space="preserve">x</m:t>
+        </m:r>
+      </m:oMath>
+      <w:r>
+        <w:rPr/>
+        <w:t xml:space="preserve">, которые являются периодическими с периодом </w:t>
+      </w:r>
+      <w:r>
+        <w:rPr/>
+      </w:r>
+      <m:oMath xmlns:m="http://schemas.openxmlformats.org/officeDocument/2006/math">
+        <m:r>
+          <w:rPr>
+            <w:rFonts w:ascii="Cambria Math" w:hAnsi="Cambria Math"/>
+          </w:rPr>
+          <m:t xml:space="preserve">2</m:t>
+        </m:r>
+        <m:r>
+          <w:rPr>
+            <w:rFonts w:ascii="Cambria Math" w:hAnsi="Cambria Math"/>
+          </w:rPr>
+          <m:t xml:space="preserve">π</m:t>
+        </m:r>
+      </m:oMath>
+      <w:r>
+        <w:rPr/>
+        <w:t xml:space="preserve">, следовательно, сама функция также периодична с тем же периодом. Поэтому достаточно исследовать её поведение на интервале </w:t>
+      </w:r>
+      <w:r>
+        <w:rPr/>
+      </w:r>
+      <m:oMath xmlns:m="http://schemas.openxmlformats.org/officeDocument/2006/math">
+        <m:d>
+          <m:dPr>
+            <m:begChr m:val="("/>
+            <m:endChr m:val="]"/>
+          </m:dPr>
+          <m:e>
+            <m:r>
+              <w:rPr>
+                <w:rFonts w:ascii="Cambria Math" w:hAnsi="Cambria Math"/>
+              </w:rPr>
+              <m:t xml:space="preserve">−</m:t>
+            </m:r>
+            <m:r>
+              <w:rPr>
+                <w:rFonts w:ascii="Cambria Math" w:hAnsi="Cambria Math"/>
+              </w:rPr>
+              <m:t xml:space="preserve">2</m:t>
+            </m:r>
+            <m:r>
+              <w:rPr>
+                <w:rFonts w:ascii="Cambria Math" w:hAnsi="Cambria Math"/>
+              </w:rPr>
+              <m:t xml:space="preserve">π</m:t>
+            </m:r>
+            <m:r>
+              <w:rPr>
+                <w:rFonts w:ascii="Cambria Math" w:hAnsi="Cambria Math"/>
+              </w:rPr>
+              <m:t xml:space="preserve">,</m:t>
+            </m:r>
+            <m:r>
+              <w:rPr>
+                <w:rFonts w:ascii="Cambria Math" w:hAnsi="Cambria Math"/>
+              </w:rPr>
+              <m:t xml:space="preserve">0</m:t>
+            </m:r>
+          </m:e>
+        </m:d>
+      </m:oMath>
+      <w:r>
+        <w:rPr/>
+        <w:t xml:space="preserve">. В ходе анализа установлено, что производная функции обращается в ноль в точках </w:t>
+      </w:r>
+      <w:r>
+        <w:rPr/>
+      </w:r>
+      <m:oMath xmlns:m="http://schemas.openxmlformats.org/officeDocument/2006/math">
+        <m:r>
+          <w:rPr>
+            <w:rFonts w:ascii="Cambria Math" w:hAnsi="Cambria Math"/>
+          </w:rPr>
+          <m:t xml:space="preserve">x</m:t>
+        </m:r>
+        <m:r>
+          <w:rPr>
+            <w:rFonts w:ascii="Cambria Math" w:hAnsi="Cambria Math"/>
+          </w:rPr>
+          <m:t xml:space="preserve">=</m:t>
+        </m:r>
+        <m:r>
+          <w:rPr>
+            <w:rFonts w:ascii="Cambria Math" w:hAnsi="Cambria Math"/>
+          </w:rPr>
+          <m:t xml:space="preserve">−</m:t>
+        </m:r>
+        <m:r>
+          <w:rPr>
+            <w:rFonts w:ascii="Cambria Math" w:hAnsi="Cambria Math"/>
+          </w:rPr>
+          <m:t xml:space="preserve">0.657984</m:t>
+        </m:r>
+        <m:r>
+          <w:rPr>
+            <w:rFonts w:ascii="Cambria Math" w:hAnsi="Cambria Math"/>
+          </w:rPr>
+          <m:t xml:space="preserve">,</m:t>
+        </m:r>
+        <m:r>
+          <w:rPr>
+            <w:rFonts w:ascii="Cambria Math" w:hAnsi="Cambria Math"/>
+          </w:rPr>
+          <m:t xml:space="preserve">−</m:t>
+        </m:r>
+        <m:r>
+          <w:rPr>
+            <w:rFonts w:ascii="Cambria Math" w:hAnsi="Cambria Math"/>
+          </w:rPr>
+          <m:t xml:space="preserve">3.78322530718</m:t>
+        </m:r>
+        <m:r>
+          <w:rPr>
+            <w:rFonts w:ascii="Cambria Math" w:hAnsi="Cambria Math"/>
+          </w:rPr>
+          <m:t xml:space="preserve">,</m:t>
+        </m:r>
+        <m:r>
+          <w:rPr>
+            <w:rFonts w:ascii="Cambria Math" w:hAnsi="Cambria Math"/>
+          </w:rPr>
+          <m:t xml:space="preserve">−</m:t>
+        </m:r>
+        <m:r>
+          <w:rPr>
+            <w:rFonts w:ascii="Cambria Math" w:hAnsi="Cambria Math"/>
+          </w:rPr>
+          <m:t xml:space="preserve">4.03374530718</m:t>
+        </m:r>
+        <m:r>
+          <w:rPr>
+            <w:rFonts w:ascii="Cambria Math" w:hAnsi="Cambria Math"/>
+          </w:rPr>
+          <m:t xml:space="preserve">,</m:t>
+        </m:r>
+        <m:r>
+          <w:rPr>
+            <w:rFonts w:ascii="Cambria Math" w:hAnsi="Cambria Math"/>
+          </w:rPr>
+          <m:t xml:space="preserve">−</m:t>
+        </m:r>
+        <m:r>
+          <w:rPr>
+            <w:rFonts w:ascii="Cambria Math" w:hAnsi="Cambria Math"/>
+          </w:rPr>
+          <m:t xml:space="preserve">5.73560530718</m:t>
+        </m:r>
+        <m:r>
+          <w:rPr>
+            <w:rFonts w:ascii="Cambria Math" w:hAnsi="Cambria Math"/>
+          </w:rPr>
+          <m:t xml:space="preserve">,</m:t>
+        </m:r>
+        <m:r>
+          <w:rPr>
+            <w:rFonts w:ascii="Cambria Math" w:hAnsi="Cambria Math"/>
+          </w:rPr>
+          <m:t xml:space="preserve">−</m:t>
+        </m:r>
+        <m:r>
+          <w:rPr>
+            <w:rFonts w:ascii="Cambria Math" w:hAnsi="Cambria Math"/>
+          </w:rPr>
+          <m:t xml:space="preserve">5.88811330718</m:t>
+        </m:r>
+      </m:oMath>
+      <w:r>
+        <w:rPr/>
+        <w:t xml:space="preserve">. Нули функции наблюдаются в точках </w:t>
+      </w:r>
+      <w:r>
+        <w:rPr/>
+      </w:r>
+      <m:oMath xmlns:m="http://schemas.openxmlformats.org/officeDocument/2006/math">
+        <m:r>
+          <w:rPr>
+            <w:rFonts w:ascii="Cambria Math" w:hAnsi="Cambria Math"/>
+          </w:rPr>
+          <m:t xml:space="preserve">x</m:t>
+        </m:r>
+        <m:r>
+          <w:rPr>
+            <w:rFonts w:ascii="Cambria Math" w:hAnsi="Cambria Math"/>
+          </w:rPr>
+          <m:t xml:space="preserve">=</m:t>
+        </m:r>
+        <m:r>
+          <w:rPr>
+            <w:rFonts w:ascii="Cambria Math" w:hAnsi="Cambria Math"/>
+          </w:rPr>
+          <m:t xml:space="preserve">−</m:t>
+        </m:r>
+        <m:r>
+          <w:rPr>
+            <w:rFonts w:ascii="Cambria Math" w:hAnsi="Cambria Math"/>
+          </w:rPr>
+          <m:t xml:space="preserve">0.9806</m:t>
+        </m:r>
+        <m:r>
+          <w:rPr>
+            <w:rFonts w:ascii="Cambria Math" w:hAnsi="Cambria Math"/>
+          </w:rPr>
+          <m:t xml:space="preserve">,</m:t>
+        </m:r>
+        <m:r>
+          <w:rPr>
+            <w:rFonts w:ascii="Cambria Math" w:hAnsi="Cambria Math"/>
+          </w:rPr>
+          <m:t xml:space="preserve">−</m:t>
+        </m:r>
+        <m:r>
+          <w:rPr>
+            <w:rFonts w:ascii="Cambria Math" w:hAnsi="Cambria Math"/>
+          </w:rPr>
+          <m:t xml:space="preserve">2.161</m:t>
+        </m:r>
+        <m:r>
+          <w:rPr>
+            <w:rFonts w:ascii="Cambria Math" w:hAnsi="Cambria Math"/>
+          </w:rPr>
+          <m:t xml:space="preserve">,</m:t>
+        </m:r>
+        <m:r>
+          <w:rPr>
+            <w:rFonts w:ascii="Cambria Math" w:hAnsi="Cambria Math"/>
+          </w:rPr>
+          <m:t xml:space="preserve">−</m:t>
+        </m:r>
+        <m:r>
+          <w:rPr>
+            <w:rFonts w:ascii="Cambria Math" w:hAnsi="Cambria Math"/>
+          </w:rPr>
+          <m:t xml:space="preserve">2.40132</m:t>
+        </m:r>
+        <m:r>
+          <w:rPr>
+            <w:rFonts w:ascii="Cambria Math" w:hAnsi="Cambria Math"/>
+          </w:rPr>
+          <m:t xml:space="preserve">,</m:t>
+        </m:r>
+        <m:r>
+          <w:rPr>
+            <w:rFonts w:ascii="Cambria Math" w:hAnsi="Cambria Math"/>
+          </w:rPr>
+          <m:t xml:space="preserve">−</m:t>
+        </m:r>
+        <m:r>
+          <w:rPr>
+            <w:rFonts w:ascii="Cambria Math" w:hAnsi="Cambria Math"/>
+          </w:rPr>
+          <m:t xml:space="preserve">3.43021</m:t>
+        </m:r>
+        <m:r>
+          <w:rPr>
+            <w:rFonts w:ascii="Cambria Math" w:hAnsi="Cambria Math"/>
+          </w:rPr>
+          <m:t xml:space="preserve">,</m:t>
+        </m:r>
+        <m:r>
+          <w:rPr>
+            <w:rFonts w:ascii="Cambria Math" w:hAnsi="Cambria Math"/>
+          </w:rPr>
+          <m:t xml:space="preserve">−</m:t>
+        </m:r>
+        <m:r>
+          <w:rPr>
+            <w:rFonts w:ascii="Cambria Math" w:hAnsi="Cambria Math"/>
+          </w:rPr>
+          <m:t xml:space="preserve">5.28327</m:t>
+        </m:r>
+        <m:r>
+          <w:rPr>
+            <w:rFonts w:ascii="Cambria Math" w:hAnsi="Cambria Math"/>
+          </w:rPr>
+          <m:t xml:space="preserve">,</m:t>
+        </m:r>
+        <m:r>
+          <w:rPr>
+            <w:rFonts w:ascii="Cambria Math" w:hAnsi="Cambria Math"/>
+          </w:rPr>
+          <m:t xml:space="preserve">−</m:t>
+        </m:r>
+        <m:r>
+          <w:rPr>
+            <w:rFonts w:ascii="Cambria Math" w:hAnsi="Cambria Math"/>
+          </w:rPr>
+          <m:t xml:space="preserve">5.99457</m:t>
+        </m:r>
+      </m:oMath>
+      <w:r>
+        <w:rPr/>
+        <w:t xml:space="preserve">. В точке </w:t>
+      </w:r>
+      <w:r>
+        <w:rPr/>
+      </w:r>
+      <m:oMath xmlns:m="http://schemas.openxmlformats.org/officeDocument/2006/math">
+        <m:r>
+          <w:rPr>
+            <w:rFonts w:ascii="Cambria Math" w:hAnsi="Cambria Math"/>
+          </w:rPr>
+          <m:t xml:space="preserve">x</m:t>
+        </m:r>
+        <m:r>
+          <w:rPr>
+            <w:rFonts w:ascii="Cambria Math" w:hAnsi="Cambria Math"/>
+          </w:rPr>
+          <m:t xml:space="preserve">=</m:t>
+        </m:r>
+        <m:r>
+          <w:rPr>
+            <w:rFonts w:ascii="Cambria Math" w:hAnsi="Cambria Math"/>
+          </w:rPr>
+          <m:t xml:space="preserve">0</m:t>
+        </m:r>
+      </m:oMath>
+      <w:r>
+        <w:rPr/>
+        <w:t xml:space="preserve"> функция не определена, что связано с особенностями входящих в выражение тригонометрических функций.</w:t>
+      </w:r>
+    </w:p>
+    <w:p>
+      <w:pPr>
+        <w:pStyle w:val="BodyText"/>
+        <w:bidi w:val="0"/>
+        <w:spacing w:lineRule="auto" w:line="360" w:beforeAutospacing="0" w:before="0" w:afterAutospacing="0" w:after="160"/>
+        <w:ind w:firstLine="709" w:left="0" w:right="0"/>
+        <w:jc w:val="both"/>
+        <w:rPr>
+          <w:rFonts w:ascii="Times New Roman" w:hAnsi="Times New Roman"/>
+          <w:lang w:val="en-US"/>
+        </w:rPr>
+      </w:pPr>
+      <w:r>
+        <w:rPr/>
+        <w:t xml:space="preserve">При </w:t>
+      </w:r>
+      <w:r>
+        <w:rPr/>
+      </w:r>
+      <m:oMath xmlns:m="http://schemas.openxmlformats.org/officeDocument/2006/math">
+        <m:r>
+          <w:rPr>
+            <w:rFonts w:ascii="Cambria Math" w:hAnsi="Cambria Math"/>
+          </w:rPr>
+          <m:t xml:space="preserve">x</m:t>
+        </m:r>
+        <m:r>
+          <w:rPr>
+            <w:rFonts w:ascii="Cambria Math" w:hAnsi="Cambria Math"/>
+          </w:rPr>
+          <m:t xml:space="preserve">&gt;</m:t>
+        </m:r>
+        <m:r>
+          <w:rPr>
+            <w:rFonts w:ascii="Cambria Math" w:hAnsi="Cambria Math"/>
+          </w:rPr>
+          <m:t xml:space="preserve">0</m:t>
+        </m:r>
+      </m:oMath>
+      <w:r>
+        <w:rPr/>
+        <w:t xml:space="preserve"> функция задаётся выражением, содержащим логарифмические функции. На данном интервале производная функции обращается в ноль в точках </w:t>
+      </w:r>
+      <w:r>
+        <w:rPr/>
+      </w:r>
+      <m:oMath xmlns:m="http://schemas.openxmlformats.org/officeDocument/2006/math">
+        <m:r>
+          <w:rPr>
+            <w:rFonts w:ascii="Cambria Math" w:hAnsi="Cambria Math"/>
+          </w:rPr>
+          <m:t xml:space="preserve">x</m:t>
+        </m:r>
+        <m:r>
+          <w:rPr>
+            <w:rFonts w:ascii="Cambria Math" w:hAnsi="Cambria Math"/>
+          </w:rPr>
+          <m:t xml:space="preserve">=</m:t>
+        </m:r>
+        <m:r>
+          <w:rPr>
+            <w:rFonts w:ascii="Cambria Math" w:hAnsi="Cambria Math"/>
+          </w:rPr>
+          <m:t xml:space="preserve">0.385609</m:t>
+        </m:r>
+      </m:oMath>
+      <w:r>
+        <w:rPr/>
+        <w:t xml:space="preserve"> </w:t>
+      </w:r>
+      <w:r>
+        <w:rPr/>
+        <w:t xml:space="preserve">и </w:t>
+      </w:r>
+      <w:r>
+        <w:rPr/>
+      </w:r>
+      <m:oMath xmlns:m="http://schemas.openxmlformats.org/officeDocument/2006/math">
+        <m:r>
+          <w:rPr>
+            <w:rFonts w:ascii="Cambria Math" w:hAnsi="Cambria Math"/>
+          </w:rPr>
+          <m:t xml:space="preserve">x</m:t>
+        </m:r>
+        <m:r>
+          <w:rPr>
+            <w:rFonts w:ascii="Cambria Math" w:hAnsi="Cambria Math"/>
+          </w:rPr>
+          <m:t xml:space="preserve">=</m:t>
+        </m:r>
+        <m:r>
+          <w:rPr>
+            <w:rFonts w:ascii="Cambria Math" w:hAnsi="Cambria Math"/>
+          </w:rPr>
+          <m:t xml:space="preserve">2.5933</m:t>
+        </m:r>
+      </m:oMath>
+      <w:r>
+        <w:rPr/>
+        <w:t xml:space="preserve">. Нулей функции на интервале </w:t>
+      </w:r>
+      <w:r>
+        <w:rPr/>
+      </w:r>
+      <m:oMath xmlns:m="http://schemas.openxmlformats.org/officeDocument/2006/math">
+        <m:r>
+          <w:rPr>
+            <w:rFonts w:ascii="Cambria Math" w:hAnsi="Cambria Math"/>
+          </w:rPr>
+          <m:t xml:space="preserve">x</m:t>
+        </m:r>
+        <m:r>
+          <w:rPr>
+            <w:rFonts w:ascii="Cambria Math" w:hAnsi="Cambria Math"/>
+          </w:rPr>
+          <m:t xml:space="preserve">&gt;</m:t>
+        </m:r>
+        <m:r>
+          <w:rPr>
+            <w:rFonts w:ascii="Cambria Math" w:hAnsi="Cambria Math"/>
+          </w:rPr>
+          <m:t xml:space="preserve">0</m:t>
+        </m:r>
+      </m:oMath>
+      <w:r>
+        <w:rPr/>
+        <w:t xml:space="preserve"> не обнаружено. В точке </w:t>
+      </w:r>
+      <w:r>
+        <w:rPr/>
+      </w:r>
+      <m:oMath xmlns:m="http://schemas.openxmlformats.org/officeDocument/2006/math">
+        <m:r>
+          <w:rPr>
+            <w:rFonts w:ascii="Cambria Math" w:hAnsi="Cambria Math"/>
+          </w:rPr>
+          <m:t xml:space="preserve">x</m:t>
+        </m:r>
+        <m:r>
+          <w:rPr>
+            <w:rFonts w:ascii="Cambria Math" w:hAnsi="Cambria Math"/>
+          </w:rPr>
+          <m:t xml:space="preserve">=</m:t>
+        </m:r>
+        <m:r>
+          <w:rPr>
+            <w:rFonts w:ascii="Cambria Math" w:hAnsi="Cambria Math"/>
+          </w:rPr>
+          <m:t xml:space="preserve">1</m:t>
+        </m:r>
+      </m:oMath>
+      <w:r>
+        <w:rPr/>
+        <w:t xml:space="preserve"> функция не определена, что связано с наличием логарифмических выражений в формуле. Таким образом, функция имеет периодическое поведение при </w:t>
+      </w:r>
+      <w:r>
+        <w:rPr/>
+      </w:r>
+      <m:oMath xmlns:m="http://schemas.openxmlformats.org/officeDocument/2006/math">
+        <m:r>
+          <w:rPr>
+            <w:rFonts w:ascii="Cambria Math" w:hAnsi="Cambria Math"/>
+          </w:rPr>
+          <m:t xml:space="preserve">x</m:t>
+        </m:r>
+        <m:r>
+          <w:rPr>
+            <w:rFonts w:ascii="Cambria Math" w:hAnsi="Cambria Math"/>
+          </w:rPr>
+          <m:t xml:space="preserve">≤</m:t>
+        </m:r>
+        <m:r>
+          <w:rPr>
+            <w:rFonts w:ascii="Cambria Math" w:hAnsi="Cambria Math"/>
+          </w:rPr>
+          <m:t xml:space="preserve">0</m:t>
+        </m:r>
+      </m:oMath>
+      <w:r>
+        <w:rPr/>
+        <w:t xml:space="preserve">, а также точки разрыва при </w:t>
+      </w:r>
+      <w:r>
+        <w:rPr/>
+      </w:r>
+      <m:oMath xmlns:m="http://schemas.openxmlformats.org/officeDocument/2006/math">
+        <m:r>
+          <w:rPr>
+            <w:rFonts w:ascii="Cambria Math" w:hAnsi="Cambria Math"/>
+          </w:rPr>
+          <m:t xml:space="preserve">x</m:t>
+        </m:r>
+        <m:r>
+          <w:rPr>
+            <w:rFonts w:ascii="Cambria Math" w:hAnsi="Cambria Math"/>
+          </w:rPr>
+          <m:t xml:space="preserve">=</m:t>
+        </m:r>
+        <m:r>
+          <w:rPr>
+            <w:rFonts w:ascii="Cambria Math" w:hAnsi="Cambria Math"/>
+          </w:rPr>
+          <m:t xml:space="preserve">0</m:t>
+        </m:r>
+      </m:oMath>
+      <w:r>
+        <w:rPr/>
+        <w:t xml:space="preserve"> </w:t>
+      </w:r>
+      <w:r>
+        <w:rPr/>
+        <w:t xml:space="preserve">и </w:t>
+      </w:r>
+      <w:r>
+        <w:rPr/>
+      </w:r>
+      <m:oMath xmlns:m="http://schemas.openxmlformats.org/officeDocument/2006/math">
+        <m:r>
+          <w:rPr>
+            <w:rFonts w:ascii="Cambria Math" w:hAnsi="Cambria Math"/>
+          </w:rPr>
+          <m:t xml:space="preserve">x</m:t>
+        </m:r>
+        <m:r>
+          <w:rPr>
+            <w:rFonts w:ascii="Cambria Math" w:hAnsi="Cambria Math"/>
+          </w:rPr>
+          <m:t xml:space="preserve">=</m:t>
+        </m:r>
+        <m:r>
+          <w:rPr>
+            <w:rFonts w:ascii="Cambria Math" w:hAnsi="Cambria Math"/>
+          </w:rPr>
+          <m:t xml:space="preserve">1</m:t>
+        </m:r>
+      </m:oMath>
+      <w:r>
+        <w:rPr/>
+        <w:t>.</w:t>
+      </w:r>
+    </w:p>
+    <w:p>
+      <w:pPr>
+        <w:pStyle w:val="Normal"/>
+        <w:bidi w:val="0"/>
+        <w:spacing w:lineRule="auto" w:line="360" w:beforeAutospacing="0" w:before="0" w:afterAutospacing="0" w:after="160"/>
+        <w:ind w:firstLine="709" w:left="0" w:right="0"/>
+        <w:jc w:val="both"/>
+        <w:rPr>
+          <w:rFonts w:ascii="Times New Roman" w:hAnsi="Times New Roman"/>
+          <w:lang w:val="en-US"/>
+        </w:rPr>
+      </w:pPr>
+      <w:r>
+        <w:rPr/>
+      </w:r>
+      <w:r>
+        <w:br w:type="page"/>
+      </w:r>
+    </w:p>
+    <w:p>
+      <w:pPr>
+        <w:pStyle w:val="Heading1"/>
+        <w:spacing w:lineRule="auto" w:line="360" w:before="0" w:after="0"/>
+        <w:ind w:left="709"/>
+        <w:jc w:val="center"/>
+        <w:rPr>
+          <w:lang w:val="ru-RU"/>
+        </w:rPr>
+      </w:pPr>
+      <w:bookmarkStart w:id="3" w:name="__RefHeading___Toc524_1614521587_Копия_1"/>
+      <w:bookmarkEnd w:id="3"/>
       <w:r>
         <w:rPr>
           <w:rFonts w:eastAsia="Times New Roman" w:cs="Times New Roman"/>
@@ -1170,7 +1871,7 @@
           <w:color w:val="auto"/>
           <w:lang w:val="ru-RU"/>
         </w:rPr>
-        <w:t>диаграмма</w:t>
+        <w:t>Графики</w:t>
       </w:r>
     </w:p>
     <w:p>
@@ -1182,19 +1883,214 @@
         <w:jc w:val="both"/>
         <w:rPr>
           <w:rFonts w:ascii="Times New Roman" w:hAnsi="Times New Roman"/>
-        </w:rPr>
-      </w:pPr>
-      <w:r>
-        <w:rPr>
-          <w:rFonts w:eastAsia="Times New Roman" w:cs="Times New Roman"/>
-          <w:sz w:val="28"/>
-          <w:szCs w:val="28"/>
-          <w:lang w:val="ru-RU"/>
-        </w:rPr>
-        <w:t>В ходе работы.</w:t>
+          <w:lang w:val="en-US"/>
+        </w:rPr>
+      </w:pPr>
+      <w:r>
+        <w:rPr/>
       </w:r>
       <w:r>
         <w:br w:type="page"/>
+      </w:r>
+      <w:r>
+        <mc:AlternateContent>
+          <mc:Choice Requires="wps">
+            <w:drawing>
+              <wp:anchor behindDoc="0" distT="0" distB="0" distL="0" distR="0" simplePos="0" locked="0" layoutInCell="0" allowOverlap="1" relativeHeight="40">
+                <wp:simplePos x="0" y="0"/>
+                <wp:positionH relativeFrom="column">
+                  <wp:align>center</wp:align>
+                </wp:positionH>
+                <wp:positionV relativeFrom="paragraph">
+                  <wp:posOffset>635</wp:posOffset>
+                </wp:positionV>
+                <wp:extent cx="5940425" cy="3697605"/>
+                <wp:effectExtent l="0" t="0" r="0" b="0"/>
+                <wp:wrapSquare wrapText="largest"/>
+                <wp:docPr id="5" name="Врезка4"/>
+                <a:graphic xmlns:a="http://schemas.openxmlformats.org/drawingml/2006/main">
+                  <a:graphicData uri="http://schemas.microsoft.com/office/word/2010/wordprocessingShape">
+                    <wps:wsp>
+                      <wps:cNvSpPr txBox="1"/>
+                      <wps:spPr>
+                        <a:xfrm>
+                          <a:off x="0" y="0"/>
+                          <a:ext cx="5940425" cy="3697605"/>
+                        </a:xfrm>
+                        <a:prstGeom prst="rect"/>
+                        <a:solidFill>
+                          <a:srgbClr val="FFFFFF"/>
+                        </a:solidFill>
+                      </wps:spPr>
+                      <wps:txbx>
+                        <w:txbxContent>
+                          <w:p>
+                            <w:pPr>
+                              <w:pStyle w:val="Style23"/>
+                              <w:spacing w:before="120" w:after="120"/>
+                              <w:rPr/>
+                            </w:pPr>
+                            <w:r>
+                              <w:rPr/>
+                              <w:drawing>
+                                <wp:inline distT="0" distB="0" distL="0" distR="0">
+                                  <wp:extent cx="5940425" cy="3324860"/>
+                                  <wp:effectExtent l="0" t="0" r="0" b="0"/>
+                                  <wp:docPr id="6" name="Изображение2" descr=""/>
+                                  <wp:cNvGraphicFramePr>
+                                    <a:graphicFrameLocks xmlns:a="http://schemas.openxmlformats.org/drawingml/2006/main" noChangeAspect="1"/>
+                                  </wp:cNvGraphicFramePr>
+                                  <a:graphic xmlns:a="http://schemas.openxmlformats.org/drawingml/2006/main">
+                                    <a:graphicData uri="http://schemas.openxmlformats.org/drawingml/2006/picture">
+                                      <pic:pic xmlns:pic="http://schemas.openxmlformats.org/drawingml/2006/picture">
+                                        <pic:nvPicPr>
+                                          <pic:cNvPr id="6" name="Изображение2" descr=""/>
+                                          <pic:cNvPicPr>
+                                            <a:picLocks noChangeAspect="1" noChangeArrowheads="1"/>
+                                          </pic:cNvPicPr>
+                                        </pic:nvPicPr>
+                                        <pic:blipFill>
+                                          <a:blip r:embed="rId4"/>
+                                          <a:stretch>
+                                            <a:fillRect/>
+                                          </a:stretch>
+                                        </pic:blipFill>
+                                        <pic:spPr bwMode="auto">
+                                          <a:xfrm>
+                                            <a:off x="0" y="0"/>
+                                            <a:ext cx="5940425" cy="3324860"/>
+                                          </a:xfrm>
+                                          <a:prstGeom prst="rect">
+                                            <a:avLst/>
+                                          </a:prstGeom>
+                                        </pic:spPr>
+                                      </pic:pic>
+                                    </a:graphicData>
+                                  </a:graphic>
+                                </wp:inline>
+                              </w:drawing>
+                              <w:t xml:space="preserve">График </w:t>
+                            </w:r>
+                            <w:r>
+                              <w:rPr/>
+                              <w:fldChar w:fldCharType="begin"/>
+                            </w:r>
+                            <w:r>
+                              <w:rPr/>
+                              <w:instrText xml:space="preserve"> SEQ График \* ARABIC </w:instrText>
+                            </w:r>
+                            <w:r>
+                              <w:rPr/>
+                              <w:fldChar w:fldCharType="separate"/>
+                            </w:r>
+                            <w:r>
+                              <w:rPr/>
+                              <w:t>1</w:t>
+                            </w:r>
+                            <w:r>
+                              <w:rPr/>
+                              <w:fldChar w:fldCharType="end"/>
+                            </w:r>
+                            <w:r>
+                              <w:rPr/>
+                              <w:t>: Искомая функция</w:t>
+                            </w:r>
+                          </w:p>
+                        </w:txbxContent>
+                      </wps:txbx>
+                      <wps:bodyPr anchor="t" lIns="0" tIns="0" rIns="0" bIns="0">
+                        <a:noAutofit/>
+                      </wps:bodyPr>
+                    </wps:wsp>
+                  </a:graphicData>
+                </a:graphic>
+              </wp:anchor>
+            </w:drawing>
+          </mc:Choice>
+          <mc:Fallback>
+            <w:pict>
+              <v:rect style="position:absolute;rotation:-0;width:467.75pt;height:291.15pt;mso-wrap-distance-left:0pt;mso-wrap-distance-right:0pt;mso-wrap-distance-top:0pt;mso-wrap-distance-bottom:0pt;margin-top:0pt;mso-position-vertical:top;mso-position-vertical-relative:text;margin-left:0pt;mso-position-horizontal:center;mso-position-horizontal-relative:text">
+                <v:textbox inset="0in,0in,0in,0in">
+                  <w:txbxContent>
+                    <w:p>
+                      <w:pPr>
+                        <w:pStyle w:val="Style23"/>
+                        <w:spacing w:before="120" w:after="120"/>
+                        <w:rPr/>
+                      </w:pPr>
+                      <w:r>
+                        <w:rPr/>
+                        <w:drawing>
+                          <wp:inline distT="0" distB="0" distL="0" distR="0">
+                            <wp:extent cx="5940425" cy="3324860"/>
+                            <wp:effectExtent l="0" t="0" r="0" b="0"/>
+                            <wp:docPr id="7" name="Изображение2" descr=""/>
+                            <wp:cNvGraphicFramePr>
+                              <a:graphicFrameLocks xmlns:a="http://schemas.openxmlformats.org/drawingml/2006/main" noChangeAspect="1"/>
+                            </wp:cNvGraphicFramePr>
+                            <a:graphic xmlns:a="http://schemas.openxmlformats.org/drawingml/2006/main">
+                              <a:graphicData uri="http://schemas.openxmlformats.org/drawingml/2006/picture">
+                                <pic:pic xmlns:pic="http://schemas.openxmlformats.org/drawingml/2006/picture">
+                                  <pic:nvPicPr>
+                                    <pic:cNvPr id="7" name="Изображение2" descr=""/>
+                                    <pic:cNvPicPr>
+                                      <a:picLocks noChangeAspect="1" noChangeArrowheads="1"/>
+                                    </pic:cNvPicPr>
+                                  </pic:nvPicPr>
+                                  <pic:blipFill>
+                                    <a:blip r:embed="rId5"/>
+                                    <a:stretch>
+                                      <a:fillRect/>
+                                    </a:stretch>
+                                  </pic:blipFill>
+                                  <pic:spPr bwMode="auto">
+                                    <a:xfrm>
+                                      <a:off x="0" y="0"/>
+                                      <a:ext cx="5940425" cy="3324860"/>
+                                    </a:xfrm>
+                                    <a:prstGeom prst="rect">
+                                      <a:avLst/>
+                                    </a:prstGeom>
+                                  </pic:spPr>
+                                </pic:pic>
+                              </a:graphicData>
+                            </a:graphic>
+                          </wp:inline>
+                        </w:drawing>
+                        <w:t xml:space="preserve">График </w:t>
+                      </w:r>
+                      <w:r>
+                        <w:rPr/>
+                        <w:fldChar w:fldCharType="begin"/>
+                      </w:r>
+                      <w:r>
+                        <w:rPr/>
+                        <w:instrText xml:space="preserve"> SEQ График \* ARABIC </w:instrText>
+                      </w:r>
+                      <w:r>
+                        <w:rPr/>
+                        <w:fldChar w:fldCharType="separate"/>
+                      </w:r>
+                      <w:r>
+                        <w:rPr/>
+                        <w:t>1</w:t>
+                      </w:r>
+                      <w:r>
+                        <w:rPr/>
+                        <w:fldChar w:fldCharType="end"/>
+                      </w:r>
+                      <w:r>
+                        <w:rPr/>
+                        <w:t>: Искомая функция</w:t>
+                      </w:r>
+                    </w:p>
+                  </w:txbxContent>
+                </v:textbox>
+                <w10:wrap type="square" side="largest"/>
+              </v:rect>
+            </w:pict>
+          </mc:Fallback>
+        </mc:AlternateContent>
       </w:r>
     </w:p>
     <w:p>
@@ -1204,20 +2100,1766 @@
         <w:ind w:left="709"/>
         <w:jc w:val="center"/>
         <w:rPr>
-          <w:lang w:val="ru-RU"/>
-        </w:rPr>
-      </w:pPr>
-      <w:bookmarkStart w:id="3" w:name="__RefHeading___Toc524_1614521587_Копия_1"/>
-      <w:bookmarkEnd w:id="3"/>
+          <w:rFonts w:ascii="Times New Roman" w:hAnsi="Times New Roman"/>
+        </w:rPr>
+      </w:pPr>
+      <w:r>
+        <w:rPr/>
+      </w:r>
+      <w:r>
+        <w:br w:type="page"/>
+      </w:r>
+      <w:r>
+        <mc:AlternateContent>
+          <mc:Choice Requires="wps">
+            <w:drawing>
+              <wp:anchor behindDoc="0" distT="0" distB="0" distL="0" distR="0" simplePos="0" locked="0" layoutInCell="0" allowOverlap="1" relativeHeight="30">
+                <wp:simplePos x="0" y="0"/>
+                <wp:positionH relativeFrom="column">
+                  <wp:align>center</wp:align>
+                </wp:positionH>
+                <wp:positionV relativeFrom="paragraph">
+                  <wp:posOffset>635</wp:posOffset>
+                </wp:positionV>
+                <wp:extent cx="5490210" cy="3409950"/>
+                <wp:effectExtent l="0" t="0" r="0" b="0"/>
+                <wp:wrapSquare wrapText="largest"/>
+                <wp:docPr id="8" name="Врезка6"/>
+                <a:graphic xmlns:a="http://schemas.openxmlformats.org/drawingml/2006/main">
+                  <a:graphicData uri="http://schemas.microsoft.com/office/word/2010/wordprocessingShape">
+                    <wps:wsp>
+                      <wps:cNvSpPr txBox="1"/>
+                      <wps:spPr>
+                        <a:xfrm>
+                          <a:off x="0" y="0"/>
+                          <a:ext cx="5490210" cy="3409950"/>
+                        </a:xfrm>
+                        <a:prstGeom prst="rect"/>
+                        <a:solidFill>
+                          <a:srgbClr val="FFFFFF"/>
+                        </a:solidFill>
+                      </wps:spPr>
+                      <wps:txbx>
+                        <w:txbxContent>
+                          <w:p>
+                            <w:pPr>
+                              <w:pStyle w:val="Style23"/>
+                              <w:spacing w:before="120" w:after="120"/>
+                              <w:rPr/>
+                            </w:pPr>
+                            <w:r>
+                              <w:rPr/>
+                              <w:drawing>
+                                <wp:inline distT="0" distB="0" distL="0" distR="0">
+                                  <wp:extent cx="5490210" cy="3037205"/>
+                                  <wp:effectExtent l="0" t="0" r="0" b="0"/>
+                                  <wp:docPr id="9" name="Изображение4" descr=""/>
+                                  <wp:cNvGraphicFramePr>
+                                    <a:graphicFrameLocks xmlns:a="http://schemas.openxmlformats.org/drawingml/2006/main" noChangeAspect="1"/>
+                                  </wp:cNvGraphicFramePr>
+                                  <a:graphic xmlns:a="http://schemas.openxmlformats.org/drawingml/2006/main">
+                                    <a:graphicData uri="http://schemas.openxmlformats.org/drawingml/2006/picture">
+                                      <pic:pic xmlns:pic="http://schemas.openxmlformats.org/drawingml/2006/picture">
+                                        <pic:nvPicPr>
+                                          <pic:cNvPr id="9" name="Изображение4" descr=""/>
+                                          <pic:cNvPicPr>
+                                            <a:picLocks noChangeAspect="1" noChangeArrowheads="1"/>
+                                          </pic:cNvPicPr>
+                                        </pic:nvPicPr>
+                                        <pic:blipFill>
+                                          <a:blip r:embed="rId6"/>
+                                          <a:stretch>
+                                            <a:fillRect/>
+                                          </a:stretch>
+                                        </pic:blipFill>
+                                        <pic:spPr bwMode="auto">
+                                          <a:xfrm>
+                                            <a:off x="0" y="0"/>
+                                            <a:ext cx="5490210" cy="3037205"/>
+                                          </a:xfrm>
+                                          <a:prstGeom prst="rect">
+                                            <a:avLst/>
+                                          </a:prstGeom>
+                                        </pic:spPr>
+                                      </pic:pic>
+                                    </a:graphicData>
+                                  </a:graphic>
+                                </wp:inline>
+                              </w:drawing>
+                              <w:t xml:space="preserve">График </w:t>
+                            </w:r>
+                            <w:r>
+                              <w:rPr/>
+                              <w:fldChar w:fldCharType="begin"/>
+                            </w:r>
+                            <w:r>
+                              <w:rPr/>
+                              <w:instrText xml:space="preserve"> SEQ График \* ARABIC </w:instrText>
+                            </w:r>
+                            <w:r>
+                              <w:rPr/>
+                              <w:fldChar w:fldCharType="separate"/>
+                            </w:r>
+                            <w:r>
+                              <w:rPr/>
+                              <w:t>2</w:t>
+                            </w:r>
+                            <w:r>
+                              <w:rPr/>
+                              <w:fldChar w:fldCharType="end"/>
+                            </w:r>
+                            <w:r>
+                              <w:rPr/>
+                              <w:t>: Tan</w:t>
+                            </w:r>
+                          </w:p>
+                        </w:txbxContent>
+                      </wps:txbx>
+                      <wps:bodyPr anchor="t" lIns="0" tIns="0" rIns="0" bIns="0">
+                        <a:noAutofit/>
+                      </wps:bodyPr>
+                    </wps:wsp>
+                  </a:graphicData>
+                </a:graphic>
+              </wp:anchor>
+            </w:drawing>
+          </mc:Choice>
+          <mc:Fallback>
+            <w:pict>
+              <v:rect style="position:absolute;rotation:-0;width:432.3pt;height:268.5pt;mso-wrap-distance-left:0pt;mso-wrap-distance-right:0pt;mso-wrap-distance-top:0pt;mso-wrap-distance-bottom:0pt;margin-top:0pt;mso-position-vertical:top;mso-position-vertical-relative:text;margin-left:17.7pt;mso-position-horizontal:center;mso-position-horizontal-relative:text">
+                <v:textbox inset="0in,0in,0in,0in">
+                  <w:txbxContent>
+                    <w:p>
+                      <w:pPr>
+                        <w:pStyle w:val="Style23"/>
+                        <w:spacing w:before="120" w:after="120"/>
+                        <w:rPr/>
+                      </w:pPr>
+                      <w:r>
+                        <w:rPr/>
+                        <w:drawing>
+                          <wp:inline distT="0" distB="0" distL="0" distR="0">
+                            <wp:extent cx="5490210" cy="3037205"/>
+                            <wp:effectExtent l="0" t="0" r="0" b="0"/>
+                            <wp:docPr id="10" name="Изображение4" descr=""/>
+                            <wp:cNvGraphicFramePr>
+                              <a:graphicFrameLocks xmlns:a="http://schemas.openxmlformats.org/drawingml/2006/main" noChangeAspect="1"/>
+                            </wp:cNvGraphicFramePr>
+                            <a:graphic xmlns:a="http://schemas.openxmlformats.org/drawingml/2006/main">
+                              <a:graphicData uri="http://schemas.openxmlformats.org/drawingml/2006/picture">
+                                <pic:pic xmlns:pic="http://schemas.openxmlformats.org/drawingml/2006/picture">
+                                  <pic:nvPicPr>
+                                    <pic:cNvPr id="10" name="Изображение4" descr=""/>
+                                    <pic:cNvPicPr>
+                                      <a:picLocks noChangeAspect="1" noChangeArrowheads="1"/>
+                                    </pic:cNvPicPr>
+                                  </pic:nvPicPr>
+                                  <pic:blipFill>
+                                    <a:blip r:embed="rId7"/>
+                                    <a:stretch>
+                                      <a:fillRect/>
+                                    </a:stretch>
+                                  </pic:blipFill>
+                                  <pic:spPr bwMode="auto">
+                                    <a:xfrm>
+                                      <a:off x="0" y="0"/>
+                                      <a:ext cx="5490210" cy="3037205"/>
+                                    </a:xfrm>
+                                    <a:prstGeom prst="rect">
+                                      <a:avLst/>
+                                    </a:prstGeom>
+                                  </pic:spPr>
+                                </pic:pic>
+                              </a:graphicData>
+                            </a:graphic>
+                          </wp:inline>
+                        </w:drawing>
+                        <w:t xml:space="preserve">График </w:t>
+                      </w:r>
+                      <w:r>
+                        <w:rPr/>
+                        <w:fldChar w:fldCharType="begin"/>
+                      </w:r>
+                      <w:r>
+                        <w:rPr/>
+                        <w:instrText xml:space="preserve"> SEQ График \* ARABIC </w:instrText>
+                      </w:r>
+                      <w:r>
+                        <w:rPr/>
+                        <w:fldChar w:fldCharType="separate"/>
+                      </w:r>
+                      <w:r>
+                        <w:rPr/>
+                        <w:t>2</w:t>
+                      </w:r>
+                      <w:r>
+                        <w:rPr/>
+                        <w:fldChar w:fldCharType="end"/>
+                      </w:r>
+                      <w:r>
+                        <w:rPr/>
+                        <w:t>: Tan</w:t>
+                      </w:r>
+                    </w:p>
+                  </w:txbxContent>
+                </v:textbox>
+                <w10:wrap type="square" side="largest"/>
+              </v:rect>
+            </w:pict>
+          </mc:Fallback>
+        </mc:AlternateContent>
+      </w:r>
+    </w:p>
+    <w:p>
+      <w:pPr>
+        <w:pStyle w:val="Heading1"/>
+        <w:spacing w:lineRule="auto" w:line="360" w:before="0" w:after="0"/>
+        <w:ind w:left="709"/>
+        <w:jc w:val="center"/>
+        <w:rPr>
+          <w:rFonts w:ascii="Times New Roman" w:hAnsi="Times New Roman"/>
+        </w:rPr>
+      </w:pPr>
+      <w:r>
+        <w:rPr/>
+      </w:r>
+      <w:r>
+        <w:br w:type="page"/>
+      </w:r>
+      <w:r>
+        <mc:AlternateContent>
+          <mc:Choice Requires="wps">
+            <w:drawing>
+              <wp:anchor behindDoc="0" distT="0" distB="0" distL="0" distR="0" simplePos="0" locked="0" layoutInCell="0" allowOverlap="1" relativeHeight="28">
+                <wp:simplePos x="0" y="0"/>
+                <wp:positionH relativeFrom="column">
+                  <wp:align>center</wp:align>
+                </wp:positionH>
+                <wp:positionV relativeFrom="paragraph">
+                  <wp:posOffset>635</wp:posOffset>
+                </wp:positionV>
+                <wp:extent cx="5490210" cy="3402330"/>
+                <wp:effectExtent l="0" t="0" r="0" b="0"/>
+                <wp:wrapSquare wrapText="largest"/>
+                <wp:docPr id="11" name="Врезка7"/>
+                <a:graphic xmlns:a="http://schemas.openxmlformats.org/drawingml/2006/main">
+                  <a:graphicData uri="http://schemas.microsoft.com/office/word/2010/wordprocessingShape">
+                    <wps:wsp>
+                      <wps:cNvSpPr txBox="1"/>
+                      <wps:spPr>
+                        <a:xfrm>
+                          <a:off x="0" y="0"/>
+                          <a:ext cx="5490210" cy="3402330"/>
+                        </a:xfrm>
+                        <a:prstGeom prst="rect"/>
+                        <a:solidFill>
+                          <a:srgbClr val="FFFFFF"/>
+                        </a:solidFill>
+                      </wps:spPr>
+                      <wps:txbx>
+                        <w:txbxContent>
+                          <w:p>
+                            <w:pPr>
+                              <w:pStyle w:val="Style23"/>
+                              <w:spacing w:before="120" w:after="120"/>
+                              <w:rPr/>
+                            </w:pPr>
+                            <w:r>
+                              <w:rPr/>
+                              <w:drawing>
+                                <wp:inline distT="0" distB="0" distL="0" distR="0">
+                                  <wp:extent cx="5490210" cy="3029585"/>
+                                  <wp:effectExtent l="0" t="0" r="0" b="0"/>
+                                  <wp:docPr id="12" name="Изображение5" descr=""/>
+                                  <wp:cNvGraphicFramePr>
+                                    <a:graphicFrameLocks xmlns:a="http://schemas.openxmlformats.org/drawingml/2006/main" noChangeAspect="1"/>
+                                  </wp:cNvGraphicFramePr>
+                                  <a:graphic xmlns:a="http://schemas.openxmlformats.org/drawingml/2006/main">
+                                    <a:graphicData uri="http://schemas.openxmlformats.org/drawingml/2006/picture">
+                                      <pic:pic xmlns:pic="http://schemas.openxmlformats.org/drawingml/2006/picture">
+                                        <pic:nvPicPr>
+                                          <pic:cNvPr id="12" name="Изображение5" descr=""/>
+                                          <pic:cNvPicPr>
+                                            <a:picLocks noChangeAspect="1" noChangeArrowheads="1"/>
+                                          </pic:cNvPicPr>
+                                        </pic:nvPicPr>
+                                        <pic:blipFill>
+                                          <a:blip r:embed="rId8"/>
+                                          <a:stretch>
+                                            <a:fillRect/>
+                                          </a:stretch>
+                                        </pic:blipFill>
+                                        <pic:spPr bwMode="auto">
+                                          <a:xfrm>
+                                            <a:off x="0" y="0"/>
+                                            <a:ext cx="5490210" cy="3029585"/>
+                                          </a:xfrm>
+                                          <a:prstGeom prst="rect">
+                                            <a:avLst/>
+                                          </a:prstGeom>
+                                        </pic:spPr>
+                                      </pic:pic>
+                                    </a:graphicData>
+                                  </a:graphic>
+                                </wp:inline>
+                              </w:drawing>
+                              <w:t xml:space="preserve">График </w:t>
+                            </w:r>
+                            <w:r>
+                              <w:rPr/>
+                              <w:fldChar w:fldCharType="begin"/>
+                            </w:r>
+                            <w:r>
+                              <w:rPr/>
+                              <w:instrText xml:space="preserve"> SEQ График \* ARABIC </w:instrText>
+                            </w:r>
+                            <w:r>
+                              <w:rPr/>
+                              <w:fldChar w:fldCharType="separate"/>
+                            </w:r>
+                            <w:r>
+                              <w:rPr/>
+                              <w:t>3</w:t>
+                            </w:r>
+                            <w:r>
+                              <w:rPr/>
+                              <w:fldChar w:fldCharType="end"/>
+                            </w:r>
+                            <w:r>
+                              <w:rPr/>
+                              <w:t>: Cot</w:t>
+                            </w:r>
+                          </w:p>
+                        </w:txbxContent>
+                      </wps:txbx>
+                      <wps:bodyPr anchor="t" lIns="0" tIns="0" rIns="0" bIns="0">
+                        <a:noAutofit/>
+                      </wps:bodyPr>
+                    </wps:wsp>
+                  </a:graphicData>
+                </a:graphic>
+              </wp:anchor>
+            </w:drawing>
+          </mc:Choice>
+          <mc:Fallback>
+            <w:pict>
+              <v:rect style="position:absolute;rotation:-0;width:432.3pt;height:267.9pt;mso-wrap-distance-left:0pt;mso-wrap-distance-right:0pt;mso-wrap-distance-top:0pt;mso-wrap-distance-bottom:0pt;margin-top:0pt;mso-position-vertical:top;mso-position-vertical-relative:text;margin-left:17.7pt;mso-position-horizontal:center;mso-position-horizontal-relative:text">
+                <v:textbox inset="0in,0in,0in,0in">
+                  <w:txbxContent>
+                    <w:p>
+                      <w:pPr>
+                        <w:pStyle w:val="Style23"/>
+                        <w:spacing w:before="120" w:after="120"/>
+                        <w:rPr/>
+                      </w:pPr>
+                      <w:r>
+                        <w:rPr/>
+                        <w:drawing>
+                          <wp:inline distT="0" distB="0" distL="0" distR="0">
+                            <wp:extent cx="5490210" cy="3029585"/>
+                            <wp:effectExtent l="0" t="0" r="0" b="0"/>
+                            <wp:docPr id="13" name="Изображение5" descr=""/>
+                            <wp:cNvGraphicFramePr>
+                              <a:graphicFrameLocks xmlns:a="http://schemas.openxmlformats.org/drawingml/2006/main" noChangeAspect="1"/>
+                            </wp:cNvGraphicFramePr>
+                            <a:graphic xmlns:a="http://schemas.openxmlformats.org/drawingml/2006/main">
+                              <a:graphicData uri="http://schemas.openxmlformats.org/drawingml/2006/picture">
+                                <pic:pic xmlns:pic="http://schemas.openxmlformats.org/drawingml/2006/picture">
+                                  <pic:nvPicPr>
+                                    <pic:cNvPr id="13" name="Изображение5" descr=""/>
+                                    <pic:cNvPicPr>
+                                      <a:picLocks noChangeAspect="1" noChangeArrowheads="1"/>
+                                    </pic:cNvPicPr>
+                                  </pic:nvPicPr>
+                                  <pic:blipFill>
+                                    <a:blip r:embed="rId9"/>
+                                    <a:stretch>
+                                      <a:fillRect/>
+                                    </a:stretch>
+                                  </pic:blipFill>
+                                  <pic:spPr bwMode="auto">
+                                    <a:xfrm>
+                                      <a:off x="0" y="0"/>
+                                      <a:ext cx="5490210" cy="3029585"/>
+                                    </a:xfrm>
+                                    <a:prstGeom prst="rect">
+                                      <a:avLst/>
+                                    </a:prstGeom>
+                                  </pic:spPr>
+                                </pic:pic>
+                              </a:graphicData>
+                            </a:graphic>
+                          </wp:inline>
+                        </w:drawing>
+                        <w:t xml:space="preserve">График </w:t>
+                      </w:r>
+                      <w:r>
+                        <w:rPr/>
+                        <w:fldChar w:fldCharType="begin"/>
+                      </w:r>
+                      <w:r>
+                        <w:rPr/>
+                        <w:instrText xml:space="preserve"> SEQ График \* ARABIC </w:instrText>
+                      </w:r>
+                      <w:r>
+                        <w:rPr/>
+                        <w:fldChar w:fldCharType="separate"/>
+                      </w:r>
+                      <w:r>
+                        <w:rPr/>
+                        <w:t>3</w:t>
+                      </w:r>
+                      <w:r>
+                        <w:rPr/>
+                        <w:fldChar w:fldCharType="end"/>
+                      </w:r>
+                      <w:r>
+                        <w:rPr/>
+                        <w:t>: Cot</w:t>
+                      </w:r>
+                    </w:p>
+                  </w:txbxContent>
+                </v:textbox>
+                <w10:wrap type="square" side="largest"/>
+              </v:rect>
+            </w:pict>
+          </mc:Fallback>
+        </mc:AlternateContent>
+      </w:r>
+    </w:p>
+    <w:p>
+      <w:pPr>
+        <w:pStyle w:val="Heading1"/>
+        <w:spacing w:lineRule="auto" w:line="360" w:before="0" w:after="0"/>
+        <w:ind w:left="709"/>
+        <w:jc w:val="center"/>
+        <w:rPr>
+          <w:rFonts w:ascii="Times New Roman" w:hAnsi="Times New Roman"/>
+        </w:rPr>
+      </w:pPr>
+      <w:r>
+        <w:rPr/>
+      </w:r>
+      <w:r>
+        <w:br w:type="page"/>
+      </w:r>
+      <w:r>
+        <mc:AlternateContent>
+          <mc:Choice Requires="wps">
+            <w:drawing>
+              <wp:anchor behindDoc="0" distT="0" distB="0" distL="0" distR="0" simplePos="0" locked="0" layoutInCell="0" allowOverlap="1" relativeHeight="26">
+                <wp:simplePos x="0" y="0"/>
+                <wp:positionH relativeFrom="column">
+                  <wp:align>center</wp:align>
+                </wp:positionH>
+                <wp:positionV relativeFrom="paragraph">
+                  <wp:posOffset>635</wp:posOffset>
+                </wp:positionV>
+                <wp:extent cx="5490210" cy="3343910"/>
+                <wp:effectExtent l="0" t="0" r="0" b="0"/>
+                <wp:wrapSquare wrapText="largest"/>
+                <wp:docPr id="14" name="Врезка8"/>
+                <a:graphic xmlns:a="http://schemas.openxmlformats.org/drawingml/2006/main">
+                  <a:graphicData uri="http://schemas.microsoft.com/office/word/2010/wordprocessingShape">
+                    <wps:wsp>
+                      <wps:cNvSpPr txBox="1"/>
+                      <wps:spPr>
+                        <a:xfrm>
+                          <a:off x="0" y="0"/>
+                          <a:ext cx="5490210" cy="3343910"/>
+                        </a:xfrm>
+                        <a:prstGeom prst="rect"/>
+                        <a:solidFill>
+                          <a:srgbClr val="FFFFFF"/>
+                        </a:solidFill>
+                      </wps:spPr>
+                      <wps:txbx>
+                        <w:txbxContent>
+                          <w:p>
+                            <w:pPr>
+                              <w:pStyle w:val="Style23"/>
+                              <w:spacing w:before="120" w:after="120"/>
+                              <w:rPr/>
+                            </w:pPr>
+                            <w:r>
+                              <w:rPr/>
+                              <w:drawing>
+                                <wp:inline distT="0" distB="0" distL="0" distR="0">
+                                  <wp:extent cx="5490210" cy="2971165"/>
+                                  <wp:effectExtent l="0" t="0" r="0" b="0"/>
+                                  <wp:docPr id="15" name="Изображение6" descr=""/>
+                                  <wp:cNvGraphicFramePr>
+                                    <a:graphicFrameLocks xmlns:a="http://schemas.openxmlformats.org/drawingml/2006/main" noChangeAspect="1"/>
+                                  </wp:cNvGraphicFramePr>
+                                  <a:graphic xmlns:a="http://schemas.openxmlformats.org/drawingml/2006/main">
+                                    <a:graphicData uri="http://schemas.openxmlformats.org/drawingml/2006/picture">
+                                      <pic:pic xmlns:pic="http://schemas.openxmlformats.org/drawingml/2006/picture">
+                                        <pic:nvPicPr>
+                                          <pic:cNvPr id="15" name="Изображение6" descr=""/>
+                                          <pic:cNvPicPr>
+                                            <a:picLocks noChangeAspect="1" noChangeArrowheads="1"/>
+                                          </pic:cNvPicPr>
+                                        </pic:nvPicPr>
+                                        <pic:blipFill>
+                                          <a:blip r:embed="rId10"/>
+                                          <a:stretch>
+                                            <a:fillRect/>
+                                          </a:stretch>
+                                        </pic:blipFill>
+                                        <pic:spPr bwMode="auto">
+                                          <a:xfrm>
+                                            <a:off x="0" y="0"/>
+                                            <a:ext cx="5490210" cy="2971165"/>
+                                          </a:xfrm>
+                                          <a:prstGeom prst="rect">
+                                            <a:avLst/>
+                                          </a:prstGeom>
+                                        </pic:spPr>
+                                      </pic:pic>
+                                    </a:graphicData>
+                                  </a:graphic>
+                                </wp:inline>
+                              </w:drawing>
+                              <w:t xml:space="preserve">График </w:t>
+                            </w:r>
+                            <w:r>
+                              <w:rPr/>
+                              <w:fldChar w:fldCharType="begin"/>
+                            </w:r>
+                            <w:r>
+                              <w:rPr/>
+                              <w:instrText xml:space="preserve"> SEQ График \* ARABIC </w:instrText>
+                            </w:r>
+                            <w:r>
+                              <w:rPr/>
+                              <w:fldChar w:fldCharType="separate"/>
+                            </w:r>
+                            <w:r>
+                              <w:rPr/>
+                              <w:t>4</w:t>
+                            </w:r>
+                            <w:r>
+                              <w:rPr/>
+                              <w:fldChar w:fldCharType="end"/>
+                            </w:r>
+                            <w:r>
+                              <w:rPr/>
+                              <w:t>: Sin</w:t>
+                            </w:r>
+                          </w:p>
+                        </w:txbxContent>
+                      </wps:txbx>
+                      <wps:bodyPr anchor="t" lIns="0" tIns="0" rIns="0" bIns="0">
+                        <a:noAutofit/>
+                      </wps:bodyPr>
+                    </wps:wsp>
+                  </a:graphicData>
+                </a:graphic>
+              </wp:anchor>
+            </w:drawing>
+          </mc:Choice>
+          <mc:Fallback>
+            <w:pict>
+              <v:rect style="position:absolute;rotation:-0;width:432.3pt;height:263.3pt;mso-wrap-distance-left:0pt;mso-wrap-distance-right:0pt;mso-wrap-distance-top:0pt;mso-wrap-distance-bottom:0pt;margin-top:0pt;mso-position-vertical:top;mso-position-vertical-relative:text;margin-left:17.7pt;mso-position-horizontal:center;mso-position-horizontal-relative:text">
+                <v:textbox inset="0in,0in,0in,0in">
+                  <w:txbxContent>
+                    <w:p>
+                      <w:pPr>
+                        <w:pStyle w:val="Style23"/>
+                        <w:spacing w:before="120" w:after="120"/>
+                        <w:rPr/>
+                      </w:pPr>
+                      <w:r>
+                        <w:rPr/>
+                        <w:drawing>
+                          <wp:inline distT="0" distB="0" distL="0" distR="0">
+                            <wp:extent cx="5490210" cy="2971165"/>
+                            <wp:effectExtent l="0" t="0" r="0" b="0"/>
+                            <wp:docPr id="16" name="Изображение6" descr=""/>
+                            <wp:cNvGraphicFramePr>
+                              <a:graphicFrameLocks xmlns:a="http://schemas.openxmlformats.org/drawingml/2006/main" noChangeAspect="1"/>
+                            </wp:cNvGraphicFramePr>
+                            <a:graphic xmlns:a="http://schemas.openxmlformats.org/drawingml/2006/main">
+                              <a:graphicData uri="http://schemas.openxmlformats.org/drawingml/2006/picture">
+                                <pic:pic xmlns:pic="http://schemas.openxmlformats.org/drawingml/2006/picture">
+                                  <pic:nvPicPr>
+                                    <pic:cNvPr id="16" name="Изображение6" descr=""/>
+                                    <pic:cNvPicPr>
+                                      <a:picLocks noChangeAspect="1" noChangeArrowheads="1"/>
+                                    </pic:cNvPicPr>
+                                  </pic:nvPicPr>
+                                  <pic:blipFill>
+                                    <a:blip r:embed="rId11"/>
+                                    <a:stretch>
+                                      <a:fillRect/>
+                                    </a:stretch>
+                                  </pic:blipFill>
+                                  <pic:spPr bwMode="auto">
+                                    <a:xfrm>
+                                      <a:off x="0" y="0"/>
+                                      <a:ext cx="5490210" cy="2971165"/>
+                                    </a:xfrm>
+                                    <a:prstGeom prst="rect">
+                                      <a:avLst/>
+                                    </a:prstGeom>
+                                  </pic:spPr>
+                                </pic:pic>
+                              </a:graphicData>
+                            </a:graphic>
+                          </wp:inline>
+                        </w:drawing>
+                        <w:t xml:space="preserve">График </w:t>
+                      </w:r>
+                      <w:r>
+                        <w:rPr/>
+                        <w:fldChar w:fldCharType="begin"/>
+                      </w:r>
+                      <w:r>
+                        <w:rPr/>
+                        <w:instrText xml:space="preserve"> SEQ График \* ARABIC </w:instrText>
+                      </w:r>
+                      <w:r>
+                        <w:rPr/>
+                        <w:fldChar w:fldCharType="separate"/>
+                      </w:r>
+                      <w:r>
+                        <w:rPr/>
+                        <w:t>4</w:t>
+                      </w:r>
+                      <w:r>
+                        <w:rPr/>
+                        <w:fldChar w:fldCharType="end"/>
+                      </w:r>
+                      <w:r>
+                        <w:rPr/>
+                        <w:t>: Sin</w:t>
+                      </w:r>
+                    </w:p>
+                  </w:txbxContent>
+                </v:textbox>
+                <w10:wrap type="square" side="largest"/>
+              </v:rect>
+            </w:pict>
+          </mc:Fallback>
+        </mc:AlternateContent>
+      </w:r>
+    </w:p>
+    <w:p>
+      <w:pPr>
+        <w:pStyle w:val="Heading1"/>
+        <w:spacing w:lineRule="auto" w:line="360" w:before="0" w:after="0"/>
+        <w:ind w:left="709"/>
+        <w:jc w:val="center"/>
+        <w:rPr>
+          <w:rFonts w:ascii="Times New Roman" w:hAnsi="Times New Roman"/>
+        </w:rPr>
+      </w:pPr>
+      <w:r>
+        <w:rPr/>
+      </w:r>
+      <w:r>
+        <w:br w:type="page"/>
+      </w:r>
+      <w:r>
+        <mc:AlternateContent>
+          <mc:Choice Requires="wps">
+            <w:drawing>
+              <wp:anchor behindDoc="0" distT="0" distB="0" distL="0" distR="0" simplePos="0" locked="0" layoutInCell="0" allowOverlap="1" relativeHeight="24">
+                <wp:simplePos x="0" y="0"/>
+                <wp:positionH relativeFrom="column">
+                  <wp:align>center</wp:align>
+                </wp:positionH>
+                <wp:positionV relativeFrom="paragraph">
+                  <wp:posOffset>635</wp:posOffset>
+                </wp:positionV>
+                <wp:extent cx="5490210" cy="3371215"/>
+                <wp:effectExtent l="0" t="0" r="0" b="0"/>
+                <wp:wrapSquare wrapText="largest"/>
+                <wp:docPr id="17" name="Врезка9"/>
+                <a:graphic xmlns:a="http://schemas.openxmlformats.org/drawingml/2006/main">
+                  <a:graphicData uri="http://schemas.microsoft.com/office/word/2010/wordprocessingShape">
+                    <wps:wsp>
+                      <wps:cNvSpPr txBox="1"/>
+                      <wps:spPr>
+                        <a:xfrm>
+                          <a:off x="0" y="0"/>
+                          <a:ext cx="5490210" cy="3371215"/>
+                        </a:xfrm>
+                        <a:prstGeom prst="rect"/>
+                        <a:solidFill>
+                          <a:srgbClr val="FFFFFF"/>
+                        </a:solidFill>
+                      </wps:spPr>
+                      <wps:txbx>
+                        <w:txbxContent>
+                          <w:p>
+                            <w:pPr>
+                              <w:pStyle w:val="Style23"/>
+                              <w:spacing w:before="120" w:after="120"/>
+                              <w:rPr/>
+                            </w:pPr>
+                            <w:r>
+                              <w:rPr/>
+                              <w:drawing>
+                                <wp:inline distT="0" distB="0" distL="0" distR="0">
+                                  <wp:extent cx="5490210" cy="2998470"/>
+                                  <wp:effectExtent l="0" t="0" r="0" b="0"/>
+                                  <wp:docPr id="18" name="Изображение7" descr=""/>
+                                  <wp:cNvGraphicFramePr>
+                                    <a:graphicFrameLocks xmlns:a="http://schemas.openxmlformats.org/drawingml/2006/main" noChangeAspect="1"/>
+                                  </wp:cNvGraphicFramePr>
+                                  <a:graphic xmlns:a="http://schemas.openxmlformats.org/drawingml/2006/main">
+                                    <a:graphicData uri="http://schemas.openxmlformats.org/drawingml/2006/picture">
+                                      <pic:pic xmlns:pic="http://schemas.openxmlformats.org/drawingml/2006/picture">
+                                        <pic:nvPicPr>
+                                          <pic:cNvPr id="18" name="Изображение7" descr=""/>
+                                          <pic:cNvPicPr>
+                                            <a:picLocks noChangeAspect="1" noChangeArrowheads="1"/>
+                                          </pic:cNvPicPr>
+                                        </pic:nvPicPr>
+                                        <pic:blipFill>
+                                          <a:blip r:embed="rId12"/>
+                                          <a:stretch>
+                                            <a:fillRect/>
+                                          </a:stretch>
+                                        </pic:blipFill>
+                                        <pic:spPr bwMode="auto">
+                                          <a:xfrm>
+                                            <a:off x="0" y="0"/>
+                                            <a:ext cx="5490210" cy="2998470"/>
+                                          </a:xfrm>
+                                          <a:prstGeom prst="rect">
+                                            <a:avLst/>
+                                          </a:prstGeom>
+                                        </pic:spPr>
+                                      </pic:pic>
+                                    </a:graphicData>
+                                  </a:graphic>
+                                </wp:inline>
+                              </w:drawing>
+                              <w:t xml:space="preserve">График </w:t>
+                            </w:r>
+                            <w:r>
+                              <w:rPr/>
+                              <w:fldChar w:fldCharType="begin"/>
+                            </w:r>
+                            <w:r>
+                              <w:rPr/>
+                              <w:instrText xml:space="preserve"> SEQ График \* ARABIC </w:instrText>
+                            </w:r>
+                            <w:r>
+                              <w:rPr/>
+                              <w:fldChar w:fldCharType="separate"/>
+                            </w:r>
+                            <w:r>
+                              <w:rPr/>
+                              <w:t>5</w:t>
+                            </w:r>
+                            <w:r>
+                              <w:rPr/>
+                              <w:fldChar w:fldCharType="end"/>
+                            </w:r>
+                            <w:r>
+                              <w:rPr/>
+                              <w:t>: Cos</w:t>
+                            </w:r>
+                          </w:p>
+                        </w:txbxContent>
+                      </wps:txbx>
+                      <wps:bodyPr anchor="t" lIns="0" tIns="0" rIns="0" bIns="0">
+                        <a:noAutofit/>
+                      </wps:bodyPr>
+                    </wps:wsp>
+                  </a:graphicData>
+                </a:graphic>
+              </wp:anchor>
+            </w:drawing>
+          </mc:Choice>
+          <mc:Fallback>
+            <w:pict>
+              <v:rect style="position:absolute;rotation:-0;width:432.3pt;height:265.45pt;mso-wrap-distance-left:0pt;mso-wrap-distance-right:0pt;mso-wrap-distance-top:0pt;mso-wrap-distance-bottom:0pt;margin-top:0pt;mso-position-vertical:top;mso-position-vertical-relative:text;margin-left:17.7pt;mso-position-horizontal:center;mso-position-horizontal-relative:text">
+                <v:textbox inset="0in,0in,0in,0in">
+                  <w:txbxContent>
+                    <w:p>
+                      <w:pPr>
+                        <w:pStyle w:val="Style23"/>
+                        <w:spacing w:before="120" w:after="120"/>
+                        <w:rPr/>
+                      </w:pPr>
+                      <w:r>
+                        <w:rPr/>
+                        <w:drawing>
+                          <wp:inline distT="0" distB="0" distL="0" distR="0">
+                            <wp:extent cx="5490210" cy="2998470"/>
+                            <wp:effectExtent l="0" t="0" r="0" b="0"/>
+                            <wp:docPr id="19" name="Изображение7" descr=""/>
+                            <wp:cNvGraphicFramePr>
+                              <a:graphicFrameLocks xmlns:a="http://schemas.openxmlformats.org/drawingml/2006/main" noChangeAspect="1"/>
+                            </wp:cNvGraphicFramePr>
+                            <a:graphic xmlns:a="http://schemas.openxmlformats.org/drawingml/2006/main">
+                              <a:graphicData uri="http://schemas.openxmlformats.org/drawingml/2006/picture">
+                                <pic:pic xmlns:pic="http://schemas.openxmlformats.org/drawingml/2006/picture">
+                                  <pic:nvPicPr>
+                                    <pic:cNvPr id="19" name="Изображение7" descr=""/>
+                                    <pic:cNvPicPr>
+                                      <a:picLocks noChangeAspect="1" noChangeArrowheads="1"/>
+                                    </pic:cNvPicPr>
+                                  </pic:nvPicPr>
+                                  <pic:blipFill>
+                                    <a:blip r:embed="rId13"/>
+                                    <a:stretch>
+                                      <a:fillRect/>
+                                    </a:stretch>
+                                  </pic:blipFill>
+                                  <pic:spPr bwMode="auto">
+                                    <a:xfrm>
+                                      <a:off x="0" y="0"/>
+                                      <a:ext cx="5490210" cy="2998470"/>
+                                    </a:xfrm>
+                                    <a:prstGeom prst="rect">
+                                      <a:avLst/>
+                                    </a:prstGeom>
+                                  </pic:spPr>
+                                </pic:pic>
+                              </a:graphicData>
+                            </a:graphic>
+                          </wp:inline>
+                        </w:drawing>
+                        <w:t xml:space="preserve">График </w:t>
+                      </w:r>
+                      <w:r>
+                        <w:rPr/>
+                        <w:fldChar w:fldCharType="begin"/>
+                      </w:r>
+                      <w:r>
+                        <w:rPr/>
+                        <w:instrText xml:space="preserve"> SEQ График \* ARABIC </w:instrText>
+                      </w:r>
+                      <w:r>
+                        <w:rPr/>
+                        <w:fldChar w:fldCharType="separate"/>
+                      </w:r>
+                      <w:r>
+                        <w:rPr/>
+                        <w:t>5</w:t>
+                      </w:r>
+                      <w:r>
+                        <w:rPr/>
+                        <w:fldChar w:fldCharType="end"/>
+                      </w:r>
+                      <w:r>
+                        <w:rPr/>
+                        <w:t>: Cos</w:t>
+                      </w:r>
+                    </w:p>
+                  </w:txbxContent>
+                </v:textbox>
+                <w10:wrap type="square" side="largest"/>
+              </v:rect>
+            </w:pict>
+          </mc:Fallback>
+        </mc:AlternateContent>
+      </w:r>
+    </w:p>
+    <w:p>
+      <w:pPr>
+        <w:pStyle w:val="Heading1"/>
+        <w:spacing w:lineRule="auto" w:line="360" w:before="0" w:after="0"/>
+        <w:ind w:left="709"/>
+        <w:jc w:val="center"/>
+        <w:rPr>
+          <w:rFonts w:ascii="Times New Roman" w:hAnsi="Times New Roman"/>
+        </w:rPr>
+      </w:pPr>
+      <w:r>
+        <w:rPr/>
+      </w:r>
+      <w:r>
+        <w:br w:type="page"/>
+      </w:r>
+      <w:r>
+        <mc:AlternateContent>
+          <mc:Choice Requires="wps">
+            <w:drawing>
+              <wp:anchor behindDoc="0" distT="0" distB="0" distL="0" distR="0" simplePos="0" locked="0" layoutInCell="0" allowOverlap="1" relativeHeight="32">
+                <wp:simplePos x="0" y="0"/>
+                <wp:positionH relativeFrom="column">
+                  <wp:align>center</wp:align>
+                </wp:positionH>
+                <wp:positionV relativeFrom="paragraph">
+                  <wp:posOffset>635</wp:posOffset>
+                </wp:positionV>
+                <wp:extent cx="5490210" cy="3364230"/>
+                <wp:effectExtent l="0" t="0" r="0" b="0"/>
+                <wp:wrapSquare wrapText="largest"/>
+                <wp:docPr id="20" name="Врезка10"/>
+                <a:graphic xmlns:a="http://schemas.openxmlformats.org/drawingml/2006/main">
+                  <a:graphicData uri="http://schemas.microsoft.com/office/word/2010/wordprocessingShape">
+                    <wps:wsp>
+                      <wps:cNvSpPr txBox="1"/>
+                      <wps:spPr>
+                        <a:xfrm>
+                          <a:off x="0" y="0"/>
+                          <a:ext cx="5490210" cy="3364230"/>
+                        </a:xfrm>
+                        <a:prstGeom prst="rect"/>
+                        <a:solidFill>
+                          <a:srgbClr val="FFFFFF"/>
+                        </a:solidFill>
+                      </wps:spPr>
+                      <wps:txbx>
+                        <w:txbxContent>
+                          <w:p>
+                            <w:pPr>
+                              <w:pStyle w:val="Style23"/>
+                              <w:spacing w:before="120" w:after="120"/>
+                              <w:rPr/>
+                            </w:pPr>
+                            <w:r>
+                              <w:rPr/>
+                              <w:drawing>
+                                <wp:inline distT="0" distB="0" distL="0" distR="0">
+                                  <wp:extent cx="5490210" cy="2991485"/>
+                                  <wp:effectExtent l="0" t="0" r="0" b="0"/>
+                                  <wp:docPr id="21" name="Изображение8" descr=""/>
+                                  <wp:cNvGraphicFramePr>
+                                    <a:graphicFrameLocks xmlns:a="http://schemas.openxmlformats.org/drawingml/2006/main" noChangeAspect="1"/>
+                                  </wp:cNvGraphicFramePr>
+                                  <a:graphic xmlns:a="http://schemas.openxmlformats.org/drawingml/2006/main">
+                                    <a:graphicData uri="http://schemas.openxmlformats.org/drawingml/2006/picture">
+                                      <pic:pic xmlns:pic="http://schemas.openxmlformats.org/drawingml/2006/picture">
+                                        <pic:nvPicPr>
+                                          <pic:cNvPr id="21" name="Изображение8" descr=""/>
+                                          <pic:cNvPicPr>
+                                            <a:picLocks noChangeAspect="1" noChangeArrowheads="1"/>
+                                          </pic:cNvPicPr>
+                                        </pic:nvPicPr>
+                                        <pic:blipFill>
+                                          <a:blip r:embed="rId14"/>
+                                          <a:stretch>
+                                            <a:fillRect/>
+                                          </a:stretch>
+                                        </pic:blipFill>
+                                        <pic:spPr bwMode="auto">
+                                          <a:xfrm>
+                                            <a:off x="0" y="0"/>
+                                            <a:ext cx="5490210" cy="2991485"/>
+                                          </a:xfrm>
+                                          <a:prstGeom prst="rect">
+                                            <a:avLst/>
+                                          </a:prstGeom>
+                                        </pic:spPr>
+                                      </pic:pic>
+                                    </a:graphicData>
+                                  </a:graphic>
+                                </wp:inline>
+                              </w:drawing>
+                              <w:t xml:space="preserve">График </w:t>
+                            </w:r>
+                            <w:r>
+                              <w:rPr/>
+                              <w:fldChar w:fldCharType="begin"/>
+                            </w:r>
+                            <w:r>
+                              <w:rPr/>
+                              <w:instrText xml:space="preserve"> SEQ График \* ARABIC </w:instrText>
+                            </w:r>
+                            <w:r>
+                              <w:rPr/>
+                              <w:fldChar w:fldCharType="separate"/>
+                            </w:r>
+                            <w:r>
+                              <w:rPr/>
+                              <w:t>6</w:t>
+                            </w:r>
+                            <w:r>
+                              <w:rPr/>
+                              <w:fldChar w:fldCharType="end"/>
+                            </w:r>
+                            <w:r>
+                              <w:rPr/>
+                              <w:t>: Sec</w:t>
+                            </w:r>
+                          </w:p>
+                        </w:txbxContent>
+                      </wps:txbx>
+                      <wps:bodyPr anchor="t" lIns="0" tIns="0" rIns="0" bIns="0">
+                        <a:noAutofit/>
+                      </wps:bodyPr>
+                    </wps:wsp>
+                  </a:graphicData>
+                </a:graphic>
+              </wp:anchor>
+            </w:drawing>
+          </mc:Choice>
+          <mc:Fallback>
+            <w:pict>
+              <v:rect style="position:absolute;rotation:-0;width:432.3pt;height:264.9pt;mso-wrap-distance-left:0pt;mso-wrap-distance-right:0pt;mso-wrap-distance-top:0pt;mso-wrap-distance-bottom:0pt;margin-top:0pt;mso-position-vertical:top;mso-position-vertical-relative:text;margin-left:17.7pt;mso-position-horizontal:center;mso-position-horizontal-relative:text">
+                <v:textbox inset="0in,0in,0in,0in">
+                  <w:txbxContent>
+                    <w:p>
+                      <w:pPr>
+                        <w:pStyle w:val="Style23"/>
+                        <w:spacing w:before="120" w:after="120"/>
+                        <w:rPr/>
+                      </w:pPr>
+                      <w:r>
+                        <w:rPr/>
+                        <w:drawing>
+                          <wp:inline distT="0" distB="0" distL="0" distR="0">
+                            <wp:extent cx="5490210" cy="2991485"/>
+                            <wp:effectExtent l="0" t="0" r="0" b="0"/>
+                            <wp:docPr id="22" name="Изображение8" descr=""/>
+                            <wp:cNvGraphicFramePr>
+                              <a:graphicFrameLocks xmlns:a="http://schemas.openxmlformats.org/drawingml/2006/main" noChangeAspect="1"/>
+                            </wp:cNvGraphicFramePr>
+                            <a:graphic xmlns:a="http://schemas.openxmlformats.org/drawingml/2006/main">
+                              <a:graphicData uri="http://schemas.openxmlformats.org/drawingml/2006/picture">
+                                <pic:pic xmlns:pic="http://schemas.openxmlformats.org/drawingml/2006/picture">
+                                  <pic:nvPicPr>
+                                    <pic:cNvPr id="22" name="Изображение8" descr=""/>
+                                    <pic:cNvPicPr>
+                                      <a:picLocks noChangeAspect="1" noChangeArrowheads="1"/>
+                                    </pic:cNvPicPr>
+                                  </pic:nvPicPr>
+                                  <pic:blipFill>
+                                    <a:blip r:embed="rId15"/>
+                                    <a:stretch>
+                                      <a:fillRect/>
+                                    </a:stretch>
+                                  </pic:blipFill>
+                                  <pic:spPr bwMode="auto">
+                                    <a:xfrm>
+                                      <a:off x="0" y="0"/>
+                                      <a:ext cx="5490210" cy="2991485"/>
+                                    </a:xfrm>
+                                    <a:prstGeom prst="rect">
+                                      <a:avLst/>
+                                    </a:prstGeom>
+                                  </pic:spPr>
+                                </pic:pic>
+                              </a:graphicData>
+                            </a:graphic>
+                          </wp:inline>
+                        </w:drawing>
+                        <w:t xml:space="preserve">График </w:t>
+                      </w:r>
+                      <w:r>
+                        <w:rPr/>
+                        <w:fldChar w:fldCharType="begin"/>
+                      </w:r>
+                      <w:r>
+                        <w:rPr/>
+                        <w:instrText xml:space="preserve"> SEQ График \* ARABIC </w:instrText>
+                      </w:r>
+                      <w:r>
+                        <w:rPr/>
+                        <w:fldChar w:fldCharType="separate"/>
+                      </w:r>
+                      <w:r>
+                        <w:rPr/>
+                        <w:t>6</w:t>
+                      </w:r>
+                      <w:r>
+                        <w:rPr/>
+                        <w:fldChar w:fldCharType="end"/>
+                      </w:r>
+                      <w:r>
+                        <w:rPr/>
+                        <w:t>: Sec</w:t>
+                      </w:r>
+                    </w:p>
+                  </w:txbxContent>
+                </v:textbox>
+                <w10:wrap type="square" side="largest"/>
+              </v:rect>
+            </w:pict>
+          </mc:Fallback>
+        </mc:AlternateContent>
+      </w:r>
+    </w:p>
+    <w:p>
+      <w:pPr>
+        <w:pStyle w:val="Heading1"/>
+        <w:spacing w:lineRule="auto" w:line="360" w:before="0" w:after="0"/>
+        <w:ind w:left="709"/>
+        <w:jc w:val="center"/>
+        <w:rPr>
+          <w:rFonts w:ascii="Times New Roman" w:hAnsi="Times New Roman"/>
+        </w:rPr>
+      </w:pPr>
+      <w:r>
+        <w:rPr/>
+      </w:r>
+      <w:r>
+        <w:br w:type="page"/>
+      </w:r>
+      <w:r>
+        <mc:AlternateContent>
+          <mc:Choice Requires="wps">
+            <w:drawing>
+              <wp:anchor behindDoc="0" distT="0" distB="0" distL="0" distR="0" simplePos="0" locked="0" layoutInCell="0" allowOverlap="1" relativeHeight="34">
+                <wp:simplePos x="0" y="0"/>
+                <wp:positionH relativeFrom="column">
+                  <wp:align>center</wp:align>
+                </wp:positionH>
+                <wp:positionV relativeFrom="paragraph">
+                  <wp:posOffset>635</wp:posOffset>
+                </wp:positionV>
+                <wp:extent cx="5490210" cy="3465830"/>
+                <wp:effectExtent l="0" t="0" r="0" b="0"/>
+                <wp:wrapSquare wrapText="largest"/>
+                <wp:docPr id="23" name="Врезка11"/>
+                <a:graphic xmlns:a="http://schemas.openxmlformats.org/drawingml/2006/main">
+                  <a:graphicData uri="http://schemas.microsoft.com/office/word/2010/wordprocessingShape">
+                    <wps:wsp>
+                      <wps:cNvSpPr txBox="1"/>
+                      <wps:spPr>
+                        <a:xfrm>
+                          <a:off x="0" y="0"/>
+                          <a:ext cx="5490210" cy="3465830"/>
+                        </a:xfrm>
+                        <a:prstGeom prst="rect"/>
+                        <a:solidFill>
+                          <a:srgbClr val="FFFFFF"/>
+                        </a:solidFill>
+                      </wps:spPr>
+                      <wps:txbx>
+                        <w:txbxContent>
+                          <w:p>
+                            <w:pPr>
+                              <w:pStyle w:val="Style23"/>
+                              <w:spacing w:before="120" w:after="120"/>
+                              <w:rPr/>
+                            </w:pPr>
+                            <w:r>
+                              <w:rPr/>
+                              <w:drawing>
+                                <wp:inline distT="0" distB="0" distL="0" distR="0">
+                                  <wp:extent cx="5490210" cy="3093085"/>
+                                  <wp:effectExtent l="0" t="0" r="0" b="0"/>
+                                  <wp:docPr id="24" name="Изображение9" descr=""/>
+                                  <wp:cNvGraphicFramePr>
+                                    <a:graphicFrameLocks xmlns:a="http://schemas.openxmlformats.org/drawingml/2006/main" noChangeAspect="1"/>
+                                  </wp:cNvGraphicFramePr>
+                                  <a:graphic xmlns:a="http://schemas.openxmlformats.org/drawingml/2006/main">
+                                    <a:graphicData uri="http://schemas.openxmlformats.org/drawingml/2006/picture">
+                                      <pic:pic xmlns:pic="http://schemas.openxmlformats.org/drawingml/2006/picture">
+                                        <pic:nvPicPr>
+                                          <pic:cNvPr id="24" name="Изображение9" descr=""/>
+                                          <pic:cNvPicPr>
+                                            <a:picLocks noChangeAspect="1" noChangeArrowheads="1"/>
+                                          </pic:cNvPicPr>
+                                        </pic:nvPicPr>
+                                        <pic:blipFill>
+                                          <a:blip r:embed="rId16"/>
+                                          <a:stretch>
+                                            <a:fillRect/>
+                                          </a:stretch>
+                                        </pic:blipFill>
+                                        <pic:spPr bwMode="auto">
+                                          <a:xfrm>
+                                            <a:off x="0" y="0"/>
+                                            <a:ext cx="5490210" cy="3093085"/>
+                                          </a:xfrm>
+                                          <a:prstGeom prst="rect">
+                                            <a:avLst/>
+                                          </a:prstGeom>
+                                        </pic:spPr>
+                                      </pic:pic>
+                                    </a:graphicData>
+                                  </a:graphic>
+                                </wp:inline>
+                              </w:drawing>
+                              <w:t xml:space="preserve">График </w:t>
+                            </w:r>
+                            <w:r>
+                              <w:rPr/>
+                              <w:fldChar w:fldCharType="begin"/>
+                            </w:r>
+                            <w:r>
+                              <w:rPr/>
+                              <w:instrText xml:space="preserve"> SEQ График \* ARABIC </w:instrText>
+                            </w:r>
+                            <w:r>
+                              <w:rPr/>
+                              <w:fldChar w:fldCharType="separate"/>
+                            </w:r>
+                            <w:r>
+                              <w:rPr/>
+                              <w:t>7</w:t>
+                            </w:r>
+                            <w:r>
+                              <w:rPr/>
+                              <w:fldChar w:fldCharType="end"/>
+                            </w:r>
+                            <w:r>
+                              <w:rPr/>
+                              <w:t>: Csc</w:t>
+                            </w:r>
+                          </w:p>
+                        </w:txbxContent>
+                      </wps:txbx>
+                      <wps:bodyPr anchor="t" lIns="0" tIns="0" rIns="0" bIns="0">
+                        <a:noAutofit/>
+                      </wps:bodyPr>
+                    </wps:wsp>
+                  </a:graphicData>
+                </a:graphic>
+              </wp:anchor>
+            </w:drawing>
+          </mc:Choice>
+          <mc:Fallback>
+            <w:pict>
+              <v:rect style="position:absolute;rotation:-0;width:432.3pt;height:272.9pt;mso-wrap-distance-left:0pt;mso-wrap-distance-right:0pt;mso-wrap-distance-top:0pt;mso-wrap-distance-bottom:0pt;margin-top:0pt;mso-position-vertical:top;mso-position-vertical-relative:text;margin-left:17.7pt;mso-position-horizontal:center;mso-position-horizontal-relative:text">
+                <v:textbox inset="0in,0in,0in,0in">
+                  <w:txbxContent>
+                    <w:p>
+                      <w:pPr>
+                        <w:pStyle w:val="Style23"/>
+                        <w:spacing w:before="120" w:after="120"/>
+                        <w:rPr/>
+                      </w:pPr>
+                      <w:r>
+                        <w:rPr/>
+                        <w:drawing>
+                          <wp:inline distT="0" distB="0" distL="0" distR="0">
+                            <wp:extent cx="5490210" cy="3093085"/>
+                            <wp:effectExtent l="0" t="0" r="0" b="0"/>
+                            <wp:docPr id="25" name="Изображение9" descr=""/>
+                            <wp:cNvGraphicFramePr>
+                              <a:graphicFrameLocks xmlns:a="http://schemas.openxmlformats.org/drawingml/2006/main" noChangeAspect="1"/>
+                            </wp:cNvGraphicFramePr>
+                            <a:graphic xmlns:a="http://schemas.openxmlformats.org/drawingml/2006/main">
+                              <a:graphicData uri="http://schemas.openxmlformats.org/drawingml/2006/picture">
+                                <pic:pic xmlns:pic="http://schemas.openxmlformats.org/drawingml/2006/picture">
+                                  <pic:nvPicPr>
+                                    <pic:cNvPr id="25" name="Изображение9" descr=""/>
+                                    <pic:cNvPicPr>
+                                      <a:picLocks noChangeAspect="1" noChangeArrowheads="1"/>
+                                    </pic:cNvPicPr>
+                                  </pic:nvPicPr>
+                                  <pic:blipFill>
+                                    <a:blip r:embed="rId17"/>
+                                    <a:stretch>
+                                      <a:fillRect/>
+                                    </a:stretch>
+                                  </pic:blipFill>
+                                  <pic:spPr bwMode="auto">
+                                    <a:xfrm>
+                                      <a:off x="0" y="0"/>
+                                      <a:ext cx="5490210" cy="3093085"/>
+                                    </a:xfrm>
+                                    <a:prstGeom prst="rect">
+                                      <a:avLst/>
+                                    </a:prstGeom>
+                                  </pic:spPr>
+                                </pic:pic>
+                              </a:graphicData>
+                            </a:graphic>
+                          </wp:inline>
+                        </w:drawing>
+                        <w:t xml:space="preserve">График </w:t>
+                      </w:r>
+                      <w:r>
+                        <w:rPr/>
+                        <w:fldChar w:fldCharType="begin"/>
+                      </w:r>
+                      <w:r>
+                        <w:rPr/>
+                        <w:instrText xml:space="preserve"> SEQ График \* ARABIC </w:instrText>
+                      </w:r>
+                      <w:r>
+                        <w:rPr/>
+                        <w:fldChar w:fldCharType="separate"/>
+                      </w:r>
+                      <w:r>
+                        <w:rPr/>
+                        <w:t>7</w:t>
+                      </w:r>
+                      <w:r>
+                        <w:rPr/>
+                        <w:fldChar w:fldCharType="end"/>
+                      </w:r>
+                      <w:r>
+                        <w:rPr/>
+                        <w:t>: Csc</w:t>
+                      </w:r>
+                    </w:p>
+                  </w:txbxContent>
+                </v:textbox>
+                <w10:wrap type="square" side="largest"/>
+              </v:rect>
+            </w:pict>
+          </mc:Fallback>
+        </mc:AlternateContent>
+      </w:r>
+    </w:p>
+    <w:p>
+      <w:pPr>
+        <w:pStyle w:val="Heading1"/>
+        <w:spacing w:lineRule="auto" w:line="360" w:before="0" w:after="0"/>
+        <w:ind w:left="709"/>
+        <w:jc w:val="center"/>
+        <w:rPr>
+          <w:rFonts w:ascii="Times New Roman" w:hAnsi="Times New Roman"/>
+        </w:rPr>
+      </w:pPr>
+      <w:r>
+        <w:rPr/>
+      </w:r>
+      <w:r>
+        <w:br w:type="page"/>
+      </w:r>
+      <w:r>
+        <mc:AlternateContent>
+          <mc:Choice Requires="wps">
+            <w:drawing>
+              <wp:anchor behindDoc="0" distT="0" distB="0" distL="0" distR="0" simplePos="0" locked="0" layoutInCell="0" allowOverlap="1" relativeHeight="36">
+                <wp:simplePos x="0" y="0"/>
+                <wp:positionH relativeFrom="column">
+                  <wp:align>center</wp:align>
+                </wp:positionH>
+                <wp:positionV relativeFrom="paragraph">
+                  <wp:posOffset>635</wp:posOffset>
+                </wp:positionV>
+                <wp:extent cx="5490210" cy="3376930"/>
+                <wp:effectExtent l="0" t="0" r="0" b="0"/>
+                <wp:wrapSquare wrapText="largest"/>
+                <wp:docPr id="26" name="Врезка12"/>
+                <a:graphic xmlns:a="http://schemas.openxmlformats.org/drawingml/2006/main">
+                  <a:graphicData uri="http://schemas.microsoft.com/office/word/2010/wordprocessingShape">
+                    <wps:wsp>
+                      <wps:cNvSpPr txBox="1"/>
+                      <wps:spPr>
+                        <a:xfrm>
+                          <a:off x="0" y="0"/>
+                          <a:ext cx="5490210" cy="3376930"/>
+                        </a:xfrm>
+                        <a:prstGeom prst="rect"/>
+                        <a:solidFill>
+                          <a:srgbClr val="FFFFFF"/>
+                        </a:solidFill>
+                      </wps:spPr>
+                      <wps:txbx>
+                        <w:txbxContent>
+                          <w:p>
+                            <w:pPr>
+                              <w:pStyle w:val="Style23"/>
+                              <w:spacing w:before="120" w:after="120"/>
+                              <w:rPr/>
+                            </w:pPr>
+                            <w:r>
+                              <w:rPr/>
+                              <w:drawing>
+                                <wp:inline distT="0" distB="0" distL="0" distR="0">
+                                  <wp:extent cx="5490210" cy="3004185"/>
+                                  <wp:effectExtent l="0" t="0" r="0" b="0"/>
+                                  <wp:docPr id="27" name="Изображение10" descr=""/>
+                                  <wp:cNvGraphicFramePr>
+                                    <a:graphicFrameLocks xmlns:a="http://schemas.openxmlformats.org/drawingml/2006/main" noChangeAspect="1"/>
+                                  </wp:cNvGraphicFramePr>
+                                  <a:graphic xmlns:a="http://schemas.openxmlformats.org/drawingml/2006/main">
+                                    <a:graphicData uri="http://schemas.openxmlformats.org/drawingml/2006/picture">
+                                      <pic:pic xmlns:pic="http://schemas.openxmlformats.org/drawingml/2006/picture">
+                                        <pic:nvPicPr>
+                                          <pic:cNvPr id="27" name="Изображение10" descr=""/>
+                                          <pic:cNvPicPr>
+                                            <a:picLocks noChangeAspect="1" noChangeArrowheads="1"/>
+                                          </pic:cNvPicPr>
+                                        </pic:nvPicPr>
+                                        <pic:blipFill>
+                                          <a:blip r:embed="rId18"/>
+                                          <a:stretch>
+                                            <a:fillRect/>
+                                          </a:stretch>
+                                        </pic:blipFill>
+                                        <pic:spPr bwMode="auto">
+                                          <a:xfrm>
+                                            <a:off x="0" y="0"/>
+                                            <a:ext cx="5490210" cy="3004185"/>
+                                          </a:xfrm>
+                                          <a:prstGeom prst="rect">
+                                            <a:avLst/>
+                                          </a:prstGeom>
+                                        </pic:spPr>
+                                      </pic:pic>
+                                    </a:graphicData>
+                                  </a:graphic>
+                                </wp:inline>
+                              </w:drawing>
+                              <w:t xml:space="preserve">График </w:t>
+                            </w:r>
+                            <w:r>
+                              <w:rPr/>
+                              <w:fldChar w:fldCharType="begin"/>
+                            </w:r>
+                            <w:r>
+                              <w:rPr/>
+                              <w:instrText xml:space="preserve"> SEQ График \* ARABIC </w:instrText>
+                            </w:r>
+                            <w:r>
+                              <w:rPr/>
+                              <w:fldChar w:fldCharType="separate"/>
+                            </w:r>
+                            <w:r>
+                              <w:rPr/>
+                              <w:t>8</w:t>
+                            </w:r>
+                            <w:r>
+                              <w:rPr/>
+                              <w:fldChar w:fldCharType="end"/>
+                            </w:r>
+                            <w:r>
+                              <w:rPr/>
+                              <w:t>: Ln</w:t>
+                            </w:r>
+                          </w:p>
+                        </w:txbxContent>
+                      </wps:txbx>
+                      <wps:bodyPr anchor="t" lIns="0" tIns="0" rIns="0" bIns="0">
+                        <a:noAutofit/>
+                      </wps:bodyPr>
+                    </wps:wsp>
+                  </a:graphicData>
+                </a:graphic>
+              </wp:anchor>
+            </w:drawing>
+          </mc:Choice>
+          <mc:Fallback>
+            <w:pict>
+              <v:rect style="position:absolute;rotation:-0;width:432.3pt;height:265.9pt;mso-wrap-distance-left:0pt;mso-wrap-distance-right:0pt;mso-wrap-distance-top:0pt;mso-wrap-distance-bottom:0pt;margin-top:0pt;mso-position-vertical:top;mso-position-vertical-relative:text;margin-left:17.7pt;mso-position-horizontal:center;mso-position-horizontal-relative:text">
+                <v:textbox inset="0in,0in,0in,0in">
+                  <w:txbxContent>
+                    <w:p>
+                      <w:pPr>
+                        <w:pStyle w:val="Style23"/>
+                        <w:spacing w:before="120" w:after="120"/>
+                        <w:rPr/>
+                      </w:pPr>
+                      <w:r>
+                        <w:rPr/>
+                        <w:drawing>
+                          <wp:inline distT="0" distB="0" distL="0" distR="0">
+                            <wp:extent cx="5490210" cy="3004185"/>
+                            <wp:effectExtent l="0" t="0" r="0" b="0"/>
+                            <wp:docPr id="28" name="Изображение10" descr=""/>
+                            <wp:cNvGraphicFramePr>
+                              <a:graphicFrameLocks xmlns:a="http://schemas.openxmlformats.org/drawingml/2006/main" noChangeAspect="1"/>
+                            </wp:cNvGraphicFramePr>
+                            <a:graphic xmlns:a="http://schemas.openxmlformats.org/drawingml/2006/main">
+                              <a:graphicData uri="http://schemas.openxmlformats.org/drawingml/2006/picture">
+                                <pic:pic xmlns:pic="http://schemas.openxmlformats.org/drawingml/2006/picture">
+                                  <pic:nvPicPr>
+                                    <pic:cNvPr id="28" name="Изображение10" descr=""/>
+                                    <pic:cNvPicPr>
+                                      <a:picLocks noChangeAspect="1" noChangeArrowheads="1"/>
+                                    </pic:cNvPicPr>
+                                  </pic:nvPicPr>
+                                  <pic:blipFill>
+                                    <a:blip r:embed="rId19"/>
+                                    <a:stretch>
+                                      <a:fillRect/>
+                                    </a:stretch>
+                                  </pic:blipFill>
+                                  <pic:spPr bwMode="auto">
+                                    <a:xfrm>
+                                      <a:off x="0" y="0"/>
+                                      <a:ext cx="5490210" cy="3004185"/>
+                                    </a:xfrm>
+                                    <a:prstGeom prst="rect">
+                                      <a:avLst/>
+                                    </a:prstGeom>
+                                  </pic:spPr>
+                                </pic:pic>
+                              </a:graphicData>
+                            </a:graphic>
+                          </wp:inline>
+                        </w:drawing>
+                        <w:t xml:space="preserve">График </w:t>
+                      </w:r>
+                      <w:r>
+                        <w:rPr/>
+                        <w:fldChar w:fldCharType="begin"/>
+                      </w:r>
+                      <w:r>
+                        <w:rPr/>
+                        <w:instrText xml:space="preserve"> SEQ График \* ARABIC </w:instrText>
+                      </w:r>
+                      <w:r>
+                        <w:rPr/>
+                        <w:fldChar w:fldCharType="separate"/>
+                      </w:r>
+                      <w:r>
+                        <w:rPr/>
+                        <w:t>8</w:t>
+                      </w:r>
+                      <w:r>
+                        <w:rPr/>
+                        <w:fldChar w:fldCharType="end"/>
+                      </w:r>
+                      <w:r>
+                        <w:rPr/>
+                        <w:t>: Ln</w:t>
+                      </w:r>
+                    </w:p>
+                  </w:txbxContent>
+                </v:textbox>
+                <w10:wrap type="square" side="largest"/>
+              </v:rect>
+            </w:pict>
+          </mc:Fallback>
+        </mc:AlternateContent>
+      </w:r>
+    </w:p>
+    <w:p>
+      <w:pPr>
+        <w:pStyle w:val="Heading1"/>
+        <w:spacing w:lineRule="auto" w:line="360" w:before="0" w:after="0"/>
+        <w:ind w:left="709"/>
+        <w:jc w:val="center"/>
+        <w:rPr>
+          <w:rFonts w:ascii="Times New Roman" w:hAnsi="Times New Roman"/>
+        </w:rPr>
+      </w:pPr>
+      <w:r>
+        <w:rPr/>
+      </w:r>
+      <w:r>
+        <w:br w:type="page"/>
+      </w:r>
+      <w:r>
+        <mc:AlternateContent>
+          <mc:Choice Requires="wps">
+            <w:drawing>
+              <wp:anchor behindDoc="0" distT="0" distB="0" distL="0" distR="0" simplePos="0" locked="0" layoutInCell="0" allowOverlap="1" relativeHeight="38">
+                <wp:simplePos x="0" y="0"/>
+                <wp:positionH relativeFrom="column">
+                  <wp:align>center</wp:align>
+                </wp:positionH>
+                <wp:positionV relativeFrom="paragraph">
+                  <wp:posOffset>635</wp:posOffset>
+                </wp:positionV>
+                <wp:extent cx="5490210" cy="3360420"/>
+                <wp:effectExtent l="0" t="0" r="0" b="0"/>
+                <wp:wrapSquare wrapText="largest"/>
+                <wp:docPr id="29" name="Врезка13"/>
+                <a:graphic xmlns:a="http://schemas.openxmlformats.org/drawingml/2006/main">
+                  <a:graphicData uri="http://schemas.microsoft.com/office/word/2010/wordprocessingShape">
+                    <wps:wsp>
+                      <wps:cNvSpPr txBox="1"/>
+                      <wps:spPr>
+                        <a:xfrm>
+                          <a:off x="0" y="0"/>
+                          <a:ext cx="5490210" cy="3360420"/>
+                        </a:xfrm>
+                        <a:prstGeom prst="rect"/>
+                        <a:solidFill>
+                          <a:srgbClr val="FFFFFF"/>
+                        </a:solidFill>
+                      </wps:spPr>
+                      <wps:txbx>
+                        <w:txbxContent>
+                          <w:p>
+                            <w:pPr>
+                              <w:pStyle w:val="Style23"/>
+                              <w:spacing w:before="120" w:after="120"/>
+                              <w:rPr/>
+                            </w:pPr>
+                            <w:r>
+                              <w:rPr/>
+                              <w:drawing>
+                                <wp:inline distT="0" distB="0" distL="0" distR="0">
+                                  <wp:extent cx="5490210" cy="2987675"/>
+                                  <wp:effectExtent l="0" t="0" r="0" b="0"/>
+                                  <wp:docPr id="30" name="Изображение11" descr=""/>
+                                  <wp:cNvGraphicFramePr>
+                                    <a:graphicFrameLocks xmlns:a="http://schemas.openxmlformats.org/drawingml/2006/main" noChangeAspect="1"/>
+                                  </wp:cNvGraphicFramePr>
+                                  <a:graphic xmlns:a="http://schemas.openxmlformats.org/drawingml/2006/main">
+                                    <a:graphicData uri="http://schemas.openxmlformats.org/drawingml/2006/picture">
+                                      <pic:pic xmlns:pic="http://schemas.openxmlformats.org/drawingml/2006/picture">
+                                        <pic:nvPicPr>
+                                          <pic:cNvPr id="30" name="Изображение11" descr=""/>
+                                          <pic:cNvPicPr>
+                                            <a:picLocks noChangeAspect="1" noChangeArrowheads="1"/>
+                                          </pic:cNvPicPr>
+                                        </pic:nvPicPr>
+                                        <pic:blipFill>
+                                          <a:blip r:embed="rId20"/>
+                                          <a:stretch>
+                                            <a:fillRect/>
+                                          </a:stretch>
+                                        </pic:blipFill>
+                                        <pic:spPr bwMode="auto">
+                                          <a:xfrm>
+                                            <a:off x="0" y="0"/>
+                                            <a:ext cx="5490210" cy="2987675"/>
+                                          </a:xfrm>
+                                          <a:prstGeom prst="rect">
+                                            <a:avLst/>
+                                          </a:prstGeom>
+                                        </pic:spPr>
+                                      </pic:pic>
+                                    </a:graphicData>
+                                  </a:graphic>
+                                </wp:inline>
+                              </w:drawing>
+                              <w:t xml:space="preserve">График </w:t>
+                            </w:r>
+                            <w:r>
+                              <w:rPr/>
+                              <w:fldChar w:fldCharType="begin"/>
+                            </w:r>
+                            <w:r>
+                              <w:rPr/>
+                              <w:instrText xml:space="preserve"> SEQ График \* ARABIC </w:instrText>
+                            </w:r>
+                            <w:r>
+                              <w:rPr/>
+                              <w:fldChar w:fldCharType="separate"/>
+                            </w:r>
+                            <w:r>
+                              <w:rPr/>
+                              <w:t>9</w:t>
+                            </w:r>
+                            <w:r>
+                              <w:rPr/>
+                              <w:fldChar w:fldCharType="end"/>
+                            </w:r>
+                            <w:r>
+                              <w:rPr/>
+                              <w:t>: Log_10</w:t>
+                            </w:r>
+                          </w:p>
+                        </w:txbxContent>
+                      </wps:txbx>
+                      <wps:bodyPr anchor="t" lIns="0" tIns="0" rIns="0" bIns="0">
+                        <a:noAutofit/>
+                      </wps:bodyPr>
+                    </wps:wsp>
+                  </a:graphicData>
+                </a:graphic>
+              </wp:anchor>
+            </w:drawing>
+          </mc:Choice>
+          <mc:Fallback>
+            <w:pict>
+              <v:rect style="position:absolute;rotation:-0;width:432.3pt;height:264.6pt;mso-wrap-distance-left:0pt;mso-wrap-distance-right:0pt;mso-wrap-distance-top:0pt;mso-wrap-distance-bottom:0pt;margin-top:0pt;mso-position-vertical:top;mso-position-vertical-relative:text;margin-left:17.7pt;mso-position-horizontal:center;mso-position-horizontal-relative:text">
+                <v:textbox inset="0in,0in,0in,0in">
+                  <w:txbxContent>
+                    <w:p>
+                      <w:pPr>
+                        <w:pStyle w:val="Style23"/>
+                        <w:spacing w:before="120" w:after="120"/>
+                        <w:rPr/>
+                      </w:pPr>
+                      <w:r>
+                        <w:rPr/>
+                        <w:drawing>
+                          <wp:inline distT="0" distB="0" distL="0" distR="0">
+                            <wp:extent cx="5490210" cy="2987675"/>
+                            <wp:effectExtent l="0" t="0" r="0" b="0"/>
+                            <wp:docPr id="31" name="Изображение11" descr=""/>
+                            <wp:cNvGraphicFramePr>
+                              <a:graphicFrameLocks xmlns:a="http://schemas.openxmlformats.org/drawingml/2006/main" noChangeAspect="1"/>
+                            </wp:cNvGraphicFramePr>
+                            <a:graphic xmlns:a="http://schemas.openxmlformats.org/drawingml/2006/main">
+                              <a:graphicData uri="http://schemas.openxmlformats.org/drawingml/2006/picture">
+                                <pic:pic xmlns:pic="http://schemas.openxmlformats.org/drawingml/2006/picture">
+                                  <pic:nvPicPr>
+                                    <pic:cNvPr id="31" name="Изображение11" descr=""/>
+                                    <pic:cNvPicPr>
+                                      <a:picLocks noChangeAspect="1" noChangeArrowheads="1"/>
+                                    </pic:cNvPicPr>
+                                  </pic:nvPicPr>
+                                  <pic:blipFill>
+                                    <a:blip r:embed="rId21"/>
+                                    <a:stretch>
+                                      <a:fillRect/>
+                                    </a:stretch>
+                                  </pic:blipFill>
+                                  <pic:spPr bwMode="auto">
+                                    <a:xfrm>
+                                      <a:off x="0" y="0"/>
+                                      <a:ext cx="5490210" cy="2987675"/>
+                                    </a:xfrm>
+                                    <a:prstGeom prst="rect">
+                                      <a:avLst/>
+                                    </a:prstGeom>
+                                  </pic:spPr>
+                                </pic:pic>
+                              </a:graphicData>
+                            </a:graphic>
+                          </wp:inline>
+                        </w:drawing>
+                        <w:t xml:space="preserve">График </w:t>
+                      </w:r>
+                      <w:r>
+                        <w:rPr/>
+                        <w:fldChar w:fldCharType="begin"/>
+                      </w:r>
+                      <w:r>
+                        <w:rPr/>
+                        <w:instrText xml:space="preserve"> SEQ График \* ARABIC </w:instrText>
+                      </w:r>
+                      <w:r>
+                        <w:rPr/>
+                        <w:fldChar w:fldCharType="separate"/>
+                      </w:r>
+                      <w:r>
+                        <w:rPr/>
+                        <w:t>9</w:t>
+                      </w:r>
+                      <w:r>
+                        <w:rPr/>
+                        <w:fldChar w:fldCharType="end"/>
+                      </w:r>
+                      <w:r>
+                        <w:rPr/>
+                        <w:t>: Log_10</w:t>
+                      </w:r>
+                    </w:p>
+                  </w:txbxContent>
+                </v:textbox>
+                <w10:wrap type="square" side="largest"/>
+              </v:rect>
+            </w:pict>
+          </mc:Fallback>
+        </mc:AlternateContent>
+      </w:r>
+    </w:p>
+    <w:p>
+      <w:pPr>
+        <w:pStyle w:val="Heading1"/>
+        <w:spacing w:lineRule="auto" w:line="360" w:before="0" w:after="0"/>
+        <w:ind w:left="709"/>
+        <w:jc w:val="center"/>
+        <w:rPr>
+          <w:rFonts w:ascii="Times New Roman" w:hAnsi="Times New Roman"/>
+        </w:rPr>
+      </w:pPr>
+      <w:bookmarkStart w:id="4" w:name="__RefHeading___Toc524_1614521587_Копия_2"/>
+      <w:bookmarkStart w:id="5" w:name="_Toc146616696_Копия_1_Копия_1"/>
+      <w:bookmarkEnd w:id="4"/>
       <w:r>
         <w:rPr>
           <w:rFonts w:eastAsia="Times New Roman" w:cs="Times New Roman"/>
           <w:b/>
           <w:bCs/>
           <w:color w:val="auto"/>
-          <w:lang w:val="ru-RU"/>
-        </w:rPr>
-        <w:t>Точки</w:t>
+        </w:rPr>
+        <w:t>В</w:t>
+      </w:r>
+      <w:bookmarkEnd w:id="5"/>
+      <w:r>
+        <w:rPr>
+          <w:rFonts w:eastAsia="Times New Roman" w:cs="Times New Roman"/>
+          <w:b/>
+          <w:bCs/>
+          <w:color w:val="auto"/>
+        </w:rPr>
+        <w:t>ыводы</w:t>
       </w:r>
     </w:p>
     <w:p>
@@ -1229,103 +3871,20 @@
         <w:jc w:val="both"/>
         <w:rPr>
           <w:rFonts w:ascii="Times New Roman" w:hAnsi="Times New Roman"/>
-          <w:lang w:val="en-US"/>
-        </w:rPr>
-      </w:pPr>
-      <w:r>
-        <w:rPr/>
-        <w:t xml:space="preserve">Выражение ((((((((((((cot(x)^2)-sin(x))+(csc(x)^3))/(tan(x)-cot(x)))*csc(x))+cot(x))/(sec(x)^3))+(csc(x)/(sec(x)/(sin(x)/tan(x)))))/sec(x))*(((cot(x)*tan(x))+(tan(x)+cos(x)))+((((sin(x)*sin(x))+cos(x))/(tan(x)/tan(x)))*(csc(x)^2))))-sec(x))*((tan(x)+(((cot(x)+(sec(x)+cot(x)))/(cot(x)^3))/(cos(x)*sin(x))))-sec(x))) использует периодические функции с аргументом </w:t>
-      </w:r>
-      <w:r>
-        <w:rPr>
-          <w:lang w:val="en-US"/>
-        </w:rPr>
-        <w:t xml:space="preserve">x, </w:t>
-      </w:r>
-      <w:r>
-        <w:rPr>
-          <w:lang w:val="ru-RU"/>
-        </w:rPr>
-        <w:t xml:space="preserve">следовательно функция периодична с периодом </w:t>
-      </w:r>
-      <w:r>
-        <w:rPr>
-          <w:lang w:val="en-US"/>
-        </w:rPr>
-        <w:t xml:space="preserve">2pi. </w:t>
-      </w:r>
-      <w:r>
-        <w:rPr>
-          <w:lang w:val="ru-RU"/>
-        </w:rPr>
-        <w:t xml:space="preserve">Тогда исследуем поведение только на интервале </w:t>
-      </w:r>
-      <w:r>
-        <w:rPr>
-          <w:lang w:val="en-US"/>
-        </w:rPr>
-        <w:t>(-2pi, 0].</w:t>
-      </w:r>
-      <w:r>
-        <w:br w:type="page"/>
-      </w:r>
-    </w:p>
-    <w:p>
-      <w:pPr>
-        <w:pStyle w:val="Heading1"/>
-        <w:spacing w:lineRule="auto" w:line="360" w:before="0" w:after="0"/>
-        <w:ind w:left="709"/>
-        <w:jc w:val="center"/>
-        <w:rPr>
-          <w:rFonts w:ascii="Times New Roman" w:hAnsi="Times New Roman"/>
-        </w:rPr>
-      </w:pPr>
-      <w:bookmarkStart w:id="4" w:name="__RefHeading___Toc524_1614521587_Копия_2"/>
-      <w:bookmarkStart w:id="5" w:name="_Toc146616696_Копия_1_Копия_1"/>
-      <w:bookmarkEnd w:id="4"/>
-      <w:r>
-        <w:rPr>
-          <w:rFonts w:eastAsia="Times New Roman" w:cs="Times New Roman"/>
-          <w:b/>
-          <w:bCs/>
-          <w:color w:val="auto"/>
-        </w:rPr>
-        <w:t>В</w:t>
-      </w:r>
-      <w:bookmarkEnd w:id="5"/>
-      <w:r>
-        <w:rPr>
-          <w:rFonts w:eastAsia="Times New Roman" w:cs="Times New Roman"/>
-          <w:b/>
-          <w:bCs/>
-          <w:color w:val="auto"/>
-        </w:rPr>
-        <w:t>ыводы</w:t>
-      </w:r>
-    </w:p>
-    <w:p>
-      <w:pPr>
-        <w:pStyle w:val="Normal"/>
-        <w:bidi w:val="0"/>
-        <w:spacing w:lineRule="auto" w:line="360" w:beforeAutospacing="0" w:before="0" w:afterAutospacing="0" w:after="160"/>
-        <w:ind w:firstLine="709" w:left="0" w:right="0"/>
-        <w:jc w:val="both"/>
-        <w:rPr>
-          <w:rFonts w:ascii="Times New Roman" w:hAnsi="Times New Roman"/>
-        </w:rPr>
-      </w:pPr>
-      <w:r>
-        <w:rPr/>
-        <w:t>В ходе работы.</w:t>
+        </w:rPr>
+      </w:pPr>
+      <w:r>
+        <w:rPr/>
+        <w:t>В ходе работы я познакомился с библиотекой Mockito, научился писать интеграционные тесты, применять заглушки (mocks), настраивать их поведение и использовать внедрение зависимостей при тестировании. Также были получены навыки построения таблиц значений функции, анализа её поведения на различных интервалах, поиска нулей функции и критических точек.</w:t>
       </w:r>
     </w:p>
     <w:sectPr>
-      <w:headerReference w:type="even" r:id="rId4"/>
-      <w:headerReference w:type="default" r:id="rId5"/>
-      <w:headerReference w:type="first" r:id="rId6"/>
-      <w:footerReference w:type="even" r:id="rId7"/>
-      <w:footerReference w:type="default" r:id="rId8"/>
-      <w:footerReference w:type="first" r:id="rId9"/>
+      <w:headerReference w:type="even" r:id="rId22"/>
+      <w:headerReference w:type="default" r:id="rId23"/>
+      <w:headerReference w:type="first" r:id="rId24"/>
+      <w:footerReference w:type="even" r:id="rId25"/>
+      <w:footerReference w:type="default" r:id="rId26"/>
+      <w:footerReference w:type="first" r:id="rId27"/>
       <w:type w:val="nextPage"/>
       <w:pgSz w:w="11906" w:h="16838"/>
       <w:pgMar w:left="1701" w:right="850" w:gutter="0" w:header="1134" w:top="1548" w:footer="1134" w:bottom="1548"/>
@@ -1340,7 +3899,7 @@
 </file>
 
 <file path=word/footer1.xml><?xml version="1.0" encoding="utf-8"?>
-<w:ftr xmlns:o="urn:schemas-microsoft-com:office:office" xmlns:r="http://schemas.openxmlformats.org/officeDocument/2006/relationships" xmlns:v="urn:schemas-microsoft-com:vml" xmlns:w="http://schemas.openxmlformats.org/wordprocessingml/2006/main" xmlns:w10="urn:schemas-microsoft-com:office:word" xmlns:wp="http://schemas.openxmlformats.org/drawingml/2006/wordprocessingDrawing" xmlns:pic="http://schemas.openxmlformats.org/drawingml/2006/picture" xmlns:wps="http://schemas.microsoft.com/office/word/2010/wordprocessingShape" xmlns:wpg="http://schemas.microsoft.com/office/word/2010/wordprocessingGroup" xmlns:mc="http://schemas.openxmlformats.org/markup-compatibility/2006" xmlns:wp14="http://schemas.microsoft.com/office/word/2010/wordprocessingDrawing" xmlns:w14="http://schemas.microsoft.com/office/word/2010/wordml" xmlns:w15="http://schemas.microsoft.com/office/word/2012/wordml" mc:Ignorable="w14 wp14 w15">
+<w:ftr xmlns:o="urn:schemas-microsoft-com:office:office" xmlns:r="http://schemas.openxmlformats.org/officeDocument/2006/relationships" xmlns:v="urn:schemas-microsoft-com:vml" xmlns:w="http://schemas.openxmlformats.org/wordprocessingml/2006/main" xmlns:w10="urn:schemas-microsoft-com:office:word" xmlns:wp="http://schemas.openxmlformats.org/drawingml/2006/wordprocessingDrawing" xmlns:wps="http://schemas.microsoft.com/office/word/2010/wordprocessingShape" xmlns:wpg="http://schemas.microsoft.com/office/word/2010/wordprocessingGroup" xmlns:mc="http://schemas.openxmlformats.org/markup-compatibility/2006" xmlns:wp14="http://schemas.microsoft.com/office/word/2010/wordprocessingDrawing" xmlns:w14="http://schemas.microsoft.com/office/word/2010/wordml" xmlns:w15="http://schemas.microsoft.com/office/word/2012/wordml" mc:Ignorable="w14 wp14 w15">
   <w:p>
     <w:pPr>
       <w:pStyle w:val="Footer"/>
@@ -1354,7 +3913,7 @@
 </file>
 
 <file path=word/footer2.xml><?xml version="1.0" encoding="utf-8"?>
-<w:ftr xmlns:o="urn:schemas-microsoft-com:office:office" xmlns:r="http://schemas.openxmlformats.org/officeDocument/2006/relationships" xmlns:v="urn:schemas-microsoft-com:vml" xmlns:w="http://schemas.openxmlformats.org/wordprocessingml/2006/main" xmlns:w10="urn:schemas-microsoft-com:office:word" xmlns:wp="http://schemas.openxmlformats.org/drawingml/2006/wordprocessingDrawing" xmlns:pic="http://schemas.openxmlformats.org/drawingml/2006/picture" xmlns:wps="http://schemas.microsoft.com/office/word/2010/wordprocessingShape" xmlns:wpg="http://schemas.microsoft.com/office/word/2010/wordprocessingGroup" xmlns:mc="http://schemas.openxmlformats.org/markup-compatibility/2006" xmlns:wp14="http://schemas.microsoft.com/office/word/2010/wordprocessingDrawing" xmlns:w14="http://schemas.microsoft.com/office/word/2010/wordml" xmlns:w15="http://schemas.microsoft.com/office/word/2012/wordml" mc:Ignorable="w14 wp14 w15">
+<w:ftr xmlns:o="urn:schemas-microsoft-com:office:office" xmlns:r="http://schemas.openxmlformats.org/officeDocument/2006/relationships" xmlns:v="urn:schemas-microsoft-com:vml" xmlns:w="http://schemas.openxmlformats.org/wordprocessingml/2006/main" xmlns:w10="urn:schemas-microsoft-com:office:word" xmlns:wp="http://schemas.openxmlformats.org/drawingml/2006/wordprocessingDrawing" xmlns:wps="http://schemas.microsoft.com/office/word/2010/wordprocessingShape" xmlns:wpg="http://schemas.microsoft.com/office/word/2010/wordprocessingGroup" xmlns:mc="http://schemas.openxmlformats.org/markup-compatibility/2006" xmlns:wp14="http://schemas.microsoft.com/office/word/2010/wordprocessingDrawing" xmlns:w14="http://schemas.microsoft.com/office/word/2010/wordml" xmlns:w15="http://schemas.microsoft.com/office/word/2012/wordml" mc:Ignorable="w14 wp14 w15">
   <w:tbl>
     <w:tblPr>
       <w:tblW w:w="9345" w:type="dxa"/>
@@ -1419,7 +3978,7 @@
           </w:r>
           <w:r>
             <w:rPr/>
-            <w:t>9</w:t>
+            <w:t>18</w:t>
           </w:r>
           <w:r>
             <w:rPr/>
@@ -1469,7 +4028,7 @@
 </file>
 
 <file path=word/footer3.xml><?xml version="1.0" encoding="utf-8"?>
-<w:ftr xmlns:o="urn:schemas-microsoft-com:office:office" xmlns:r="http://schemas.openxmlformats.org/officeDocument/2006/relationships" xmlns:v="urn:schemas-microsoft-com:vml" xmlns:w="http://schemas.openxmlformats.org/wordprocessingml/2006/main" xmlns:w10="urn:schemas-microsoft-com:office:word" xmlns:wp="http://schemas.openxmlformats.org/drawingml/2006/wordprocessingDrawing" xmlns:pic="http://schemas.openxmlformats.org/drawingml/2006/picture" xmlns:wps="http://schemas.microsoft.com/office/word/2010/wordprocessingShape" xmlns:wpg="http://schemas.microsoft.com/office/word/2010/wordprocessingGroup" xmlns:mc="http://schemas.openxmlformats.org/markup-compatibility/2006" xmlns:wp14="http://schemas.microsoft.com/office/word/2010/wordprocessingDrawing" xmlns:w14="http://schemas.microsoft.com/office/word/2010/wordml" xmlns:w15="http://schemas.microsoft.com/office/word/2012/wordml" mc:Ignorable="w14 wp14 w15">
+<w:ftr xmlns:o="urn:schemas-microsoft-com:office:office" xmlns:r="http://schemas.openxmlformats.org/officeDocument/2006/relationships" xmlns:v="urn:schemas-microsoft-com:vml" xmlns:w="http://schemas.openxmlformats.org/wordprocessingml/2006/main" xmlns:w10="urn:schemas-microsoft-com:office:word" xmlns:wp="http://schemas.openxmlformats.org/drawingml/2006/wordprocessingDrawing" xmlns:wps="http://schemas.microsoft.com/office/word/2010/wordprocessingShape" xmlns:wpg="http://schemas.microsoft.com/office/word/2010/wordprocessingGroup" xmlns:mc="http://schemas.openxmlformats.org/markup-compatibility/2006" xmlns:wp14="http://schemas.microsoft.com/office/word/2010/wordprocessingDrawing" xmlns:w14="http://schemas.microsoft.com/office/word/2010/wordml" xmlns:w15="http://schemas.microsoft.com/office/word/2012/wordml" mc:Ignorable="w14 wp14 w15">
   <w:tbl>
     <w:tblPr>
       <w:tblW w:w="9345" w:type="dxa"/>
@@ -1575,7 +4134,7 @@
 </file>
 
 <file path=word/header1.xml><?xml version="1.0" encoding="utf-8"?>
-<w:hdr xmlns:o="urn:schemas-microsoft-com:office:office" xmlns:r="http://schemas.openxmlformats.org/officeDocument/2006/relationships" xmlns:v="urn:schemas-microsoft-com:vml" xmlns:w="http://schemas.openxmlformats.org/wordprocessingml/2006/main" xmlns:w10="urn:schemas-microsoft-com:office:word" xmlns:wp="http://schemas.openxmlformats.org/drawingml/2006/wordprocessingDrawing" xmlns:pic="http://schemas.openxmlformats.org/drawingml/2006/picture" xmlns:wps="http://schemas.microsoft.com/office/word/2010/wordprocessingShape" xmlns:wpg="http://schemas.microsoft.com/office/word/2010/wordprocessingGroup" xmlns:mc="http://schemas.openxmlformats.org/markup-compatibility/2006" xmlns:wp14="http://schemas.microsoft.com/office/word/2010/wordprocessingDrawing" xmlns:w14="http://schemas.microsoft.com/office/word/2010/wordml" xmlns:w15="http://schemas.microsoft.com/office/word/2012/wordml" mc:Ignorable="w14 wp14 w15">
+<w:hdr xmlns:o="urn:schemas-microsoft-com:office:office" xmlns:r="http://schemas.openxmlformats.org/officeDocument/2006/relationships" xmlns:v="urn:schemas-microsoft-com:vml" xmlns:w="http://schemas.openxmlformats.org/wordprocessingml/2006/main" xmlns:w10="urn:schemas-microsoft-com:office:word" xmlns:wp="http://schemas.openxmlformats.org/drawingml/2006/wordprocessingDrawing" xmlns:wps="http://schemas.microsoft.com/office/word/2010/wordprocessingShape" xmlns:wpg="http://schemas.microsoft.com/office/word/2010/wordprocessingGroup" xmlns:mc="http://schemas.openxmlformats.org/markup-compatibility/2006" xmlns:wp14="http://schemas.microsoft.com/office/word/2010/wordprocessingDrawing" xmlns:w14="http://schemas.microsoft.com/office/word/2010/wordml" xmlns:w15="http://schemas.microsoft.com/office/word/2012/wordml" mc:Ignorable="w14 wp14 w15">
   <w:p>
     <w:pPr>
       <w:pStyle w:val="Header"/>
@@ -1589,7 +4148,7 @@
 </file>
 
 <file path=word/header2.xml><?xml version="1.0" encoding="utf-8"?>
-<w:hdr xmlns:o="urn:schemas-microsoft-com:office:office" xmlns:r="http://schemas.openxmlformats.org/officeDocument/2006/relationships" xmlns:v="urn:schemas-microsoft-com:vml" xmlns:w="http://schemas.openxmlformats.org/wordprocessingml/2006/main" xmlns:w10="urn:schemas-microsoft-com:office:word" xmlns:wp="http://schemas.openxmlformats.org/drawingml/2006/wordprocessingDrawing" xmlns:pic="http://schemas.openxmlformats.org/drawingml/2006/picture" xmlns:wps="http://schemas.microsoft.com/office/word/2010/wordprocessingShape" xmlns:wpg="http://schemas.microsoft.com/office/word/2010/wordprocessingGroup" xmlns:mc="http://schemas.openxmlformats.org/markup-compatibility/2006" xmlns:wp14="http://schemas.microsoft.com/office/word/2010/wordprocessingDrawing" xmlns:w14="http://schemas.microsoft.com/office/word/2010/wordml" xmlns:w15="http://schemas.microsoft.com/office/word/2012/wordml" mc:Ignorable="w14 wp14 w15">
+<w:hdr xmlns:o="urn:schemas-microsoft-com:office:office" xmlns:r="http://schemas.openxmlformats.org/officeDocument/2006/relationships" xmlns:v="urn:schemas-microsoft-com:vml" xmlns:w="http://schemas.openxmlformats.org/wordprocessingml/2006/main" xmlns:w10="urn:schemas-microsoft-com:office:word" xmlns:wp="http://schemas.openxmlformats.org/drawingml/2006/wordprocessingDrawing" xmlns:wps="http://schemas.microsoft.com/office/word/2010/wordprocessingShape" xmlns:wpg="http://schemas.microsoft.com/office/word/2010/wordprocessingGroup" xmlns:mc="http://schemas.openxmlformats.org/markup-compatibility/2006" xmlns:wp14="http://schemas.microsoft.com/office/word/2010/wordprocessingDrawing" xmlns:w14="http://schemas.microsoft.com/office/word/2010/wordml" xmlns:w15="http://schemas.microsoft.com/office/word/2012/wordml" mc:Ignorable="w14 wp14 w15">
   <w:tbl>
     <w:tblPr>
       <w:tblW w:w="9345" w:type="dxa"/>
@@ -1677,7 +4236,7 @@
 </file>
 
 <file path=word/header3.xml><?xml version="1.0" encoding="utf-8"?>
-<w:hdr xmlns:o="urn:schemas-microsoft-com:office:office" xmlns:r="http://schemas.openxmlformats.org/officeDocument/2006/relationships" xmlns:v="urn:schemas-microsoft-com:vml" xmlns:w="http://schemas.openxmlformats.org/wordprocessingml/2006/main" xmlns:w10="urn:schemas-microsoft-com:office:word" xmlns:wp="http://schemas.openxmlformats.org/drawingml/2006/wordprocessingDrawing" xmlns:pic="http://schemas.openxmlformats.org/drawingml/2006/picture" xmlns:wps="http://schemas.microsoft.com/office/word/2010/wordprocessingShape" xmlns:wpg="http://schemas.microsoft.com/office/word/2010/wordprocessingGroup" xmlns:mc="http://schemas.openxmlformats.org/markup-compatibility/2006" xmlns:wp14="http://schemas.microsoft.com/office/word/2010/wordprocessingDrawing" xmlns:w14="http://schemas.microsoft.com/office/word/2010/wordml" xmlns:w15="http://schemas.microsoft.com/office/word/2012/wordml" mc:Ignorable="w14 wp14 w15">
+<w:hdr xmlns:o="urn:schemas-microsoft-com:office:office" xmlns:r="http://schemas.openxmlformats.org/officeDocument/2006/relationships" xmlns:v="urn:schemas-microsoft-com:vml" xmlns:w="http://schemas.openxmlformats.org/wordprocessingml/2006/main" xmlns:w10="urn:schemas-microsoft-com:office:word" xmlns:wp="http://schemas.openxmlformats.org/drawingml/2006/wordprocessingDrawing" xmlns:wps="http://schemas.microsoft.com/office/word/2010/wordprocessingShape" xmlns:wpg="http://schemas.microsoft.com/office/word/2010/wordprocessingGroup" xmlns:mc="http://schemas.openxmlformats.org/markup-compatibility/2006" xmlns:wp14="http://schemas.microsoft.com/office/word/2010/wordprocessingDrawing" xmlns:w14="http://schemas.microsoft.com/office/word/2010/wordml" xmlns:w15="http://schemas.microsoft.com/office/word/2012/wordml" mc:Ignorable="w14 wp14 w15">
   <w:tbl>
     <w:tblPr>
       <w:tblW w:w="9345" w:type="dxa"/>
@@ -1907,11 +4466,12 @@
         <w:ind w:left="720" w:hanging="360"/>
       </w:pPr>
       <w:rPr>
-        <w:rFonts w:ascii="Times New Roman" w:hAnsi="Times New Roman"/>
+        <w:vertAlign w:val="baseline"/>
         <w:position w:val="0"/>
         <w:sz w:val="28"/>
+        <w:sz w:val="28"/>
         <w:szCs w:val="28"/>
-        <w:vertAlign w:val="baseline"/>
+        <w:rFonts w:ascii="Times New Roman" w:hAnsi="Times New Roman"/>
       </w:rPr>
     </w:lvl>
     <w:lvl w:ilvl="1">
@@ -1926,11 +4486,12 @@
         <w:ind w:left="1080" w:hanging="360"/>
       </w:pPr>
       <w:rPr>
-        <w:rFonts w:ascii="Times New Roman" w:hAnsi="Times New Roman"/>
+        <w:vertAlign w:val="baseline"/>
         <w:position w:val="0"/>
         <w:sz w:val="28"/>
+        <w:sz w:val="28"/>
         <w:szCs w:val="28"/>
-        <w:vertAlign w:val="baseline"/>
+        <w:rFonts w:ascii="Times New Roman" w:hAnsi="Times New Roman"/>
       </w:rPr>
     </w:lvl>
     <w:lvl w:ilvl="2">
@@ -1945,11 +4506,12 @@
         <w:ind w:left="1440" w:hanging="360"/>
       </w:pPr>
       <w:rPr>
-        <w:rFonts w:ascii="Times New Roman" w:hAnsi="Times New Roman"/>
+        <w:vertAlign w:val="baseline"/>
         <w:position w:val="0"/>
         <w:sz w:val="28"/>
+        <w:sz w:val="28"/>
         <w:szCs w:val="28"/>
-        <w:vertAlign w:val="baseline"/>
+        <w:rFonts w:ascii="Times New Roman" w:hAnsi="Times New Roman"/>
       </w:rPr>
     </w:lvl>
     <w:lvl w:ilvl="3">
@@ -1964,11 +4526,12 @@
         <w:ind w:left="1800" w:hanging="360"/>
       </w:pPr>
       <w:rPr>
-        <w:rFonts w:ascii="Times New Roman" w:hAnsi="Times New Roman"/>
+        <w:vertAlign w:val="baseline"/>
         <w:position w:val="0"/>
         <w:sz w:val="28"/>
+        <w:sz w:val="28"/>
         <w:szCs w:val="28"/>
-        <w:vertAlign w:val="baseline"/>
+        <w:rFonts w:ascii="Times New Roman" w:hAnsi="Times New Roman"/>
       </w:rPr>
     </w:lvl>
     <w:lvl w:ilvl="4">
@@ -1983,11 +4546,12 @@
         <w:ind w:left="2160" w:hanging="360"/>
       </w:pPr>
       <w:rPr>
-        <w:rFonts w:ascii="Times New Roman" w:hAnsi="Times New Roman"/>
+        <w:vertAlign w:val="baseline"/>
         <w:position w:val="0"/>
         <w:sz w:val="28"/>
+        <w:sz w:val="28"/>
         <w:szCs w:val="28"/>
-        <w:vertAlign w:val="baseline"/>
+        <w:rFonts w:ascii="Times New Roman" w:hAnsi="Times New Roman"/>
       </w:rPr>
     </w:lvl>
     <w:lvl w:ilvl="5">
@@ -2002,11 +4566,12 @@
         <w:ind w:left="2520" w:hanging="360"/>
       </w:pPr>
       <w:rPr>
-        <w:rFonts w:ascii="Times New Roman" w:hAnsi="Times New Roman"/>
+        <w:vertAlign w:val="baseline"/>
         <w:position w:val="0"/>
         <w:sz w:val="28"/>
+        <w:sz w:val="28"/>
         <w:szCs w:val="28"/>
-        <w:vertAlign w:val="baseline"/>
+        <w:rFonts w:ascii="Times New Roman" w:hAnsi="Times New Roman"/>
       </w:rPr>
     </w:lvl>
     <w:lvl w:ilvl="6">
@@ -2021,11 +4586,12 @@
         <w:ind w:left="2880" w:hanging="360"/>
       </w:pPr>
       <w:rPr>
-        <w:rFonts w:ascii="Times New Roman" w:hAnsi="Times New Roman"/>
+        <w:vertAlign w:val="baseline"/>
         <w:position w:val="0"/>
         <w:sz w:val="28"/>
+        <w:sz w:val="28"/>
         <w:szCs w:val="28"/>
-        <w:vertAlign w:val="baseline"/>
+        <w:rFonts w:ascii="Times New Roman" w:hAnsi="Times New Roman"/>
       </w:rPr>
     </w:lvl>
     <w:lvl w:ilvl="7">
@@ -2040,11 +4606,12 @@
         <w:ind w:left="3240" w:hanging="360"/>
       </w:pPr>
       <w:rPr>
-        <w:rFonts w:ascii="Times New Roman" w:hAnsi="Times New Roman"/>
+        <w:vertAlign w:val="baseline"/>
         <w:position w:val="0"/>
         <w:sz w:val="28"/>
+        <w:sz w:val="28"/>
         <w:szCs w:val="28"/>
-        <w:vertAlign w:val="baseline"/>
+        <w:rFonts w:ascii="Times New Roman" w:hAnsi="Times New Roman"/>
       </w:rPr>
     </w:lvl>
     <w:lvl w:ilvl="8">
@@ -2059,11 +4626,12 @@
         <w:ind w:left="3600" w:hanging="360"/>
       </w:pPr>
       <w:rPr>
-        <w:rFonts w:ascii="Times New Roman" w:hAnsi="Times New Roman"/>
+        <w:vertAlign w:val="baseline"/>
         <w:position w:val="0"/>
         <w:sz w:val="28"/>
+        <w:sz w:val="28"/>
         <w:szCs w:val="28"/>
-        <w:vertAlign w:val="baseline"/>
+        <w:rFonts w:ascii="Times New Roman" w:hAnsi="Times New Roman"/>
       </w:rPr>
     </w:lvl>
   </w:abstractNum>
@@ -2080,11 +4648,12 @@
         <w:ind w:left="720" w:hanging="360"/>
       </w:pPr>
       <w:rPr>
-        <w:rFonts w:ascii="Times New Roman" w:hAnsi="Times New Roman"/>
+        <w:vertAlign w:val="baseline"/>
         <w:position w:val="0"/>
         <w:sz w:val="28"/>
+        <w:sz w:val="28"/>
         <w:szCs w:val="28"/>
-        <w:vertAlign w:val="baseline"/>
+        <w:rFonts w:ascii="Times New Roman" w:hAnsi="Times New Roman"/>
       </w:rPr>
     </w:lvl>
     <w:lvl w:ilvl="1">
@@ -2099,11 +4668,12 @@
         <w:ind w:left="1080" w:hanging="360"/>
       </w:pPr>
       <w:rPr>
-        <w:rFonts w:ascii="Times New Roman" w:hAnsi="Times New Roman"/>
+        <w:vertAlign w:val="baseline"/>
         <w:position w:val="0"/>
         <w:sz w:val="28"/>
+        <w:sz w:val="28"/>
         <w:szCs w:val="28"/>
-        <w:vertAlign w:val="baseline"/>
+        <w:rFonts w:ascii="Times New Roman" w:hAnsi="Times New Roman"/>
       </w:rPr>
     </w:lvl>
     <w:lvl w:ilvl="2">
@@ -2118,11 +4688,12 @@
         <w:ind w:left="1440" w:hanging="360"/>
       </w:pPr>
       <w:rPr>
-        <w:rFonts w:ascii="Times New Roman" w:hAnsi="Times New Roman"/>
+        <w:vertAlign w:val="baseline"/>
         <w:position w:val="0"/>
         <w:sz w:val="28"/>
+        <w:sz w:val="28"/>
         <w:szCs w:val="28"/>
-        <w:vertAlign w:val="baseline"/>
+        <w:rFonts w:ascii="Times New Roman" w:hAnsi="Times New Roman"/>
       </w:rPr>
     </w:lvl>
     <w:lvl w:ilvl="3">
@@ -2137,11 +4708,12 @@
         <w:ind w:left="1800" w:hanging="360"/>
       </w:pPr>
       <w:rPr>
-        <w:rFonts w:ascii="Times New Roman" w:hAnsi="Times New Roman"/>
+        <w:vertAlign w:val="baseline"/>
         <w:position w:val="0"/>
         <w:sz w:val="28"/>
+        <w:sz w:val="28"/>
         <w:szCs w:val="28"/>
-        <w:vertAlign w:val="baseline"/>
+        <w:rFonts w:ascii="Times New Roman" w:hAnsi="Times New Roman"/>
       </w:rPr>
     </w:lvl>
     <w:lvl w:ilvl="4">
@@ -2156,11 +4728,12 @@
         <w:ind w:left="2160" w:hanging="360"/>
       </w:pPr>
       <w:rPr>
-        <w:rFonts w:ascii="Times New Roman" w:hAnsi="Times New Roman"/>
+        <w:vertAlign w:val="baseline"/>
         <w:position w:val="0"/>
         <w:sz w:val="28"/>
+        <w:sz w:val="28"/>
         <w:szCs w:val="28"/>
-        <w:vertAlign w:val="baseline"/>
+        <w:rFonts w:ascii="Times New Roman" w:hAnsi="Times New Roman"/>
       </w:rPr>
     </w:lvl>
     <w:lvl w:ilvl="5">
@@ -2175,11 +4748,12 @@
         <w:ind w:left="2520" w:hanging="360"/>
       </w:pPr>
       <w:rPr>
-        <w:rFonts w:ascii="Times New Roman" w:hAnsi="Times New Roman"/>
+        <w:vertAlign w:val="baseline"/>
         <w:position w:val="0"/>
         <w:sz w:val="28"/>
+        <w:sz w:val="28"/>
         <w:szCs w:val="28"/>
-        <w:vertAlign w:val="baseline"/>
+        <w:rFonts w:ascii="Times New Roman" w:hAnsi="Times New Roman"/>
       </w:rPr>
     </w:lvl>
     <w:lvl w:ilvl="6">
@@ -2194,11 +4768,12 @@
         <w:ind w:left="2880" w:hanging="360"/>
       </w:pPr>
       <w:rPr>
-        <w:rFonts w:ascii="Times New Roman" w:hAnsi="Times New Roman"/>
+        <w:vertAlign w:val="baseline"/>
         <w:position w:val="0"/>
         <w:sz w:val="28"/>
+        <w:sz w:val="28"/>
         <w:szCs w:val="28"/>
-        <w:vertAlign w:val="baseline"/>
+        <w:rFonts w:ascii="Times New Roman" w:hAnsi="Times New Roman"/>
       </w:rPr>
     </w:lvl>
     <w:lvl w:ilvl="7">
@@ -2213,11 +4788,12 @@
         <w:ind w:left="3240" w:hanging="360"/>
       </w:pPr>
       <w:rPr>
-        <w:rFonts w:ascii="Times New Roman" w:hAnsi="Times New Roman"/>
+        <w:vertAlign w:val="baseline"/>
         <w:position w:val="0"/>
         <w:sz w:val="28"/>
+        <w:sz w:val="28"/>
         <w:szCs w:val="28"/>
-        <w:vertAlign w:val="baseline"/>
+        <w:rFonts w:ascii="Times New Roman" w:hAnsi="Times New Roman"/>
       </w:rPr>
     </w:lvl>
     <w:lvl w:ilvl="8">
@@ -2232,11 +4808,12 @@
         <w:ind w:left="3600" w:hanging="360"/>
       </w:pPr>
       <w:rPr>
-        <w:rFonts w:ascii="Times New Roman" w:hAnsi="Times New Roman"/>
+        <w:vertAlign w:val="baseline"/>
         <w:position w:val="0"/>
         <w:sz w:val="28"/>
+        <w:sz w:val="28"/>
         <w:szCs w:val="28"/>
-        <w:vertAlign w:val="baseline"/>
+        <w:rFonts w:ascii="Times New Roman" w:hAnsi="Times New Roman"/>
       </w:rPr>
     </w:lvl>
   </w:abstractNum>
@@ -2785,7 +5362,7 @@
     </w:rPr>
   </w:style>
   <w:style w:type="paragraph" w:styleId="Heading1">
-    <w:name w:val="heading 1"/>
+    <w:name w:val="Heading 1"/>
     <w:basedOn w:val="Normal"/>
     <w:next w:val="Normal"/>
     <w:link w:val="Heading1Char"/>
@@ -2806,7 +5383,7 @@
     </w:rPr>
   </w:style>
   <w:style w:type="paragraph" w:styleId="Heading2">
-    <w:name w:val="heading 2"/>
+    <w:name w:val="Heading 2"/>
     <w:basedOn w:val="Style14"/>
     <w:next w:val="BodyText"/>
     <w:qFormat/>
@@ -2828,7 +5405,7 @@
     </w:rPr>
   </w:style>
   <w:style w:type="paragraph" w:styleId="Heading3">
-    <w:name w:val="heading 3"/>
+    <w:name w:val="Heading 3"/>
     <w:basedOn w:val="Style14"/>
     <w:next w:val="BodyText"/>
     <w:qFormat/>
@@ -2910,6 +5487,7 @@
       <w:rFonts w:ascii="Times New Roman" w:hAnsi="Times New Roman"/>
       <w:position w:val="0"/>
       <w:sz w:val="28"/>
+      <w:sz w:val="28"/>
       <w:szCs w:val="28"/>
       <w:vertAlign w:val="baseline"/>
     </w:rPr>
@@ -2928,11 +5506,6 @@
       <w:color w:val="800000"/>
       <w:u w:val="single"/>
     </w:rPr>
-  </w:style>
-  <w:style w:type="character" w:styleId="user">
-    <w:name w:val="Ссылка указателя (user)"/>
-    <w:qFormat/>
-    <w:rPr/>
   </w:style>
   <w:style w:type="paragraph" w:styleId="Style14">
     <w:name w:val="Заголовок"/>
@@ -2966,7 +5539,7 @@
     </w:rPr>
   </w:style>
   <w:style w:type="paragraph" w:styleId="Caption">
-    <w:name w:val="caption"/>
+    <w:name w:val="Caption"/>
     <w:basedOn w:val="Normal"/>
     <w:qFormat/>
     <w:pPr>
@@ -2974,7 +5547,7 @@
       <w:spacing w:before="120" w:after="120"/>
     </w:pPr>
     <w:rPr>
-      <w:rFonts w:cs="Arial"/>
+      <w:rFonts w:cs="Lucida Sans"/>
       <w:i/>
       <w:iCs/>
       <w:sz w:val="24"/>
@@ -2992,34 +5565,24 @@
       <w:rFonts w:cs="Arial"/>
     </w:rPr>
   </w:style>
-  <w:style w:type="paragraph" w:styleId="user1">
-    <w:name w:val="Заголовок (user)"/>
-    <w:basedOn w:val="Normal"/>
-    <w:next w:val="BodyText"/>
-    <w:qFormat/>
-    <w:pPr>
-      <w:keepNext w:val="true"/>
-      <w:spacing w:before="240" w:after="120"/>
-    </w:pPr>
-    <w:rPr>
-      <w:rFonts w:ascii="Liberation Sans" w:hAnsi="Liberation Sans" w:eastAsia="Microsoft YaHei" w:cs="Arial"/>
-      <w:sz w:val="28"/>
-      <w:szCs w:val="28"/>
-    </w:rPr>
-  </w:style>
-  <w:style w:type="paragraph" w:styleId="user2">
-    <w:name w:val="Указатель (user)"/>
+  <w:style w:type="paragraph" w:styleId="Caption1">
+    <w:name w:val="caption1"/>
     <w:basedOn w:val="Normal"/>
     <w:qFormat/>
     <w:pPr>
       <w:suppressLineNumbers/>
+      <w:spacing w:before="120" w:after="120"/>
     </w:pPr>
     <w:rPr>
       <w:rFonts w:cs="Arial"/>
+      <w:i/>
+      <w:iCs/>
+      <w:sz w:val="24"/>
+      <w:szCs w:val="24"/>
     </w:rPr>
   </w:style>
   <w:style w:type="paragraph" w:styleId="TOC1">
-    <w:name w:val="toc 1"/>
+    <w:name w:val="TOC 1"/>
     <w:basedOn w:val="Normal"/>
     <w:next w:val="Normal"/>
     <w:autoRedefine/>
@@ -3037,13 +5600,6 @@
     <w:pPr/>
     <w:rPr/>
   </w:style>
-  <w:style w:type="paragraph" w:styleId="user3">
-    <w:name w:val="Колонтитулы (user)"/>
-    <w:basedOn w:val="Normal"/>
-    <w:qFormat/>
-    <w:pPr/>
-    <w:rPr/>
-  </w:style>
   <w:style w:type="paragraph" w:styleId="Style17">
     <w:name w:val="Колонтитулы"/>
     <w:basedOn w:val="Normal"/>
@@ -3052,7 +5608,7 @@
     <w:rPr/>
   </w:style>
   <w:style w:type="paragraph" w:styleId="Header">
-    <w:name w:val="header"/>
+    <w:name w:val="Header"/>
     <w:basedOn w:val="Normal"/>
     <w:link w:val="HeaderChar"/>
     <w:uiPriority w:val="99"/>
@@ -3068,7 +5624,7 @@
     <w:rPr/>
   </w:style>
   <w:style w:type="paragraph" w:styleId="Footer">
-    <w:name w:val="footer"/>
+    <w:name w:val="Footer"/>
     <w:basedOn w:val="Normal"/>
     <w:link w:val="FooterChar"/>
     <w:uiPriority w:val="99"/>
@@ -3095,8 +5651,15 @@
     </w:pPr>
     <w:rPr/>
   </w:style>
+  <w:style w:type="paragraph" w:styleId="Indexheading1">
+    <w:name w:val="index heading1"/>
+    <w:basedOn w:val="Style14"/>
+    <w:qFormat/>
+    <w:pPr/>
+    <w:rPr/>
+  </w:style>
   <w:style w:type="paragraph" w:styleId="IndexHeading">
-    <w:name w:val="index heading"/>
+    <w:name w:val="Index Heading"/>
     <w:basedOn w:val="Style14"/>
     <w:pPr/>
     <w:rPr/>
@@ -3135,7 +5698,7 @@
   </w:style>
   <w:style w:type="paragraph" w:styleId="Style18">
     <w:name w:val="Рисунок"/>
-    <w:basedOn w:val="Caption"/>
+    <w:basedOn w:val="Caption1"/>
     <w:qFormat/>
     <w:pPr/>
     <w:rPr>
@@ -3177,20 +5740,25 @@
   </w:style>
   <w:style w:type="paragraph" w:styleId="Style22">
     <w:name w:val="Фигура"/>
-    <w:basedOn w:val="Caption"/>
+    <w:basedOn w:val="Caption1"/>
     <w:qFormat/>
     <w:pPr/>
     <w:rPr/>
   </w:style>
   <w:style w:type="paragraph" w:styleId="Style23">
     <w:name w:val="График"/>
-    <w:basedOn w:val="Caption"/>
+    <w:basedOn w:val="Caption1"/>
     <w:qFormat/>
     <w:pPr/>
-    <w:rPr/>
+    <w:rPr>
+      <w:i w:val="false"/>
+      <w:iCs w:val="false"/>
+      <w:sz w:val="28"/>
+      <w:szCs w:val="28"/>
+    </w:rPr>
   </w:style>
   <w:style w:type="paragraph" w:styleId="TOC2">
-    <w:name w:val="toc 2"/>
+    <w:name w:val="TOC 2"/>
     <w:basedOn w:val="Style15"/>
     <w:pPr>
       <w:tabs>
@@ -3202,7 +5770,7 @@
     <w:rPr/>
   </w:style>
   <w:style w:type="paragraph" w:styleId="TOC3">
-    <w:name w:val="toc 3"/>
+    <w:name w:val="TOC 3"/>
     <w:basedOn w:val="Style15"/>
     <w:pPr>
       <w:tabs>
@@ -3213,15 +5781,8 @@
     </w:pPr>
     <w:rPr/>
   </w:style>
-  <w:style w:type="paragraph" w:styleId="user4">
-    <w:name w:val="Содержимое врезки (user)"/>
-    <w:basedOn w:val="Normal"/>
-    <w:qFormat/>
-    <w:pPr/>
-    <w:rPr/>
-  </w:style>
-  <w:style w:type="numbering" w:styleId="user5" w:default="1">
-    <w:name w:val="Без списка (user)"/>
+  <w:style w:type="numbering" w:styleId="Style24" w:default="1">
+    <w:name w:val="Без списка"/>
     <w:uiPriority w:val="99"/>
     <w:semiHidden/>
     <w:unhideWhenUsed/>

</xml_diff>